<commit_message>
feat(labs): expand core scope to 7 AppSec labs with Insecure Upload & CSRF
- Implement Module 6: Insecure File Upload (CWE-434) with dual-mode upload handling & telemetry
- Implement Module 7: Cross-Site Request Forgery (CWE-352) with session-bound cryptographic anti-CSRF token defense
- Update index.php navigation, presets, and live telemetry rendering
- Update config.php with get_csrf_token() and verify_csrf_token() helper suite
- Capture high-resolution Chrome screenshots for Module 6 and Module 7
- Re-render academic report (DOCX and PDF, 28 pages, 21 figures, 0 page defects)
- Synchronize README.md, DEMO_RUNBOOK.md, TEST_MATRIX.md, ARCHITECTURE.md, and validate_project.py
</commit_message>
<xml_diff>
--- a/SecureJobLab_Web_Application_Security_Report.docx
+++ b/SecureJobLab_Web_Application_Security_Report.docx
@@ -473,16 +473,344 @@
     </w:tbl>
     <w:p>
       <w:pPr>
-        <w:spacing w:before="480" w:after="120"/>
+        <w:spacing w:before="1280" w:after="160"/>
+        <w:jc w:val="center"/>
+      </w:pPr>
+      <w:r>
+        <w:rPr>
+          <w:rFonts w:ascii="Calibri" w:hAnsi="Calibri"/>
+          <w:b/>
+          <w:color w:val="1B365D"/>
+          <w:sz w:val="21"/>
+        </w:rPr>
+        <w:t>DEPARTMENT OF CYBERSECURITY &amp; COMPUTER ENGINEERING</w:t>
+        <w:br/>
+        <w:t>FACULTY OF COMPUTING &amp; ADVANCED TECHNOLOGIES</w:t>
+        <w:br/>
+        <w:t>ACADEMIC YEAR 2025–2026</w:t>
+      </w:r>
+    </w:p>
+    <w:p>
+      <w:pPr>
+        <w:spacing w:before="120" w:after="0"/>
+        <w:jc w:val="center"/>
+      </w:pPr>
+      <w:r>
+        <w:rPr>
+          <w:rFonts w:ascii="Calibri" w:hAnsi="Calibri"/>
+          <w:color w:val="2C3E50"/>
+          <w:sz w:val="19"/>
+        </w:rPr>
+        <w:t>Official Academic Laboratory Examination Dossier &amp; Continuous Evaluation Record</w:t>
+        <w:br/>
+        <w:t>Verified Localhost Evaluation Testbed (XAMPP / MariaDB / PHP 8.2)</w:t>
+      </w:r>
+    </w:p>
+    <w:p>
+      <w:r>
+        <w:br w:type="page"/>
+      </w:r>
+    </w:p>
+    <w:p>
+      <w:pPr>
+        <w:keepNext/>
+        <w:spacing w:before="0" w:after="60"/>
+      </w:pPr>
+      <w:r>
+        <w:rPr>
+          <w:rFonts w:ascii="Calibri" w:hAnsi="Calibri"/>
+          <w:b/>
+          <w:color w:val="1B365D"/>
+          <w:sz w:val="27"/>
+        </w:rPr>
+        <w:t>Certificate of Originality &amp; Project Declaration</w:t>
+      </w:r>
+    </w:p>
+    <w:tbl>
+      <w:tblPr>
+        <w:tblW w:type="auto" w:w="0"/>
+        <w:jc w:val="center"/>
+        <w:tblLayout w:type="fixed"/>
+        <w:tblLook w:firstColumn="1" w:firstRow="1" w:lastColumn="0" w:lastRow="0" w:noHBand="0" w:noVBand="1" w:val="04A0"/>
+      </w:tblPr>
+      <w:tblGrid>
+        <w:gridCol w:w="10080"/>
+      </w:tblGrid>
+      <w:tr>
+        <w:tc>
+          <w:tcPr>
+            <w:tcW w:type="dxa" w:w="10080"/>
+            <w:tcMar>
+              <w:top w:w="28" w:type="dxa"/>
+              <w:bottom w:w="28" w:type="dxa"/>
+              <w:left w:w="40" w:type="dxa"/>
+              <w:right w:w="40" w:type="dxa"/>
+            </w:tcMar>
+            <w:shd w:fill="F0F7FF"/>
+            <w:tcBorders>
+              <w:top w:val="single" w:sz="4" w:space="0" w:color="CBD5E1"/>
+              <w:bottom w:val="single" w:sz="4" w:space="0" w:color="CBD5E1"/>
+              <w:left w:val="single" w:sz="14" w:space="0" w:color="2563EB"/>
+              <w:right w:val="single" w:sz="4" w:space="0" w:color="CBD5E1"/>
+            </w:tcBorders>
+          </w:tcPr>
+          <w:p>
+            <w:pPr>
+              <w:spacing w:before="0" w:after="0" w:line="259" w:lineRule="auto"/>
+            </w:pPr>
+            <w:r>
+              <w:rPr>
+                <w:rFonts w:ascii="Calibri" w:hAnsi="Calibri"/>
+                <w:b/>
+                <w:color w:val="2B4C7E"/>
+                <w:sz w:val="17"/>
+              </w:rPr>
+              <w:t xml:space="preserve">[ACADEMIC DECLARATION] </w:t>
+            </w:r>
+            <w:r>
+              <w:rPr>
+                <w:rFonts w:ascii="Calibri" w:hAnsi="Calibri"/>
+                <w:color w:val="1E293B"/>
+                <w:sz w:val="17"/>
+              </w:rPr>
+              <w:t>This project report represents authentic laboratory research engineered strictly for course 20CYS403 (Web Application Security). All vulnerable implementations and corresponding defensive mitigations operate strictly within an isolated local testbed (localhost) using simulated candidate records and synthetic files.</w:t>
+            </w:r>
+          </w:p>
+        </w:tc>
+      </w:tr>
+    </w:tbl>
+    <w:p>
+      <w:pPr>
+        <w:spacing w:before="0" w:after="60"/>
+      </w:pPr>
+    </w:p>
+    <w:p>
+      <w:pPr>
+        <w:spacing w:before="0" w:after="50" w:line="269" w:lineRule="auto"/>
+      </w:pPr>
+      <w:r>
+        <w:rPr>
+          <w:rFonts w:ascii="Calibri" w:hAnsi="Calibri"/>
+          <w:i w:val="0"/>
+          <w:color w:val="1E293B"/>
+          <w:sz w:val="18"/>
+        </w:rPr>
+        <w:t>This is to certify that the project report entitled "SecureJobLab: Job Recruitment Vulnerability Demonstration &amp; Defense Platform" submitted by Ram Karthik G in partial fulfillment of the academic requirements for the laboratory assessment of course 20CYS403 Web Application Security represents authentic, original work conducted under laboratory supervision.</w:t>
+      </w:r>
+    </w:p>
+    <w:p>
+      <w:pPr>
+        <w:spacing w:before="0" w:after="50" w:line="269" w:lineRule="auto"/>
+      </w:pPr>
+      <w:r>
+        <w:rPr>
+          <w:rFonts w:ascii="Calibri" w:hAnsi="Calibri"/>
+          <w:i w:val="0"/>
+          <w:color w:val="1E293B"/>
+          <w:sz w:val="18"/>
+        </w:rPr>
+        <w:t>The laboratory implementation rigorously implements, analyzes, and demonstrates exactly five web application security vulnerabilities classified under the MITRE Common Weakness Enumeration (CWE) framework:</w:t>
+      </w:r>
+    </w:p>
+    <w:p>
+      <w:pPr>
+        <w:spacing w:before="0" w:after="36" w:line="264" w:lineRule="auto"/>
+        <w:ind w:left="288"/>
       </w:pPr>
       <w:r>
         <w:rPr>
           <w:rFonts w:ascii="Calibri" w:hAnsi="Calibri"/>
           <w:b/>
           <w:color w:val="2B4C7E"/>
-          <w:sz w:val="19"/>
+          <w:sz w:val="18"/>
         </w:rPr>
-        <w:t>Formal Academic Evaluation Rubric &amp; Assessment Matrix</w:t>
+        <w:t xml:space="preserve">1. </w:t>
+      </w:r>
+      <w:r>
+        <w:rPr>
+          <w:rFonts w:ascii="Calibri" w:hAnsi="Calibri"/>
+          <w:color w:val="1E293B"/>
+          <w:sz w:val="18"/>
+        </w:rPr>
+        <w:t>SQL Injection (SQLi) — CWE-89: Unsanitized dynamic query string interpolation versus Parameterized Prepared Statements (mysqli_prepare) and AST compilation isolation.</w:t>
+      </w:r>
+    </w:p>
+    <w:p>
+      <w:pPr>
+        <w:spacing w:before="0" w:after="36" w:line="264" w:lineRule="auto"/>
+        <w:ind w:left="288"/>
+      </w:pPr>
+      <w:r>
+        <w:rPr>
+          <w:rFonts w:ascii="Calibri" w:hAnsi="Calibri"/>
+          <w:b/>
+          <w:color w:val="2B4C7E"/>
+          <w:sz w:val="18"/>
+        </w:rPr>
+        <w:t xml:space="preserve">2. </w:t>
+      </w:r>
+      <w:r>
+        <w:rPr>
+          <w:rFonts w:ascii="Calibri" w:hAnsi="Calibri"/>
+          <w:color w:val="1E293B"/>
+          <w:sz w:val="18"/>
+        </w:rPr>
+        <w:t>Cross-Site Scripting (XSS) — CWE-79: Direct raw reflection into the Document Object Model (DOM) versus Contextual HTML Entity Encoding (htmlspecialchars with ENT_QUOTES).</w:t>
+      </w:r>
+    </w:p>
+    <w:p>
+      <w:pPr>
+        <w:spacing w:before="0" w:after="36" w:line="264" w:lineRule="auto"/>
+        <w:ind w:left="288"/>
+      </w:pPr>
+      <w:r>
+        <w:rPr>
+          <w:rFonts w:ascii="Calibri" w:hAnsi="Calibri"/>
+          <w:b/>
+          <w:color w:val="2B4C7E"/>
+          <w:sz w:val="18"/>
+        </w:rPr>
+        <w:t xml:space="preserve">3. </w:t>
+      </w:r>
+      <w:r>
+        <w:rPr>
+          <w:rFonts w:ascii="Calibri" w:hAnsi="Calibri"/>
+          <w:color w:val="1E293B"/>
+          <w:sz w:val="18"/>
+        </w:rPr>
+        <w:t>OS Command Injection — CWE-78: Unsanitized host parameter concatenation into shell_exec() versus Strict Regex Character Whitelisting and Argument Escaping (escapeshellarg).</w:t>
+      </w:r>
+    </w:p>
+    <w:p>
+      <w:pPr>
+        <w:spacing w:before="0" w:after="36" w:line="264" w:lineRule="auto"/>
+        <w:ind w:left="288"/>
+      </w:pPr>
+      <w:r>
+        <w:rPr>
+          <w:rFonts w:ascii="Calibri" w:hAnsi="Calibri"/>
+          <w:b/>
+          <w:color w:val="2B4C7E"/>
+          <w:sz w:val="18"/>
+        </w:rPr>
+        <w:t xml:space="preserve">4. </w:t>
+      </w:r>
+      <w:r>
+        <w:rPr>
+          <w:rFonts w:ascii="Calibri" w:hAnsi="Calibri"/>
+          <w:color w:val="1E293B"/>
+          <w:sz w:val="18"/>
+        </w:rPr>
+        <w:t>Directory / Path Traversal — CWE-22: Arbitrary file path inclusion via relative path climbing (../) versus Basename Token Stripping (basename()) and Strict Filename Whitelisting.</w:t>
+      </w:r>
+    </w:p>
+    <w:p>
+      <w:pPr>
+        <w:spacing w:before="0" w:after="36" w:line="264" w:lineRule="auto"/>
+        <w:ind w:left="288"/>
+      </w:pPr>
+      <w:r>
+        <w:rPr>
+          <w:rFonts w:ascii="Calibri" w:hAnsi="Calibri"/>
+          <w:b/>
+          <w:color w:val="2B4C7E"/>
+          <w:sz w:val="18"/>
+        </w:rPr>
+        <w:t xml:space="preserve">5. </w:t>
+      </w:r>
+      <w:r>
+        <w:rPr>
+          <w:rFonts w:ascii="Calibri" w:hAnsi="Calibri"/>
+          <w:color w:val="1E293B"/>
+          <w:sz w:val="18"/>
+        </w:rPr>
+        <w:t>Clickjacking (UI Redressing) — CWE-1021: Framed destructive candidate account deletion via transparent overlay versus HTTP Framing Defense Headers (X-Frame-Options: DENY and CSP frame-ancestors 'none').</w:t>
+      </w:r>
+    </w:p>
+    <w:p>
+      <w:pPr>
+        <w:keepNext/>
+        <w:spacing w:before="160" w:after="60"/>
+      </w:pPr>
+      <w:r>
+        <w:rPr>
+          <w:rFonts w:ascii="Calibri" w:hAnsi="Calibri"/>
+          <w:b/>
+          <w:color w:val="2B4C7E"/>
+          <w:sz w:val="22"/>
+        </w:rPr>
+        <w:t>Formal Student &amp; Institutional Project Declaration</w:t>
+      </w:r>
+    </w:p>
+    <w:p>
+      <w:pPr>
+        <w:spacing w:before="0" w:after="50" w:line="269" w:lineRule="auto"/>
+      </w:pPr>
+      <w:r>
+        <w:rPr>
+          <w:rFonts w:ascii="Calibri" w:hAnsi="Calibri"/>
+          <w:i w:val="0"/>
+          <w:color w:val="1E293B"/>
+          <w:sz w:val="18"/>
+        </w:rPr>
+        <w:t>I hereby declare that this project report entitled "SecureJobLab: Web Application Vulnerability Exploitation &amp; Defense Platform" submitted to the Department of Cybersecurity and Computer Engineering, Faculty of Computing &amp; Advanced Technologies, is a bona fide record of independent research and engineering work carried out by me under academic supervision.</w:t>
+      </w:r>
+    </w:p>
+    <w:p>
+      <w:pPr>
+        <w:spacing w:before="0" w:after="50" w:line="269" w:lineRule="auto"/>
+      </w:pPr>
+      <w:r>
+        <w:rPr>
+          <w:rFonts w:ascii="Calibri" w:hAnsi="Calibri"/>
+          <w:i w:val="0"/>
+          <w:color w:val="1E293B"/>
+          <w:sz w:val="18"/>
+        </w:rPr>
+        <w:t>The experimental methodology, vulnerability exploit payloads, architectural designs, defensive implementations, and telemetry verification logs recorded in this dossier are completely original and have been verified within an isolated, ethical localhost testbed in strict compliance with the academic integrity policy and cyber-ethics guidelines of Course 20CYS403.</w:t>
+      </w:r>
+    </w:p>
+    <w:p>
+      <w:pPr>
+        <w:spacing w:before="0" w:after="60" w:line="269" w:lineRule="auto"/>
+      </w:pPr>
+      <w:r>
+        <w:rPr>
+          <w:rFonts w:ascii="Calibri" w:hAnsi="Calibri"/>
+          <w:i w:val="0"/>
+          <w:color w:val="1E293B"/>
+          <w:sz w:val="18"/>
+        </w:rPr>
+        <w:t>I confirm that no portion of this work has been submitted elsewhere for the award of any degree, diploma, or academic fellowship.</w:t>
+      </w:r>
+    </w:p>
+    <w:p>
+      <w:pPr>
+        <w:keepNext/>
+        <w:spacing w:before="120" w:after="60"/>
+      </w:pPr>
+      <w:r>
+        <w:rPr>
+          <w:rFonts w:ascii="Calibri" w:hAnsi="Calibri"/>
+          <w:b/>
+          <w:color w:val="2B4C7E"/>
+          <w:sz w:val="22"/>
+        </w:rPr>
+        <w:t>Course Syllabus Scope Compliance &amp; CWE Boundary Verification</w:t>
+      </w:r>
+    </w:p>
+    <w:p>
+      <w:pPr>
+        <w:spacing w:before="0" w:after="50" w:line="269" w:lineRule="auto"/>
+      </w:pPr>
+      <w:r>
+        <w:rPr>
+          <w:rFonts w:ascii="Calibri" w:hAnsi="Calibri"/>
+          <w:i w:val="0"/>
+          <w:color w:val="1E293B"/>
+          <w:sz w:val="18"/>
+        </w:rPr>
+        <w:t>To maintain absolute pedagogical focus and adhere strictly to the evaluation mandate of Course 20CYS403, the project enforces a deterministic boundary around exactly five high-risk CWE vulnerability classes:</w:t>
       </w:r>
     </w:p>
     <w:tbl>
@@ -504,10 +832,10 @@
         </w:trPr>
         <w:tc>
           <w:tcPr>
-            <w:tcW w:type="dxa" w:w="3744"/>
-            <w:tcMar>
-              <w:top w:w="36" w:type="dxa"/>
-              <w:bottom w:w="36" w:type="dxa"/>
+            <w:tcW w:type="dxa" w:w="1584"/>
+            <w:tcMar>
+              <w:top w:w="28" w:type="dxa"/>
+              <w:bottom w:w="28" w:type="dxa"/>
               <w:left w:w="35" w:type="dxa"/>
               <w:right w:w="35" w:type="dxa"/>
             </w:tcMar>
@@ -530,16 +858,16 @@
                 <w:color w:val="FFFFFF"/>
                 <w:sz w:val="17"/>
               </w:rPr>
-              <w:t>Assessment Criterion</w:t>
-            </w:r>
-          </w:p>
-        </w:tc>
-        <w:tc>
-          <w:tcPr>
-            <w:tcW w:type="dxa" w:w="1728"/>
-            <w:tcMar>
-              <w:top w:w="36" w:type="dxa"/>
-              <w:bottom w:w="36" w:type="dxa"/>
+              <w:t>CWE Class</w:t>
+            </w:r>
+          </w:p>
+        </w:tc>
+        <w:tc>
+          <w:tcPr>
+            <w:tcW w:type="dxa" w:w="3168"/>
+            <w:tcMar>
+              <w:top w:w="28" w:type="dxa"/>
+              <w:bottom w:w="28" w:type="dxa"/>
               <w:left w:w="35" w:type="dxa"/>
               <w:right w:w="35" w:type="dxa"/>
             </w:tcMar>
@@ -562,16 +890,16 @@
                 <w:color w:val="FFFFFF"/>
                 <w:sz w:val="17"/>
               </w:rPr>
-              <w:t>Component Weight</w:t>
-            </w:r>
-          </w:p>
-        </w:tc>
-        <w:tc>
-          <w:tcPr>
-            <w:tcW w:type="dxa" w:w="2016"/>
-            <w:tcMar>
-              <w:top w:w="36" w:type="dxa"/>
-              <w:bottom w:w="36" w:type="dxa"/>
+              <w:t>Weakness Specification</w:t>
+            </w:r>
+          </w:p>
+        </w:tc>
+        <w:tc>
+          <w:tcPr>
+            <w:tcW w:type="dxa" w:w="2592"/>
+            <w:tcMar>
+              <w:top w:w="28" w:type="dxa"/>
+              <w:bottom w:w="28" w:type="dxa"/>
               <w:left w:w="35" w:type="dxa"/>
               <w:right w:w="35" w:type="dxa"/>
             </w:tcMar>
@@ -594,16 +922,16 @@
                 <w:color w:val="FFFFFF"/>
                 <w:sz w:val="17"/>
               </w:rPr>
-              <w:t>Score Band</w:t>
-            </w:r>
-          </w:p>
-        </w:tc>
-        <w:tc>
-          <w:tcPr>
-            <w:tcW w:type="dxa" w:w="2592"/>
-            <w:tcMar>
-              <w:top w:w="36" w:type="dxa"/>
-              <w:bottom w:w="36" w:type="dxa"/>
+              <w:t>Attack Surface &amp; Sink</w:t>
+            </w:r>
+          </w:p>
+        </w:tc>
+        <w:tc>
+          <w:tcPr>
+            <w:tcW w:type="dxa" w:w="2736"/>
+            <w:tcMar>
+              <w:top w:w="28" w:type="dxa"/>
+              <w:bottom w:w="28" w:type="dxa"/>
               <w:left w:w="35" w:type="dxa"/>
               <w:right w:w="35" w:type="dxa"/>
             </w:tcMar>
@@ -626,7 +954,7 @@
                 <w:color w:val="FFFFFF"/>
                 <w:sz w:val="17"/>
               </w:rPr>
-              <w:t>Evaluator Remarks</w:t>
+              <w:t>Defensive Control Architecture</w:t>
             </w:r>
           </w:p>
         </w:tc>
@@ -634,10 +962,10 @@
       <w:tr>
         <w:tc>
           <w:tcPr>
-            <w:tcW w:type="dxa" w:w="3744"/>
-            <w:tcMar>
-              <w:top w:w="32" w:type="dxa"/>
-              <w:bottom w:w="32" w:type="dxa"/>
+            <w:tcW w:type="dxa" w:w="1584"/>
+            <w:tcMar>
+              <w:top w:w="24" w:type="dxa"/>
+              <w:bottom w:w="24" w:type="dxa"/>
               <w:left w:w="35" w:type="dxa"/>
               <w:right w:w="35" w:type="dxa"/>
             </w:tcMar>
@@ -660,16 +988,16 @@
                 <w:color w:val="1B365D"/>
                 <w:sz w:val="16"/>
               </w:rPr>
-              <w:t>System Architecture &amp; Dual-Engine Pipeline</w:t>
-            </w:r>
-          </w:p>
-        </w:tc>
-        <w:tc>
-          <w:tcPr>
-            <w:tcW w:type="dxa" w:w="1728"/>
-            <w:tcMar>
-              <w:top w:w="32" w:type="dxa"/>
-              <w:bottom w:w="32" w:type="dxa"/>
+              <w:t>CWE-89</w:t>
+            </w:r>
+          </w:p>
+        </w:tc>
+        <w:tc>
+          <w:tcPr>
+            <w:tcW w:type="dxa" w:w="3168"/>
+            <w:tcMar>
+              <w:top w:w="24" w:type="dxa"/>
+              <w:bottom w:w="24" w:type="dxa"/>
               <w:left w:w="35" w:type="dxa"/>
               <w:right w:w="35" w:type="dxa"/>
             </w:tcMar>
@@ -691,16 +1019,16 @@
                 <w:color w:val="1E293B"/>
                 <w:sz w:val="16"/>
               </w:rPr>
-              <w:t>20 Marks</w:t>
-            </w:r>
-          </w:p>
-        </w:tc>
-        <w:tc>
-          <w:tcPr>
-            <w:tcW w:type="dxa" w:w="2016"/>
-            <w:tcMar>
-              <w:top w:w="32" w:type="dxa"/>
-              <w:bottom w:w="32" w:type="dxa"/>
+              <w:t>Improper Neutralization of Special Elements used in an SQL Command (SQLi)</w:t>
+            </w:r>
+          </w:p>
+        </w:tc>
+        <w:tc>
+          <w:tcPr>
+            <w:tcW w:type="dxa" w:w="2592"/>
+            <w:tcMar>
+              <w:top w:w="24" w:type="dxa"/>
+              <w:bottom w:w="24" w:type="dxa"/>
               <w:left w:w="35" w:type="dxa"/>
               <w:right w:w="35" w:type="dxa"/>
             </w:tcMar>
@@ -722,16 +1050,16 @@
                 <w:color w:val="1E293B"/>
                 <w:sz w:val="16"/>
               </w:rPr>
-              <w:t>Outstanding (18-20)</w:t>
-            </w:r>
-          </w:p>
-        </w:tc>
-        <w:tc>
-          <w:tcPr>
-            <w:tcW w:type="dxa" w:w="2592"/>
-            <w:tcMar>
-              <w:top w:w="32" w:type="dxa"/>
-              <w:bottom w:w="32" w:type="dxa"/>
+              <w:t>Dynamic job title search filter (`jobs` table SELECT)</w:t>
+            </w:r>
+          </w:p>
+        </w:tc>
+        <w:tc>
+          <w:tcPr>
+            <w:tcW w:type="dxa" w:w="2736"/>
+            <w:tcMar>
+              <w:top w:w="24" w:type="dxa"/>
+              <w:bottom w:w="24" w:type="dxa"/>
               <w:left w:w="35" w:type="dxa"/>
               <w:right w:w="35" w:type="dxa"/>
             </w:tcMar>
@@ -753,7 +1081,7 @@
                 <w:color w:val="1E293B"/>
                 <w:sz w:val="16"/>
               </w:rPr>
-              <w:t>Clean session switching &amp; modular PHP router</w:t>
+              <w:t>Parameterized Prepared Statements (AST syntax separation)</w:t>
             </w:r>
           </w:p>
         </w:tc>
@@ -761,10 +1089,10 @@
       <w:tr>
         <w:tc>
           <w:tcPr>
-            <w:tcW w:type="dxa" w:w="3744"/>
-            <w:tcMar>
-              <w:top w:w="32" w:type="dxa"/>
-              <w:bottom w:w="32" w:type="dxa"/>
+            <w:tcW w:type="dxa" w:w="1584"/>
+            <w:tcMar>
+              <w:top w:w="24" w:type="dxa"/>
+              <w:bottom w:w="24" w:type="dxa"/>
               <w:left w:w="35" w:type="dxa"/>
               <w:right w:w="35" w:type="dxa"/>
             </w:tcMar>
@@ -787,16 +1115,16 @@
                 <w:color w:val="1B365D"/>
                 <w:sz w:val="16"/>
               </w:rPr>
-              <w:t>Vulnerability Exploitation Demonstration</w:t>
-            </w:r>
-          </w:p>
-        </w:tc>
-        <w:tc>
-          <w:tcPr>
-            <w:tcW w:type="dxa" w:w="1728"/>
-            <w:tcMar>
-              <w:top w:w="32" w:type="dxa"/>
-              <w:bottom w:w="32" w:type="dxa"/>
+              <w:t>CWE-79</w:t>
+            </w:r>
+          </w:p>
+        </w:tc>
+        <w:tc>
+          <w:tcPr>
+            <w:tcW w:type="dxa" w:w="3168"/>
+            <w:tcMar>
+              <w:top w:w="24" w:type="dxa"/>
+              <w:bottom w:w="24" w:type="dxa"/>
               <w:left w:w="35" w:type="dxa"/>
               <w:right w:w="35" w:type="dxa"/>
             </w:tcMar>
@@ -818,16 +1146,16 @@
                 <w:color w:val="1E293B"/>
                 <w:sz w:val="16"/>
               </w:rPr>
-              <w:t>25 Marks</w:t>
-            </w:r>
-          </w:p>
-        </w:tc>
-        <w:tc>
-          <w:tcPr>
-            <w:tcW w:type="dxa" w:w="2016"/>
-            <w:tcMar>
-              <w:top w:w="32" w:type="dxa"/>
-              <w:bottom w:w="32" w:type="dxa"/>
+              <w:t>Improper Neutralization of Input During Web Page Generation (Reflected XSS)</w:t>
+            </w:r>
+          </w:p>
+        </w:tc>
+        <w:tc>
+          <w:tcPr>
+            <w:tcW w:type="dxa" w:w="2592"/>
+            <w:tcMar>
+              <w:top w:w="24" w:type="dxa"/>
+              <w:bottom w:w="24" w:type="dxa"/>
               <w:left w:w="35" w:type="dxa"/>
               <w:right w:w="35" w:type="dxa"/>
             </w:tcMar>
@@ -849,16 +1177,16 @@
                 <w:color w:val="1E293B"/>
                 <w:sz w:val="16"/>
               </w:rPr>
-              <w:t>Outstanding (23-25)</w:t>
-            </w:r>
-          </w:p>
-        </w:tc>
-        <w:tc>
-          <w:tcPr>
-            <w:tcW w:type="dxa" w:w="2592"/>
-            <w:tcMar>
-              <w:top w:w="32" w:type="dxa"/>
-              <w:bottom w:w="32" w:type="dxa"/>
+              <w:t>Real-time query reflection banner into DOM (`innerHTML`)</w:t>
+            </w:r>
+          </w:p>
+        </w:tc>
+        <w:tc>
+          <w:tcPr>
+            <w:tcW w:type="dxa" w:w="2736"/>
+            <w:tcMar>
+              <w:top w:w="24" w:type="dxa"/>
+              <w:bottom w:w="24" w:type="dxa"/>
               <w:left w:w="35" w:type="dxa"/>
               <w:right w:w="35" w:type="dxa"/>
             </w:tcMar>
@@ -880,7 +1208,7 @@
                 <w:color w:val="1E293B"/>
                 <w:sz w:val="16"/>
               </w:rPr>
-              <w:t>Authentic payloads across all 5 CWE categories</w:t>
+              <w:t>Contextual HTML Entity Encoding (`htmlspecialchars` ENT_QUOTES)</w:t>
             </w:r>
           </w:p>
         </w:tc>
@@ -888,10 +1216,10 @@
       <w:tr>
         <w:tc>
           <w:tcPr>
-            <w:tcW w:type="dxa" w:w="3744"/>
-            <w:tcMar>
-              <w:top w:w="32" w:type="dxa"/>
-              <w:bottom w:w="32" w:type="dxa"/>
+            <w:tcW w:type="dxa" w:w="1584"/>
+            <w:tcMar>
+              <w:top w:w="24" w:type="dxa"/>
+              <w:bottom w:w="24" w:type="dxa"/>
               <w:left w:w="35" w:type="dxa"/>
               <w:right w:w="35" w:type="dxa"/>
             </w:tcMar>
@@ -914,16 +1242,16 @@
                 <w:color w:val="1B365D"/>
                 <w:sz w:val="16"/>
               </w:rPr>
-              <w:t>Defensive Engineering &amp; AST Mitigation</w:t>
-            </w:r>
-          </w:p>
-        </w:tc>
-        <w:tc>
-          <w:tcPr>
-            <w:tcW w:type="dxa" w:w="1728"/>
-            <w:tcMar>
-              <w:top w:w="32" w:type="dxa"/>
-              <w:bottom w:w="32" w:type="dxa"/>
+              <w:t>CWE-78</w:t>
+            </w:r>
+          </w:p>
+        </w:tc>
+        <w:tc>
+          <w:tcPr>
+            <w:tcW w:type="dxa" w:w="3168"/>
+            <w:tcMar>
+              <w:top w:w="24" w:type="dxa"/>
+              <w:bottom w:w="24" w:type="dxa"/>
               <w:left w:w="35" w:type="dxa"/>
               <w:right w:w="35" w:type="dxa"/>
             </w:tcMar>
@@ -945,16 +1273,16 @@
                 <w:color w:val="1E293B"/>
                 <w:sz w:val="16"/>
               </w:rPr>
-              <w:t>25 Marks</w:t>
-            </w:r>
-          </w:p>
-        </w:tc>
-        <w:tc>
-          <w:tcPr>
-            <w:tcW w:type="dxa" w:w="2016"/>
-            <w:tcMar>
-              <w:top w:w="32" w:type="dxa"/>
-              <w:bottom w:w="32" w:type="dxa"/>
+              <w:t>Improper Neutralization of Special Elements used in an OS Command</w:t>
+            </w:r>
+          </w:p>
+        </w:tc>
+        <w:tc>
+          <w:tcPr>
+            <w:tcW w:type="dxa" w:w="2592"/>
+            <w:tcMar>
+              <w:top w:w="24" w:type="dxa"/>
+              <w:bottom w:w="24" w:type="dxa"/>
               <w:left w:w="35" w:type="dxa"/>
               <w:right w:w="35" w:type="dxa"/>
             </w:tcMar>
@@ -976,16 +1304,16 @@
                 <w:color w:val="1E293B"/>
                 <w:sz w:val="16"/>
               </w:rPr>
-              <w:t>Outstanding (23-25)</w:t>
-            </w:r>
-          </w:p>
-        </w:tc>
-        <w:tc>
-          <w:tcPr>
-            <w:tcW w:type="dxa" w:w="2592"/>
-            <w:tcMar>
-              <w:top w:w="32" w:type="dxa"/>
-              <w:bottom w:w="32" w:type="dxa"/>
+              <w:t>Administrative network diagnostic ping utility (`shell_exec`)</w:t>
+            </w:r>
+          </w:p>
+        </w:tc>
+        <w:tc>
+          <w:tcPr>
+            <w:tcW w:type="dxa" w:w="2736"/>
+            <w:tcMar>
+              <w:top w:w="24" w:type="dxa"/>
+              <w:bottom w:w="24" w:type="dxa"/>
               <w:left w:w="35" w:type="dxa"/>
               <w:right w:w="35" w:type="dxa"/>
             </w:tcMar>
@@ -1007,7 +1335,7 @@
                 <w:color w:val="1E293B"/>
                 <w:sz w:val="16"/>
               </w:rPr>
-              <w:t>Strict parameterization, encoding, whitelisting</w:t>
+              <w:t>Strict Regex Whitelisting (`^[a-zA-Z0-9.-]+$`) + `escapeshellarg`</w:t>
             </w:r>
           </w:p>
         </w:tc>
@@ -1015,10 +1343,10 @@
       <w:tr>
         <w:tc>
           <w:tcPr>
-            <w:tcW w:type="dxa" w:w="3744"/>
-            <w:tcMar>
-              <w:top w:w="32" w:type="dxa"/>
-              <w:bottom w:w="32" w:type="dxa"/>
+            <w:tcW w:type="dxa" w:w="1584"/>
+            <w:tcMar>
+              <w:top w:w="24" w:type="dxa"/>
+              <w:bottom w:w="24" w:type="dxa"/>
               <w:left w:w="35" w:type="dxa"/>
               <w:right w:w="35" w:type="dxa"/>
             </w:tcMar>
@@ -1041,16 +1369,16 @@
                 <w:color w:val="1B365D"/>
                 <w:sz w:val="16"/>
               </w:rPr>
-              <w:t>Real-time Security Telemetry &amp; Contract</w:t>
-            </w:r>
-          </w:p>
-        </w:tc>
-        <w:tc>
-          <w:tcPr>
-            <w:tcW w:type="dxa" w:w="1728"/>
-            <w:tcMar>
-              <w:top w:w="32" w:type="dxa"/>
-              <w:bottom w:w="32" w:type="dxa"/>
+              <w:t>CWE-22</w:t>
+            </w:r>
+          </w:p>
+        </w:tc>
+        <w:tc>
+          <w:tcPr>
+            <w:tcW w:type="dxa" w:w="3168"/>
+            <w:tcMar>
+              <w:top w:w="24" w:type="dxa"/>
+              <w:bottom w:w="24" w:type="dxa"/>
               <w:left w:w="35" w:type="dxa"/>
               <w:right w:w="35" w:type="dxa"/>
             </w:tcMar>
@@ -1072,16 +1400,16 @@
                 <w:color w:val="1E293B"/>
                 <w:sz w:val="16"/>
               </w:rPr>
-              <w:t>15 Marks</w:t>
-            </w:r>
-          </w:p>
-        </w:tc>
-        <w:tc>
-          <w:tcPr>
-            <w:tcW w:type="dxa" w:w="2016"/>
-            <w:tcMar>
-              <w:top w:w="32" w:type="dxa"/>
-              <w:bottom w:w="32" w:type="dxa"/>
+              <w:t>Improper Limitation of a Pathname to a Restricted Directory</w:t>
+            </w:r>
+          </w:p>
+        </w:tc>
+        <w:tc>
+          <w:tcPr>
+            <w:tcW w:type="dxa" w:w="2592"/>
+            <w:tcMar>
+              <w:top w:w="24" w:type="dxa"/>
+              <w:bottom w:w="24" w:type="dxa"/>
               <w:left w:w="35" w:type="dxa"/>
               <w:right w:w="35" w:type="dxa"/>
             </w:tcMar>
@@ -1103,16 +1431,16 @@
                 <w:color w:val="1E293B"/>
                 <w:sz w:val="16"/>
               </w:rPr>
-              <w:t>Outstanding (14-15)</w:t>
-            </w:r>
-          </w:p>
-        </w:tc>
-        <w:tc>
-          <w:tcPr>
-            <w:tcW w:type="dxa" w:w="2592"/>
-            <w:tcMar>
-              <w:top w:w="32" w:type="dxa"/>
-              <w:bottom w:w="32" w:type="dxa"/>
+              <w:t>Candidate resume document inspector (`file_get_contents`)</w:t>
+            </w:r>
+          </w:p>
+        </w:tc>
+        <w:tc>
+          <w:tcPr>
+            <w:tcW w:type="dxa" w:w="2736"/>
+            <w:tcMar>
+              <w:top w:w="24" w:type="dxa"/>
+              <w:bottom w:w="24" w:type="dxa"/>
               <w:left w:w="35" w:type="dxa"/>
               <w:right w:w="35" w:type="dxa"/>
             </w:tcMar>
@@ -1134,7 +1462,7 @@
                 <w:color w:val="1E293B"/>
                 <w:sz w:val="16"/>
               </w:rPr>
-              <w:t>JSON contract emitting runtime audit logs</w:t>
+              <w:t>Basename Token Stripping (`basename`) + Strict Filename Whitelist</w:t>
             </w:r>
           </w:p>
         </w:tc>
@@ -1142,10 +1470,10 @@
       <w:tr>
         <w:tc>
           <w:tcPr>
-            <w:tcW w:type="dxa" w:w="3744"/>
-            <w:tcMar>
-              <w:top w:w="32" w:type="dxa"/>
-              <w:bottom w:w="32" w:type="dxa"/>
+            <w:tcW w:type="dxa" w:w="1584"/>
+            <w:tcMar>
+              <w:top w:w="24" w:type="dxa"/>
+              <w:bottom w:w="24" w:type="dxa"/>
               <w:left w:w="35" w:type="dxa"/>
               <w:right w:w="35" w:type="dxa"/>
             </w:tcMar>
@@ -1168,16 +1496,16 @@
                 <w:color w:val="1B365D"/>
                 <w:sz w:val="16"/>
               </w:rPr>
-              <w:t>Academic Viva Voce Defense &amp; Theory</w:t>
-            </w:r>
-          </w:p>
-        </w:tc>
-        <w:tc>
-          <w:tcPr>
-            <w:tcW w:type="dxa" w:w="1728"/>
-            <w:tcMar>
-              <w:top w:w="32" w:type="dxa"/>
-              <w:bottom w:w="32" w:type="dxa"/>
+              <w:t>CWE-1021</w:t>
+            </w:r>
+          </w:p>
+        </w:tc>
+        <w:tc>
+          <w:tcPr>
+            <w:tcW w:type="dxa" w:w="3168"/>
+            <w:tcMar>
+              <w:top w:w="24" w:type="dxa"/>
+              <w:bottom w:w="24" w:type="dxa"/>
               <w:left w:w="35" w:type="dxa"/>
               <w:right w:w="35" w:type="dxa"/>
             </w:tcMar>
@@ -1199,16 +1527,16 @@
                 <w:color w:val="1E293B"/>
                 <w:sz w:val="16"/>
               </w:rPr>
-              <w:t>15 Marks</w:t>
-            </w:r>
-          </w:p>
-        </w:tc>
-        <w:tc>
-          <w:tcPr>
-            <w:tcW w:type="dxa" w:w="2016"/>
-            <w:tcMar>
-              <w:top w:w="32" w:type="dxa"/>
-              <w:bottom w:w="32" w:type="dxa"/>
+              <w:t>Improper Restriction of Rendered UI Layers or Frames (Clickjacking)</w:t>
+            </w:r>
+          </w:p>
+        </w:tc>
+        <w:tc>
+          <w:tcPr>
+            <w:tcW w:type="dxa" w:w="2592"/>
+            <w:tcMar>
+              <w:top w:w="24" w:type="dxa"/>
+              <w:bottom w:w="24" w:type="dxa"/>
               <w:left w:w="35" w:type="dxa"/>
               <w:right w:w="35" w:type="dxa"/>
             </w:tcMar>
@@ -1230,16 +1558,16 @@
                 <w:color w:val="1E293B"/>
                 <w:sz w:val="16"/>
               </w:rPr>
-              <w:t>Outstanding (14-15)</w:t>
-            </w:r>
-          </w:p>
-        </w:tc>
-        <w:tc>
-          <w:tcPr>
-            <w:tcW w:type="dxa" w:w="2592"/>
-            <w:tcMar>
-              <w:top w:w="32" w:type="dxa"/>
-              <w:bottom w:w="32" w:type="dxa"/>
+              <w:t>Destructive candidate profile deletion workflow</w:t>
+            </w:r>
+          </w:p>
+        </w:tc>
+        <w:tc>
+          <w:tcPr>
+            <w:tcW w:type="dxa" w:w="2736"/>
+            <w:tcMar>
+              <w:top w:w="24" w:type="dxa"/>
+              <w:bottom w:w="24" w:type="dxa"/>
               <w:left w:w="35" w:type="dxa"/>
               <w:right w:w="35" w:type="dxa"/>
             </w:tcMar>
@@ -1261,7 +1589,7 @@
                 <w:color w:val="1E293B"/>
                 <w:sz w:val="16"/>
               </w:rPr>
-              <w:t>Comprehensive understanding of Web AppSec</w:t>
+              <w:t>HTTP Response Framing Protection (`X-Frame-Options`, CSP `frame-ancestors`)</w:t>
             </w:r>
           </w:p>
         </w:tc>
@@ -1269,44 +1597,8 @@
     </w:tbl>
     <w:p>
       <w:pPr>
-        <w:spacing w:before="0" w:after="440"/>
-      </w:pPr>
-    </w:p>
-    <w:p>
-      <w:pPr>
-        <w:spacing w:before="480" w:after="0"/>
-        <w:jc w:val="center"/>
-      </w:pPr>
-      <w:r>
-        <w:rPr>
-          <w:rFonts w:ascii="Calibri" w:hAnsi="Calibri"/>
-          <w:color w:val="64748B"/>
-          <w:sz w:val="17"/>
-        </w:rPr>
-        <w:t>Academic Year 2025–2026 | Comprehensive Laboratory &amp; Viva Demonstration Package</w:t>
-        <w:br/>
-        <w:t>Faculty Sign-Off &amp; Evaluator Verification Record</w:t>
-      </w:r>
-    </w:p>
-    <w:p>
-      <w:r>
-        <w:br w:type="page"/>
-      </w:r>
-    </w:p>
-    <w:p>
-      <w:pPr>
-        <w:keepNext/>
-        <w:spacing w:before="0" w:after="60"/>
-      </w:pPr>
-      <w:r>
-        <w:rPr>
-          <w:rFonts w:ascii="Calibri" w:hAnsi="Calibri"/>
-          <w:b/>
-          <w:color w:val="1B365D"/>
-          <w:sz w:val="27"/>
-        </w:rPr>
-        <w:t>Certificate of Originality &amp; Project Declaration</w:t>
-      </w:r>
+        <w:spacing w:before="0" w:after="120"/>
+      </w:pPr>
     </w:p>
     <w:tbl>
       <w:tblPr>
@@ -1328,11 +1620,11 @@
               <w:left w:w="40" w:type="dxa"/>
               <w:right w:w="40" w:type="dxa"/>
             </w:tcMar>
-            <w:shd w:fill="F0F7FF"/>
+            <w:shd w:fill="F0FDF4"/>
             <w:tcBorders>
               <w:top w:val="single" w:sz="4" w:space="0" w:color="CBD5E1"/>
               <w:bottom w:val="single" w:sz="4" w:space="0" w:color="CBD5E1"/>
-              <w:left w:val="single" w:sz="14" w:space="0" w:color="2563EB"/>
+              <w:left w:val="single" w:sz="14" w:space="0" w:color="10B981"/>
               <w:right w:val="single" w:sz="4" w:space="0" w:color="CBD5E1"/>
             </w:tcBorders>
           </w:tcPr>
@@ -1344,10 +1636,10 @@
               <w:rPr>
                 <w:rFonts w:ascii="Calibri" w:hAnsi="Calibri"/>
                 <w:b/>
-                <w:color w:val="2B4C7E"/>
+                <w:color w:val="10B981"/>
                 <w:sz w:val="17"/>
               </w:rPr>
-              <w:t xml:space="preserve">[ACADEMIC DECLARATION] </w:t>
+              <w:t xml:space="preserve">[ACADEMIC ENDORSEMENT] </w:t>
             </w:r>
             <w:r>
               <w:rPr>
@@ -1355,7 +1647,7 @@
                 <w:color w:val="1E293B"/>
                 <w:sz w:val="17"/>
               </w:rPr>
-              <w:t>This project report represents authentic laboratory research engineered strictly for course 20CYS403 (Web Application Security). All vulnerable implementations and corresponding defensive mitigations operate strictly within an isolated local testbed (localhost) using simulated candidate records and synthetic files.</w:t>
+              <w:t>Authenticity Attestation: Ram Karthik G hereby certifies that all source code artifacts, database schemas, test automation suites, and comparative telemetry records documented herein represent genuine laboratory achievements executed for Course 20CYS403.</w:t>
             </w:r>
           </w:p>
         </w:tc>
@@ -1363,1359 +1655,8 @@
     </w:tbl>
     <w:p>
       <w:pPr>
-        <w:spacing w:before="0" w:after="60"/>
-      </w:pPr>
-    </w:p>
-    <w:p>
-      <w:pPr>
-        <w:spacing w:before="0" w:after="50" w:line="269" w:lineRule="auto"/>
-      </w:pPr>
-      <w:r>
-        <w:rPr>
-          <w:rFonts w:ascii="Calibri" w:hAnsi="Calibri"/>
-          <w:i w:val="0"/>
-          <w:color w:val="1E293B"/>
-          <w:sz w:val="18"/>
-        </w:rPr>
-        <w:t>This is to certify that the project report entitled "SecureJobLab: Job Recruitment Vulnerability Demonstration &amp; Defense Platform" submitted by Ram Karthik G in partial fulfillment of the academic requirements for the laboratory assessment of course 20CYS403 Web Application Security represents authentic, original work conducted under laboratory supervision.</w:t>
-      </w:r>
-    </w:p>
-    <w:p>
-      <w:pPr>
-        <w:spacing w:before="0" w:after="50" w:line="269" w:lineRule="auto"/>
-      </w:pPr>
-      <w:r>
-        <w:rPr>
-          <w:rFonts w:ascii="Calibri" w:hAnsi="Calibri"/>
-          <w:i w:val="0"/>
-          <w:color w:val="1E293B"/>
-          <w:sz w:val="18"/>
-        </w:rPr>
-        <w:t>The laboratory implementation rigorously implements, analyzes, and demonstrates exactly five web application security vulnerabilities classified under the MITRE Common Weakness Enumeration (CWE) framework:</w:t>
-      </w:r>
-    </w:p>
-    <w:p>
-      <w:pPr>
-        <w:spacing w:before="0" w:after="36" w:line="264" w:lineRule="auto"/>
-        <w:ind w:left="288"/>
-      </w:pPr>
-      <w:r>
-        <w:rPr>
-          <w:rFonts w:ascii="Calibri" w:hAnsi="Calibri"/>
-          <w:b/>
-          <w:color w:val="2B4C7E"/>
-          <w:sz w:val="18"/>
-        </w:rPr>
-        <w:t xml:space="preserve">1. </w:t>
-      </w:r>
-      <w:r>
-        <w:rPr>
-          <w:rFonts w:ascii="Calibri" w:hAnsi="Calibri"/>
-          <w:color w:val="1E293B"/>
-          <w:sz w:val="18"/>
-        </w:rPr>
-        <w:t>SQL Injection (SQLi) — CWE-89: Unsanitized dynamic query string interpolation versus Parameterized Prepared Statements (mysqli_prepare) and AST compilation isolation.</w:t>
-      </w:r>
-    </w:p>
-    <w:p>
-      <w:pPr>
-        <w:spacing w:before="0" w:after="36" w:line="264" w:lineRule="auto"/>
-        <w:ind w:left="288"/>
-      </w:pPr>
-      <w:r>
-        <w:rPr>
-          <w:rFonts w:ascii="Calibri" w:hAnsi="Calibri"/>
-          <w:b/>
-          <w:color w:val="2B4C7E"/>
-          <w:sz w:val="18"/>
-        </w:rPr>
-        <w:t xml:space="preserve">2. </w:t>
-      </w:r>
-      <w:r>
-        <w:rPr>
-          <w:rFonts w:ascii="Calibri" w:hAnsi="Calibri"/>
-          <w:color w:val="1E293B"/>
-          <w:sz w:val="18"/>
-        </w:rPr>
-        <w:t>Cross-Site Scripting (XSS) — CWE-79: Direct raw reflection into the Document Object Model (DOM) versus Contextual HTML Entity Encoding (htmlspecialchars with ENT_QUOTES).</w:t>
-      </w:r>
-    </w:p>
-    <w:p>
-      <w:pPr>
-        <w:spacing w:before="0" w:after="36" w:line="264" w:lineRule="auto"/>
-        <w:ind w:left="288"/>
-      </w:pPr>
-      <w:r>
-        <w:rPr>
-          <w:rFonts w:ascii="Calibri" w:hAnsi="Calibri"/>
-          <w:b/>
-          <w:color w:val="2B4C7E"/>
-          <w:sz w:val="18"/>
-        </w:rPr>
-        <w:t xml:space="preserve">3. </w:t>
-      </w:r>
-      <w:r>
-        <w:rPr>
-          <w:rFonts w:ascii="Calibri" w:hAnsi="Calibri"/>
-          <w:color w:val="1E293B"/>
-          <w:sz w:val="18"/>
-        </w:rPr>
-        <w:t>OS Command Injection — CWE-78: Unsanitized host parameter concatenation into shell_exec() versus Strict Regex Character Whitelisting and Argument Escaping (escapeshellarg).</w:t>
-      </w:r>
-    </w:p>
-    <w:p>
-      <w:pPr>
-        <w:spacing w:before="0" w:after="36" w:line="264" w:lineRule="auto"/>
-        <w:ind w:left="288"/>
-      </w:pPr>
-      <w:r>
-        <w:rPr>
-          <w:rFonts w:ascii="Calibri" w:hAnsi="Calibri"/>
-          <w:b/>
-          <w:color w:val="2B4C7E"/>
-          <w:sz w:val="18"/>
-        </w:rPr>
-        <w:t xml:space="preserve">4. </w:t>
-      </w:r>
-      <w:r>
-        <w:rPr>
-          <w:rFonts w:ascii="Calibri" w:hAnsi="Calibri"/>
-          <w:color w:val="1E293B"/>
-          <w:sz w:val="18"/>
-        </w:rPr>
-        <w:t>Directory / Path Traversal — CWE-22: Arbitrary file path inclusion via relative path climbing (../) versus Basename Token Stripping (basename()) and Strict Filename Whitelisting.</w:t>
-      </w:r>
-    </w:p>
-    <w:p>
-      <w:pPr>
-        <w:spacing w:before="0" w:after="36" w:line="264" w:lineRule="auto"/>
-        <w:ind w:left="288"/>
-      </w:pPr>
-      <w:r>
-        <w:rPr>
-          <w:rFonts w:ascii="Calibri" w:hAnsi="Calibri"/>
-          <w:b/>
-          <w:color w:val="2B4C7E"/>
-          <w:sz w:val="18"/>
-        </w:rPr>
-        <w:t xml:space="preserve">5. </w:t>
-      </w:r>
-      <w:r>
-        <w:rPr>
-          <w:rFonts w:ascii="Calibri" w:hAnsi="Calibri"/>
-          <w:color w:val="1E293B"/>
-          <w:sz w:val="18"/>
-        </w:rPr>
-        <w:t>Clickjacking (UI Redressing) — CWE-1021: Framed destructive candidate account deletion via transparent overlay versus HTTP Framing Defense Headers (X-Frame-Options: DENY and CSP frame-ancestors 'none').</w:t>
-      </w:r>
-    </w:p>
-    <w:p>
-      <w:pPr>
-        <w:keepNext/>
-        <w:spacing w:before="80" w:after="40"/>
-      </w:pPr>
-      <w:r>
-        <w:rPr>
-          <w:rFonts w:ascii="Calibri" w:hAnsi="Calibri"/>
-          <w:b/>
-          <w:color w:val="2C3E50"/>
-          <w:sz w:val="19"/>
-        </w:rPr>
-        <w:t>Viva Examination Board Assessment Rubric</w:t>
-      </w:r>
-    </w:p>
-    <w:tbl>
-      <w:tblPr>
-        <w:tblW w:type="auto" w:w="0"/>
-        <w:jc w:val="center"/>
-        <w:tblLayout w:type="fixed"/>
-        <w:tblLook w:firstColumn="1" w:firstRow="1" w:lastColumn="0" w:lastRow="0" w:noHBand="0" w:noVBand="1" w:val="04A0"/>
-      </w:tblPr>
-      <w:tblGrid>
-        <w:gridCol w:w="2520"/>
-        <w:gridCol w:w="2520"/>
-        <w:gridCol w:w="2520"/>
-        <w:gridCol w:w="2520"/>
-      </w:tblGrid>
-      <w:tr>
-        <w:trPr>
-          <w:tblHeader/>
-        </w:trPr>
-        <w:tc>
-          <w:tcPr>
-            <w:tcW w:type="dxa" w:w="3600"/>
-            <w:tcMar>
-              <w:top w:w="24" w:type="dxa"/>
-              <w:bottom w:w="24" w:type="dxa"/>
-              <w:left w:w="35" w:type="dxa"/>
-              <w:right w:w="35" w:type="dxa"/>
-            </w:tcMar>
-            <w:shd w:fill="1B365D"/>
-            <w:tcBorders>
-              <w:top w:val="single" w:sz="4" w:space="0" w:color="1B365D"/>
-              <w:bottom w:val="single" w:sz="6" w:space="0" w:color="1B365D"/>
-              <w:left w:val="single" w:sz="4" w:space="0" w:color="CBD5E1"/>
-              <w:right w:val="single" w:sz="4" w:space="0" w:color="CBD5E1"/>
-            </w:tcBorders>
-          </w:tcPr>
-          <w:p>
-            <w:pPr>
-              <w:spacing w:before="0" w:after="0" w:line="252" w:lineRule="auto"/>
-            </w:pPr>
-            <w:r>
-              <w:rPr>
-                <w:rFonts w:ascii="Calibri" w:hAnsi="Calibri"/>
-                <w:b/>
-                <w:color w:val="FFFFFF"/>
-                <w:sz w:val="17"/>
-              </w:rPr>
-              <w:t>Evaluation Dimension</w:t>
-            </w:r>
-          </w:p>
-        </w:tc>
-        <w:tc>
-          <w:tcPr>
-            <w:tcW w:type="dxa" w:w="1152"/>
-            <w:tcMar>
-              <w:top w:w="24" w:type="dxa"/>
-              <w:bottom w:w="24" w:type="dxa"/>
-              <w:left w:w="35" w:type="dxa"/>
-              <w:right w:w="35" w:type="dxa"/>
-            </w:tcMar>
-            <w:shd w:fill="1B365D"/>
-            <w:tcBorders>
-              <w:top w:val="single" w:sz="4" w:space="0" w:color="1B365D"/>
-              <w:bottom w:val="single" w:sz="6" w:space="0" w:color="1B365D"/>
-              <w:left w:val="single" w:sz="4" w:space="0" w:color="CBD5E1"/>
-              <w:right w:val="single" w:sz="4" w:space="0" w:color="CBD5E1"/>
-            </w:tcBorders>
-          </w:tcPr>
-          <w:p>
-            <w:pPr>
-              <w:spacing w:before="0" w:after="0" w:line="252" w:lineRule="auto"/>
-            </w:pPr>
-            <w:r>
-              <w:rPr>
-                <w:rFonts w:ascii="Calibri" w:hAnsi="Calibri"/>
-                <w:b/>
-                <w:color w:val="FFFFFF"/>
-                <w:sz w:val="17"/>
-              </w:rPr>
-              <w:t>Weight</w:t>
-            </w:r>
-          </w:p>
-        </w:tc>
-        <w:tc>
-          <w:tcPr>
-            <w:tcW w:type="dxa" w:w="1584"/>
-            <w:tcMar>
-              <w:top w:w="24" w:type="dxa"/>
-              <w:bottom w:w="24" w:type="dxa"/>
-              <w:left w:w="35" w:type="dxa"/>
-              <w:right w:w="35" w:type="dxa"/>
-            </w:tcMar>
-            <w:shd w:fill="1B365D"/>
-            <w:tcBorders>
-              <w:top w:val="single" w:sz="4" w:space="0" w:color="1B365D"/>
-              <w:bottom w:val="single" w:sz="6" w:space="0" w:color="1B365D"/>
-              <w:left w:val="single" w:sz="4" w:space="0" w:color="CBD5E1"/>
-              <w:right w:val="single" w:sz="4" w:space="0" w:color="CBD5E1"/>
-            </w:tcBorders>
-          </w:tcPr>
-          <w:p>
-            <w:pPr>
-              <w:spacing w:before="0" w:after="0" w:line="252" w:lineRule="auto"/>
-            </w:pPr>
-            <w:r>
-              <w:rPr>
-                <w:rFonts w:ascii="Calibri" w:hAnsi="Calibri"/>
-                <w:b/>
-                <w:color w:val="FFFFFF"/>
-                <w:sz w:val="17"/>
-              </w:rPr>
-              <w:t>Score</w:t>
-            </w:r>
-          </w:p>
-        </w:tc>
-        <w:tc>
-          <w:tcPr>
-            <w:tcW w:type="dxa" w:w="3744"/>
-            <w:tcMar>
-              <w:top w:w="24" w:type="dxa"/>
-              <w:bottom w:w="24" w:type="dxa"/>
-              <w:left w:w="35" w:type="dxa"/>
-              <w:right w:w="35" w:type="dxa"/>
-            </w:tcMar>
-            <w:shd w:fill="1B365D"/>
-            <w:tcBorders>
-              <w:top w:val="single" w:sz="4" w:space="0" w:color="1B365D"/>
-              <w:bottom w:val="single" w:sz="6" w:space="0" w:color="1B365D"/>
-              <w:left w:val="single" w:sz="4" w:space="0" w:color="CBD5E1"/>
-              <w:right w:val="single" w:sz="4" w:space="0" w:color="CBD5E1"/>
-            </w:tcBorders>
-          </w:tcPr>
-          <w:p>
-            <w:pPr>
-              <w:spacing w:before="0" w:after="0" w:line="252" w:lineRule="auto"/>
-            </w:pPr>
-            <w:r>
-              <w:rPr>
-                <w:rFonts w:ascii="Calibri" w:hAnsi="Calibri"/>
-                <w:b/>
-                <w:color w:val="FFFFFF"/>
-                <w:sz w:val="17"/>
-              </w:rPr>
-              <w:t>Specific Evaluator Remarks</w:t>
-            </w:r>
-          </w:p>
-        </w:tc>
-      </w:tr>
-      <w:tr>
-        <w:tc>
-          <w:tcPr>
-            <w:tcW w:type="dxa" w:w="3600"/>
-            <w:tcMar>
-              <w:top w:w="20" w:type="dxa"/>
-              <w:bottom w:w="20" w:type="dxa"/>
-              <w:left w:w="35" w:type="dxa"/>
-              <w:right w:w="35" w:type="dxa"/>
-            </w:tcMar>
-            <w:shd w:fill="FFFFFF"/>
-            <w:tcBorders>
-              <w:top w:val="single" w:sz="4" w:space="0" w:color="CBD5E1"/>
-              <w:bottom w:val="single" w:sz="4" w:space="0" w:color="CBD5E1"/>
-              <w:left w:val="single" w:sz="4" w:space="0" w:color="CBD5E1"/>
-              <w:right w:val="single" w:sz="4" w:space="0" w:color="CBD5E1"/>
-            </w:tcBorders>
-          </w:tcPr>
-          <w:p>
-            <w:pPr>
-              <w:spacing w:before="0" w:after="0" w:line="252" w:lineRule="auto"/>
-            </w:pPr>
-            <w:r>
-              <w:rPr>
-                <w:rFonts w:ascii="Calibri" w:hAnsi="Calibri"/>
-                <w:b/>
-                <w:color w:val="1B365D"/>
-                <w:sz w:val="16"/>
-              </w:rPr>
-              <w:t>Threat Modeling &amp; Surface Architecture</w:t>
-            </w:r>
-          </w:p>
-        </w:tc>
-        <w:tc>
-          <w:tcPr>
-            <w:tcW w:type="dxa" w:w="1152"/>
-            <w:tcMar>
-              <w:top w:w="20" w:type="dxa"/>
-              <w:bottom w:w="20" w:type="dxa"/>
-              <w:left w:w="35" w:type="dxa"/>
-              <w:right w:w="35" w:type="dxa"/>
-            </w:tcMar>
-            <w:shd w:fill="FFFFFF"/>
-            <w:tcBorders>
-              <w:top w:val="single" w:sz="4" w:space="0" w:color="CBD5E1"/>
-              <w:bottom w:val="single" w:sz="4" w:space="0" w:color="CBD5E1"/>
-              <w:left w:val="single" w:sz="4" w:space="0" w:color="CBD5E1"/>
-              <w:right w:val="single" w:sz="4" w:space="0" w:color="CBD5E1"/>
-            </w:tcBorders>
-          </w:tcPr>
-          <w:p>
-            <w:pPr>
-              <w:spacing w:before="0" w:after="0" w:line="252" w:lineRule="auto"/>
-            </w:pPr>
-            <w:r>
-              <w:rPr>
-                <w:rFonts w:ascii="Calibri" w:hAnsi="Calibri"/>
-                <w:color w:val="1E293B"/>
-                <w:sz w:val="16"/>
-              </w:rPr>
-              <w:t>20%</w:t>
-            </w:r>
-          </w:p>
-        </w:tc>
-        <w:tc>
-          <w:tcPr>
-            <w:tcW w:type="dxa" w:w="1584"/>
-            <w:tcMar>
-              <w:top w:w="20" w:type="dxa"/>
-              <w:bottom w:w="20" w:type="dxa"/>
-              <w:left w:w="35" w:type="dxa"/>
-              <w:right w:w="35" w:type="dxa"/>
-            </w:tcMar>
-            <w:shd w:fill="FFFFFF"/>
-            <w:tcBorders>
-              <w:top w:val="single" w:sz="4" w:space="0" w:color="CBD5E1"/>
-              <w:bottom w:val="single" w:sz="4" w:space="0" w:color="CBD5E1"/>
-              <w:left w:val="single" w:sz="4" w:space="0" w:color="CBD5E1"/>
-              <w:right w:val="single" w:sz="4" w:space="0" w:color="CBD5E1"/>
-            </w:tcBorders>
-          </w:tcPr>
-          <w:p>
-            <w:pPr>
-              <w:spacing w:before="0" w:after="0" w:line="252" w:lineRule="auto"/>
-            </w:pPr>
-            <w:r>
-              <w:rPr>
-                <w:rFonts w:ascii="Calibri" w:hAnsi="Calibri"/>
-                <w:color w:val="1E293B"/>
-                <w:sz w:val="16"/>
-              </w:rPr>
-              <w:t>20 / 20</w:t>
-            </w:r>
-          </w:p>
-        </w:tc>
-        <w:tc>
-          <w:tcPr>
-            <w:tcW w:type="dxa" w:w="3744"/>
-            <w:tcMar>
-              <w:top w:w="20" w:type="dxa"/>
-              <w:bottom w:w="20" w:type="dxa"/>
-              <w:left w:w="35" w:type="dxa"/>
-              <w:right w:w="35" w:type="dxa"/>
-            </w:tcMar>
-            <w:shd w:fill="FFFFFF"/>
-            <w:tcBorders>
-              <w:top w:val="single" w:sz="4" w:space="0" w:color="CBD5E1"/>
-              <w:bottom w:val="single" w:sz="4" w:space="0" w:color="CBD5E1"/>
-              <w:left w:val="single" w:sz="4" w:space="0" w:color="CBD5E1"/>
-              <w:right w:val="single" w:sz="4" w:space="0" w:color="CBD5E1"/>
-            </w:tcBorders>
-          </w:tcPr>
-          <w:p>
-            <w:pPr>
-              <w:spacing w:before="0" w:after="0" w:line="252" w:lineRule="auto"/>
-            </w:pPr>
-            <w:r>
-              <w:rPr>
-                <w:rFonts w:ascii="Calibri" w:hAnsi="Calibri"/>
-                <w:color w:val="1E293B"/>
-                <w:sz w:val="16"/>
-              </w:rPr>
-              <w:t>Decoupled 4-tier model with zero-friction dual-engine session switcher</w:t>
-            </w:r>
-          </w:p>
-        </w:tc>
-      </w:tr>
-      <w:tr>
-        <w:tc>
-          <w:tcPr>
-            <w:tcW w:type="dxa" w:w="3600"/>
-            <w:tcMar>
-              <w:top w:w="20" w:type="dxa"/>
-              <w:bottom w:w="20" w:type="dxa"/>
-              <w:left w:w="35" w:type="dxa"/>
-              <w:right w:w="35" w:type="dxa"/>
-            </w:tcMar>
-            <w:shd w:fill="F8FAFC"/>
-            <w:tcBorders>
-              <w:top w:val="single" w:sz="4" w:space="0" w:color="CBD5E1"/>
-              <w:bottom w:val="single" w:sz="4" w:space="0" w:color="CBD5E1"/>
-              <w:left w:val="single" w:sz="4" w:space="0" w:color="CBD5E1"/>
-              <w:right w:val="single" w:sz="4" w:space="0" w:color="CBD5E1"/>
-            </w:tcBorders>
-          </w:tcPr>
-          <w:p>
-            <w:pPr>
-              <w:spacing w:before="0" w:after="0" w:line="252" w:lineRule="auto"/>
-            </w:pPr>
-            <w:r>
-              <w:rPr>
-                <w:rFonts w:ascii="Calibri" w:hAnsi="Calibri"/>
-                <w:b/>
-                <w:color w:val="1B365D"/>
-                <w:sz w:val="16"/>
-              </w:rPr>
-              <w:t>Vulnerability Exploitation Mechanics</w:t>
-            </w:r>
-          </w:p>
-        </w:tc>
-        <w:tc>
-          <w:tcPr>
-            <w:tcW w:type="dxa" w:w="1152"/>
-            <w:tcMar>
-              <w:top w:w="20" w:type="dxa"/>
-              <w:bottom w:w="20" w:type="dxa"/>
-              <w:left w:w="35" w:type="dxa"/>
-              <w:right w:w="35" w:type="dxa"/>
-            </w:tcMar>
-            <w:shd w:fill="F8FAFC"/>
-            <w:tcBorders>
-              <w:top w:val="single" w:sz="4" w:space="0" w:color="CBD5E1"/>
-              <w:bottom w:val="single" w:sz="4" w:space="0" w:color="CBD5E1"/>
-              <w:left w:val="single" w:sz="4" w:space="0" w:color="CBD5E1"/>
-              <w:right w:val="single" w:sz="4" w:space="0" w:color="CBD5E1"/>
-            </w:tcBorders>
-          </w:tcPr>
-          <w:p>
-            <w:pPr>
-              <w:spacing w:before="0" w:after="0" w:line="252" w:lineRule="auto"/>
-            </w:pPr>
-            <w:r>
-              <w:rPr>
-                <w:rFonts w:ascii="Calibri" w:hAnsi="Calibri"/>
-                <w:color w:val="1E293B"/>
-                <w:sz w:val="16"/>
-              </w:rPr>
-              <w:t>25%</w:t>
-            </w:r>
-          </w:p>
-        </w:tc>
-        <w:tc>
-          <w:tcPr>
-            <w:tcW w:type="dxa" w:w="1584"/>
-            <w:tcMar>
-              <w:top w:w="20" w:type="dxa"/>
-              <w:bottom w:w="20" w:type="dxa"/>
-              <w:left w:w="35" w:type="dxa"/>
-              <w:right w:w="35" w:type="dxa"/>
-            </w:tcMar>
-            <w:shd w:fill="F8FAFC"/>
-            <w:tcBorders>
-              <w:top w:val="single" w:sz="4" w:space="0" w:color="CBD5E1"/>
-              <w:bottom w:val="single" w:sz="4" w:space="0" w:color="CBD5E1"/>
-              <w:left w:val="single" w:sz="4" w:space="0" w:color="CBD5E1"/>
-              <w:right w:val="single" w:sz="4" w:space="0" w:color="CBD5E1"/>
-            </w:tcBorders>
-          </w:tcPr>
-          <w:p>
-            <w:pPr>
-              <w:spacing w:before="0" w:after="0" w:line="252" w:lineRule="auto"/>
-            </w:pPr>
-            <w:r>
-              <w:rPr>
-                <w:rFonts w:ascii="Calibri" w:hAnsi="Calibri"/>
-                <w:color w:val="1E293B"/>
-                <w:sz w:val="16"/>
-              </w:rPr>
-              <w:t>25 / 25</w:t>
-            </w:r>
-          </w:p>
-        </w:tc>
-        <w:tc>
-          <w:tcPr>
-            <w:tcW w:type="dxa" w:w="3744"/>
-            <w:tcMar>
-              <w:top w:w="20" w:type="dxa"/>
-              <w:bottom w:w="20" w:type="dxa"/>
-              <w:left w:w="35" w:type="dxa"/>
-              <w:right w:w="35" w:type="dxa"/>
-            </w:tcMar>
-            <w:shd w:fill="F8FAFC"/>
-            <w:tcBorders>
-              <w:top w:val="single" w:sz="4" w:space="0" w:color="CBD5E1"/>
-              <w:bottom w:val="single" w:sz="4" w:space="0" w:color="CBD5E1"/>
-              <w:left w:val="single" w:sz="4" w:space="0" w:color="CBD5E1"/>
-              <w:right w:val="single" w:sz="4" w:space="0" w:color="CBD5E1"/>
-            </w:tcBorders>
-          </w:tcPr>
-          <w:p>
-            <w:pPr>
-              <w:spacing w:before="0" w:after="0" w:line="252" w:lineRule="auto"/>
-            </w:pPr>
-            <w:r>
-              <w:rPr>
-                <w:rFonts w:ascii="Calibri" w:hAnsi="Calibri"/>
-                <w:color w:val="1E293B"/>
-                <w:sz w:val="16"/>
-              </w:rPr>
-              <w:t>Authentic payloads executed across all 5 CWE categories with proof</w:t>
-            </w:r>
-          </w:p>
-        </w:tc>
-      </w:tr>
-      <w:tr>
-        <w:tc>
-          <w:tcPr>
-            <w:tcW w:type="dxa" w:w="3600"/>
-            <w:tcMar>
-              <w:top w:w="20" w:type="dxa"/>
-              <w:bottom w:w="20" w:type="dxa"/>
-              <w:left w:w="35" w:type="dxa"/>
-              <w:right w:w="35" w:type="dxa"/>
-            </w:tcMar>
-            <w:shd w:fill="FFFFFF"/>
-            <w:tcBorders>
-              <w:top w:val="single" w:sz="4" w:space="0" w:color="CBD5E1"/>
-              <w:bottom w:val="single" w:sz="4" w:space="0" w:color="CBD5E1"/>
-              <w:left w:val="single" w:sz="4" w:space="0" w:color="CBD5E1"/>
-              <w:right w:val="single" w:sz="4" w:space="0" w:color="CBD5E1"/>
-            </w:tcBorders>
-          </w:tcPr>
-          <w:p>
-            <w:pPr>
-              <w:spacing w:before="0" w:after="0" w:line="252" w:lineRule="auto"/>
-            </w:pPr>
-            <w:r>
-              <w:rPr>
-                <w:rFonts w:ascii="Calibri" w:hAnsi="Calibri"/>
-                <w:b/>
-                <w:color w:val="1B365D"/>
-                <w:sz w:val="16"/>
-              </w:rPr>
-              <w:t>Defensive Engineering &amp; AST Isolation</w:t>
-            </w:r>
-          </w:p>
-        </w:tc>
-        <w:tc>
-          <w:tcPr>
-            <w:tcW w:type="dxa" w:w="1152"/>
-            <w:tcMar>
-              <w:top w:w="20" w:type="dxa"/>
-              <w:bottom w:w="20" w:type="dxa"/>
-              <w:left w:w="35" w:type="dxa"/>
-              <w:right w:w="35" w:type="dxa"/>
-            </w:tcMar>
-            <w:shd w:fill="FFFFFF"/>
-            <w:tcBorders>
-              <w:top w:val="single" w:sz="4" w:space="0" w:color="CBD5E1"/>
-              <w:bottom w:val="single" w:sz="4" w:space="0" w:color="CBD5E1"/>
-              <w:left w:val="single" w:sz="4" w:space="0" w:color="CBD5E1"/>
-              <w:right w:val="single" w:sz="4" w:space="0" w:color="CBD5E1"/>
-            </w:tcBorders>
-          </w:tcPr>
-          <w:p>
-            <w:pPr>
-              <w:spacing w:before="0" w:after="0" w:line="252" w:lineRule="auto"/>
-            </w:pPr>
-            <w:r>
-              <w:rPr>
-                <w:rFonts w:ascii="Calibri" w:hAnsi="Calibri"/>
-                <w:color w:val="1E293B"/>
-                <w:sz w:val="16"/>
-              </w:rPr>
-              <w:t>25%</w:t>
-            </w:r>
-          </w:p>
-        </w:tc>
-        <w:tc>
-          <w:tcPr>
-            <w:tcW w:type="dxa" w:w="1584"/>
-            <w:tcMar>
-              <w:top w:w="20" w:type="dxa"/>
-              <w:bottom w:w="20" w:type="dxa"/>
-              <w:left w:w="35" w:type="dxa"/>
-              <w:right w:w="35" w:type="dxa"/>
-            </w:tcMar>
-            <w:shd w:fill="FFFFFF"/>
-            <w:tcBorders>
-              <w:top w:val="single" w:sz="4" w:space="0" w:color="CBD5E1"/>
-              <w:bottom w:val="single" w:sz="4" w:space="0" w:color="CBD5E1"/>
-              <w:left w:val="single" w:sz="4" w:space="0" w:color="CBD5E1"/>
-              <w:right w:val="single" w:sz="4" w:space="0" w:color="CBD5E1"/>
-            </w:tcBorders>
-          </w:tcPr>
-          <w:p>
-            <w:pPr>
-              <w:spacing w:before="0" w:after="0" w:line="252" w:lineRule="auto"/>
-            </w:pPr>
-            <w:r>
-              <w:rPr>
-                <w:rFonts w:ascii="Calibri" w:hAnsi="Calibri"/>
-                <w:color w:val="1E293B"/>
-                <w:sz w:val="16"/>
-              </w:rPr>
-              <w:t>25 / 25</w:t>
-            </w:r>
-          </w:p>
-        </w:tc>
-        <w:tc>
-          <w:tcPr>
-            <w:tcW w:type="dxa" w:w="3744"/>
-            <w:tcMar>
-              <w:top w:w="20" w:type="dxa"/>
-              <w:bottom w:w="20" w:type="dxa"/>
-              <w:left w:w="35" w:type="dxa"/>
-              <w:right w:w="35" w:type="dxa"/>
-            </w:tcMar>
-            <w:shd w:fill="FFFFFF"/>
-            <w:tcBorders>
-              <w:top w:val="single" w:sz="4" w:space="0" w:color="CBD5E1"/>
-              <w:bottom w:val="single" w:sz="4" w:space="0" w:color="CBD5E1"/>
-              <w:left w:val="single" w:sz="4" w:space="0" w:color="CBD5E1"/>
-              <w:right w:val="single" w:sz="4" w:space="0" w:color="CBD5E1"/>
-            </w:tcBorders>
-          </w:tcPr>
-          <w:p>
-            <w:pPr>
-              <w:spacing w:before="0" w:after="0" w:line="252" w:lineRule="auto"/>
-            </w:pPr>
-            <w:r>
-              <w:rPr>
-                <w:rFonts w:ascii="Calibri" w:hAnsi="Calibri"/>
-                <w:color w:val="1E293B"/>
-                <w:sz w:val="16"/>
-              </w:rPr>
-              <w:t>Strict parameterization, entity encoding, regex whitelisting verified</w:t>
-            </w:r>
-          </w:p>
-        </w:tc>
-      </w:tr>
-      <w:tr>
-        <w:tc>
-          <w:tcPr>
-            <w:tcW w:type="dxa" w:w="3600"/>
-            <w:tcMar>
-              <w:top w:w="20" w:type="dxa"/>
-              <w:bottom w:w="20" w:type="dxa"/>
-              <w:left w:w="35" w:type="dxa"/>
-              <w:right w:w="35" w:type="dxa"/>
-            </w:tcMar>
-            <w:shd w:fill="F8FAFC"/>
-            <w:tcBorders>
-              <w:top w:val="single" w:sz="4" w:space="0" w:color="CBD5E1"/>
-              <w:bottom w:val="single" w:sz="4" w:space="0" w:color="CBD5E1"/>
-              <w:left w:val="single" w:sz="4" w:space="0" w:color="CBD5E1"/>
-              <w:right w:val="single" w:sz="4" w:space="0" w:color="CBD5E1"/>
-            </w:tcBorders>
-          </w:tcPr>
-          <w:p>
-            <w:pPr>
-              <w:spacing w:before="0" w:after="0" w:line="252" w:lineRule="auto"/>
-            </w:pPr>
-            <w:r>
-              <w:rPr>
-                <w:rFonts w:ascii="Calibri" w:hAnsi="Calibri"/>
-                <w:b/>
-                <w:color w:val="1B365D"/>
-                <w:sz w:val="16"/>
-              </w:rPr>
-              <w:t>Real-time Security Telemetry &amp; Audit</w:t>
-            </w:r>
-          </w:p>
-        </w:tc>
-        <w:tc>
-          <w:tcPr>
-            <w:tcW w:type="dxa" w:w="1152"/>
-            <w:tcMar>
-              <w:top w:w="20" w:type="dxa"/>
-              <w:bottom w:w="20" w:type="dxa"/>
-              <w:left w:w="35" w:type="dxa"/>
-              <w:right w:w="35" w:type="dxa"/>
-            </w:tcMar>
-            <w:shd w:fill="F8FAFC"/>
-            <w:tcBorders>
-              <w:top w:val="single" w:sz="4" w:space="0" w:color="CBD5E1"/>
-              <w:bottom w:val="single" w:sz="4" w:space="0" w:color="CBD5E1"/>
-              <w:left w:val="single" w:sz="4" w:space="0" w:color="CBD5E1"/>
-              <w:right w:val="single" w:sz="4" w:space="0" w:color="CBD5E1"/>
-            </w:tcBorders>
-          </w:tcPr>
-          <w:p>
-            <w:pPr>
-              <w:spacing w:before="0" w:after="0" w:line="252" w:lineRule="auto"/>
-            </w:pPr>
-            <w:r>
-              <w:rPr>
-                <w:rFonts w:ascii="Calibri" w:hAnsi="Calibri"/>
-                <w:color w:val="1E293B"/>
-                <w:sz w:val="16"/>
-              </w:rPr>
-              <w:t>15%</w:t>
-            </w:r>
-          </w:p>
-        </w:tc>
-        <w:tc>
-          <w:tcPr>
-            <w:tcW w:type="dxa" w:w="1584"/>
-            <w:tcMar>
-              <w:top w:w="20" w:type="dxa"/>
-              <w:bottom w:w="20" w:type="dxa"/>
-              <w:left w:w="35" w:type="dxa"/>
-              <w:right w:w="35" w:type="dxa"/>
-            </w:tcMar>
-            <w:shd w:fill="F8FAFC"/>
-            <w:tcBorders>
-              <w:top w:val="single" w:sz="4" w:space="0" w:color="CBD5E1"/>
-              <w:bottom w:val="single" w:sz="4" w:space="0" w:color="CBD5E1"/>
-              <w:left w:val="single" w:sz="4" w:space="0" w:color="CBD5E1"/>
-              <w:right w:val="single" w:sz="4" w:space="0" w:color="CBD5E1"/>
-            </w:tcBorders>
-          </w:tcPr>
-          <w:p>
-            <w:pPr>
-              <w:spacing w:before="0" w:after="0" w:line="252" w:lineRule="auto"/>
-            </w:pPr>
-            <w:r>
-              <w:rPr>
-                <w:rFonts w:ascii="Calibri" w:hAnsi="Calibri"/>
-                <w:color w:val="1E293B"/>
-                <w:sz w:val="16"/>
-              </w:rPr>
-              <w:t>15 / 15</w:t>
-            </w:r>
-          </w:p>
-        </w:tc>
-        <w:tc>
-          <w:tcPr>
-            <w:tcW w:type="dxa" w:w="3744"/>
-            <w:tcMar>
-              <w:top w:w="20" w:type="dxa"/>
-              <w:bottom w:w="20" w:type="dxa"/>
-              <w:left w:w="35" w:type="dxa"/>
-              <w:right w:w="35" w:type="dxa"/>
-            </w:tcMar>
-            <w:shd w:fill="F8FAFC"/>
-            <w:tcBorders>
-              <w:top w:val="single" w:sz="4" w:space="0" w:color="CBD5E1"/>
-              <w:bottom w:val="single" w:sz="4" w:space="0" w:color="CBD5E1"/>
-              <w:left w:val="single" w:sz="4" w:space="0" w:color="CBD5E1"/>
-              <w:right w:val="single" w:sz="4" w:space="0" w:color="CBD5E1"/>
-            </w:tcBorders>
-          </w:tcPr>
-          <w:p>
-            <w:pPr>
-              <w:spacing w:before="0" w:after="0" w:line="252" w:lineRule="auto"/>
-            </w:pPr>
-            <w:r>
-              <w:rPr>
-                <w:rFonts w:ascii="Calibri" w:hAnsi="Calibri"/>
-                <w:color w:val="1E293B"/>
-                <w:sz w:val="16"/>
-              </w:rPr>
-              <w:t>JSON contract emitting runtime SQL syntax, shell logs, and headers</w:t>
-            </w:r>
-          </w:p>
-        </w:tc>
-      </w:tr>
-      <w:tr>
-        <w:tc>
-          <w:tcPr>
-            <w:tcW w:type="dxa" w:w="3600"/>
-            <w:tcMar>
-              <w:top w:w="20" w:type="dxa"/>
-              <w:bottom w:w="20" w:type="dxa"/>
-              <w:left w:w="35" w:type="dxa"/>
-              <w:right w:w="35" w:type="dxa"/>
-            </w:tcMar>
-            <w:shd w:fill="FFFFFF"/>
-            <w:tcBorders>
-              <w:top w:val="single" w:sz="4" w:space="0" w:color="CBD5E1"/>
-              <w:bottom w:val="single" w:sz="4" w:space="0" w:color="CBD5E1"/>
-              <w:left w:val="single" w:sz="4" w:space="0" w:color="CBD5E1"/>
-              <w:right w:val="single" w:sz="4" w:space="0" w:color="CBD5E1"/>
-            </w:tcBorders>
-          </w:tcPr>
-          <w:p>
-            <w:pPr>
-              <w:spacing w:before="0" w:after="0" w:line="252" w:lineRule="auto"/>
-            </w:pPr>
-            <w:r>
-              <w:rPr>
-                <w:rFonts w:ascii="Calibri" w:hAnsi="Calibri"/>
-                <w:b/>
-                <w:color w:val="1B365D"/>
-                <w:sz w:val="16"/>
-              </w:rPr>
-              <w:t>Technical Viva Defense &amp; Security Theory</w:t>
-            </w:r>
-          </w:p>
-        </w:tc>
-        <w:tc>
-          <w:tcPr>
-            <w:tcW w:type="dxa" w:w="1152"/>
-            <w:tcMar>
-              <w:top w:w="20" w:type="dxa"/>
-              <w:bottom w:w="20" w:type="dxa"/>
-              <w:left w:w="35" w:type="dxa"/>
-              <w:right w:w="35" w:type="dxa"/>
-            </w:tcMar>
-            <w:shd w:fill="FFFFFF"/>
-            <w:tcBorders>
-              <w:top w:val="single" w:sz="4" w:space="0" w:color="CBD5E1"/>
-              <w:bottom w:val="single" w:sz="4" w:space="0" w:color="CBD5E1"/>
-              <w:left w:val="single" w:sz="4" w:space="0" w:color="CBD5E1"/>
-              <w:right w:val="single" w:sz="4" w:space="0" w:color="CBD5E1"/>
-            </w:tcBorders>
-          </w:tcPr>
-          <w:p>
-            <w:pPr>
-              <w:spacing w:before="0" w:after="0" w:line="252" w:lineRule="auto"/>
-            </w:pPr>
-            <w:r>
-              <w:rPr>
-                <w:rFonts w:ascii="Calibri" w:hAnsi="Calibri"/>
-                <w:color w:val="1E293B"/>
-                <w:sz w:val="16"/>
-              </w:rPr>
-              <w:t>15%</w:t>
-            </w:r>
-          </w:p>
-        </w:tc>
-        <w:tc>
-          <w:tcPr>
-            <w:tcW w:type="dxa" w:w="1584"/>
-            <w:tcMar>
-              <w:top w:w="20" w:type="dxa"/>
-              <w:bottom w:w="20" w:type="dxa"/>
-              <w:left w:w="35" w:type="dxa"/>
-              <w:right w:w="35" w:type="dxa"/>
-            </w:tcMar>
-            <w:shd w:fill="FFFFFF"/>
-            <w:tcBorders>
-              <w:top w:val="single" w:sz="4" w:space="0" w:color="CBD5E1"/>
-              <w:bottom w:val="single" w:sz="4" w:space="0" w:color="CBD5E1"/>
-              <w:left w:val="single" w:sz="4" w:space="0" w:color="CBD5E1"/>
-              <w:right w:val="single" w:sz="4" w:space="0" w:color="CBD5E1"/>
-            </w:tcBorders>
-          </w:tcPr>
-          <w:p>
-            <w:pPr>
-              <w:spacing w:before="0" w:after="0" w:line="252" w:lineRule="auto"/>
-            </w:pPr>
-            <w:r>
-              <w:rPr>
-                <w:rFonts w:ascii="Calibri" w:hAnsi="Calibri"/>
-                <w:color w:val="1E293B"/>
-                <w:sz w:val="16"/>
-              </w:rPr>
-              <w:t>15 / 15</w:t>
-            </w:r>
-          </w:p>
-        </w:tc>
-        <w:tc>
-          <w:tcPr>
-            <w:tcW w:type="dxa" w:w="3744"/>
-            <w:tcMar>
-              <w:top w:w="20" w:type="dxa"/>
-              <w:bottom w:w="20" w:type="dxa"/>
-              <w:left w:w="35" w:type="dxa"/>
-              <w:right w:w="35" w:type="dxa"/>
-            </w:tcMar>
-            <w:shd w:fill="FFFFFF"/>
-            <w:tcBorders>
-              <w:top w:val="single" w:sz="4" w:space="0" w:color="CBD5E1"/>
-              <w:bottom w:val="single" w:sz="4" w:space="0" w:color="CBD5E1"/>
-              <w:left w:val="single" w:sz="4" w:space="0" w:color="CBD5E1"/>
-              <w:right w:val="single" w:sz="4" w:space="0" w:color="CBD5E1"/>
-            </w:tcBorders>
-          </w:tcPr>
-          <w:p>
-            <w:pPr>
-              <w:spacing w:before="0" w:after="0" w:line="252" w:lineRule="auto"/>
-            </w:pPr>
-            <w:r>
-              <w:rPr>
-                <w:rFonts w:ascii="Calibri" w:hAnsi="Calibri"/>
-                <w:color w:val="1E293B"/>
-                <w:sz w:val="16"/>
-              </w:rPr>
-              <w:t>Flawless grasp of Web AppSec, AST compilation, and ASVS Level 2</w:t>
-            </w:r>
-          </w:p>
-        </w:tc>
-      </w:tr>
-    </w:tbl>
-    <w:p>
-      <w:pPr>
-        <w:spacing w:before="0" w:after="80"/>
-      </w:pPr>
-    </w:p>
-    <w:p>
-      <w:pPr>
-        <w:spacing w:before="80" w:after="40"/>
-      </w:pPr>
-      <w:r>
-        <w:rPr>
-          <w:rFonts w:ascii="Calibri" w:hAnsi="Calibri"/>
-          <w:b/>
-          <w:color w:val="2B4C7E"/>
-          <w:sz w:val="19"/>
-        </w:rPr>
-        <w:t>Candidate Verification &amp; Examination Committee Endorsements</w:t>
-      </w:r>
-    </w:p>
-    <w:tbl>
-      <w:tblPr>
-        <w:tblW w:type="auto" w:w="0"/>
-        <w:jc w:val="center"/>
-        <w:tblLayout w:type="fixed"/>
-        <w:tblLook w:firstColumn="1" w:firstRow="1" w:lastColumn="0" w:lastRow="0" w:noHBand="0" w:noVBand="1" w:val="04A0"/>
-      </w:tblPr>
-      <w:tblGrid>
-        <w:gridCol w:w="5184"/>
-        <w:gridCol w:w="4896"/>
-      </w:tblGrid>
-      <w:tr>
-        <w:tc>
-          <w:tcPr>
-            <w:tcW w:type="dxa" w:w="5040"/>
-            <w:tcBorders>
-              <w:top w:val="none"/>
-              <w:bottom w:val="none"/>
-              <w:left w:val="none"/>
-              <w:right w:val="none"/>
-            </w:tcBorders>
-          </w:tcPr>
-          <w:p>
-            <w:pPr>
-              <w:spacing w:before="0" w:after="0"/>
-            </w:pPr>
-            <w:r>
-              <w:rPr>
-                <w:rFonts w:ascii="Calibri" w:hAnsi="Calibri"/>
-                <w:b/>
-                <w:color w:val="1B365D"/>
-                <w:sz w:val="18"/>
-              </w:rPr>
-              <w:t>Student Signature: _______________________</w:t>
-              <w:br/>
-              <w:t>Candidate Name: Ram Karthik G</w:t>
-              <w:br/>
-              <w:t>Course Code: 20CYS403</w:t>
-            </w:r>
-          </w:p>
-        </w:tc>
-        <w:tc>
-          <w:tcPr>
-            <w:tcW w:type="dxa" w:w="5040"/>
-            <w:tcBorders>
-              <w:top w:val="none"/>
-              <w:bottom w:val="none"/>
-              <w:left w:val="none"/>
-              <w:right w:val="none"/>
-            </w:tcBorders>
-          </w:tcPr>
-          <w:p>
-            <w:pPr>
-              <w:spacing w:before="0" w:after="0"/>
-            </w:pPr>
-            <w:r>
-              <w:rPr>
-                <w:rFonts w:ascii="Calibri" w:hAnsi="Calibri"/>
-                <w:b/>
-                <w:color w:val="1B365D"/>
-                <w:sz w:val="18"/>
-              </w:rPr>
-              <w:t>Date of Submission: October 7, 2026</w:t>
-              <w:br/>
-              <w:t>Academic Term: Final Laboratory Evaluation</w:t>
-              <w:br/>
-              <w:t>Evaluation Center: Cybersecurity Lab 3</w:t>
-            </w:r>
-          </w:p>
-        </w:tc>
-      </w:tr>
-    </w:tbl>
-    <w:p>
-      <w:pPr>
-        <w:spacing w:before="80" w:after="40"/>
-      </w:pPr>
-      <w:r>
-        <w:rPr>
-          <w:rFonts w:ascii="Calibri" w:hAnsi="Calibri"/>
-          <w:b/>
-          <w:color w:val="2C3E50"/>
-          <w:sz w:val="18"/>
-        </w:rPr>
-        <w:t>Faculty Evaluation &amp; Viva Voce Sign-Off Committee</w:t>
-      </w:r>
-    </w:p>
-    <w:tbl>
-      <w:tblPr>
-        <w:tblW w:type="auto" w:w="0"/>
-        <w:jc w:val="center"/>
-        <w:tblLayout w:type="fixed"/>
-        <w:tblLook w:firstColumn="1" w:firstRow="1" w:lastColumn="0" w:lastRow="0" w:noHBand="0" w:noVBand="1" w:val="04A0"/>
-      </w:tblPr>
-      <w:tblGrid>
-        <w:gridCol w:w="3312"/>
-        <w:gridCol w:w="3456"/>
-        <w:gridCol w:w="3312"/>
-      </w:tblGrid>
-      <w:tr>
-        <w:tc>
-          <w:tcPr>
-            <w:tcW w:type="dxa" w:w="3360"/>
-            <w:tcMar>
-              <w:top w:w="22" w:type="dxa"/>
-              <w:bottom w:w="22" w:type="dxa"/>
-              <w:left w:w="15" w:type="dxa"/>
-              <w:right w:w="15" w:type="dxa"/>
-            </w:tcMar>
-            <w:tcBorders>
-              <w:top w:val="single" w:sz="4" w:space="0" w:color="CBD5E1"/>
-              <w:bottom w:val="single" w:sz="4" w:space="0" w:color="CBD5E1"/>
-              <w:left w:val="single" w:sz="4" w:space="0" w:color="CBD5E1"/>
-              <w:right w:val="single" w:sz="4" w:space="0" w:color="CBD5E1"/>
-            </w:tcBorders>
-          </w:tcPr>
-          <w:p>
-            <w:pPr>
-              <w:spacing w:before="0" w:after="0"/>
-            </w:pPr>
-            <w:r>
-              <w:rPr>
-                <w:rFonts w:ascii="Calibri" w:hAnsi="Calibri"/>
-                <w:b/>
-                <w:color w:val="1B365D"/>
-                <w:sz w:val="17"/>
-              </w:rPr>
-              <w:t>Internal Examiner:</w:t>
-            </w:r>
-          </w:p>
-        </w:tc>
-        <w:tc>
-          <w:tcPr>
-            <w:tcW w:type="dxa" w:w="3360"/>
-            <w:tcMar>
-              <w:top w:w="22" w:type="dxa"/>
-              <w:bottom w:w="22" w:type="dxa"/>
-              <w:left w:w="15" w:type="dxa"/>
-              <w:right w:w="15" w:type="dxa"/>
-            </w:tcMar>
-            <w:tcBorders>
-              <w:top w:val="single" w:sz="4" w:space="0" w:color="CBD5E1"/>
-              <w:bottom w:val="single" w:sz="4" w:space="0" w:color="CBD5E1"/>
-              <w:left w:val="single" w:sz="4" w:space="0" w:color="CBD5E1"/>
-              <w:right w:val="single" w:sz="4" w:space="0" w:color="CBD5E1"/>
-            </w:tcBorders>
-          </w:tcPr>
-          <w:p>
-            <w:pPr>
-              <w:spacing w:before="0" w:after="0"/>
-            </w:pPr>
-            <w:r>
-              <w:rPr>
-                <w:rFonts w:ascii="Calibri" w:hAnsi="Calibri"/>
-                <w:color w:val="1E293B"/>
-                <w:sz w:val="17"/>
-              </w:rPr>
-              <w:t>Signature: __________________</w:t>
-            </w:r>
-          </w:p>
-        </w:tc>
-        <w:tc>
-          <w:tcPr>
-            <w:tcW w:type="dxa" w:w="3360"/>
-            <w:tcMar>
-              <w:top w:w="22" w:type="dxa"/>
-              <w:bottom w:w="22" w:type="dxa"/>
-              <w:left w:w="15" w:type="dxa"/>
-              <w:right w:w="15" w:type="dxa"/>
-            </w:tcMar>
-            <w:tcBorders>
-              <w:top w:val="single" w:sz="4" w:space="0" w:color="CBD5E1"/>
-              <w:bottom w:val="single" w:sz="4" w:space="0" w:color="CBD5E1"/>
-              <w:left w:val="single" w:sz="4" w:space="0" w:color="CBD5E1"/>
-              <w:right w:val="single" w:sz="4" w:space="0" w:color="CBD5E1"/>
-            </w:tcBorders>
-          </w:tcPr>
-          <w:p>
-            <w:pPr>
-              <w:spacing w:before="0" w:after="0"/>
-            </w:pPr>
-            <w:r>
-              <w:rPr>
-                <w:rFonts w:ascii="Calibri" w:hAnsi="Calibri"/>
-                <w:color w:val="1E293B"/>
-                <w:sz w:val="17"/>
-              </w:rPr>
-              <w:t>Date: ___/___/2026</w:t>
-            </w:r>
-          </w:p>
-        </w:tc>
-      </w:tr>
-      <w:tr>
-        <w:tc>
-          <w:tcPr>
-            <w:tcW w:type="dxa" w:w="3360"/>
-            <w:tcMar>
-              <w:top w:w="22" w:type="dxa"/>
-              <w:bottom w:w="22" w:type="dxa"/>
-              <w:left w:w="15" w:type="dxa"/>
-              <w:right w:w="15" w:type="dxa"/>
-            </w:tcMar>
-            <w:tcBorders>
-              <w:top w:val="single" w:sz="4" w:space="0" w:color="CBD5E1"/>
-              <w:bottom w:val="single" w:sz="4" w:space="0" w:color="CBD5E1"/>
-              <w:left w:val="single" w:sz="4" w:space="0" w:color="CBD5E1"/>
-              <w:right w:val="single" w:sz="4" w:space="0" w:color="CBD5E1"/>
-            </w:tcBorders>
-          </w:tcPr>
-          <w:p>
-            <w:pPr>
-              <w:spacing w:before="0" w:after="0"/>
-            </w:pPr>
-            <w:r>
-              <w:rPr>
-                <w:rFonts w:ascii="Calibri" w:hAnsi="Calibri"/>
-                <w:b/>
-                <w:color w:val="1B365D"/>
-                <w:sz w:val="17"/>
-              </w:rPr>
-              <w:t>External Examiner:</w:t>
-            </w:r>
-          </w:p>
-        </w:tc>
-        <w:tc>
-          <w:tcPr>
-            <w:tcW w:type="dxa" w:w="3360"/>
-            <w:tcMar>
-              <w:top w:w="22" w:type="dxa"/>
-              <w:bottom w:w="22" w:type="dxa"/>
-              <w:left w:w="15" w:type="dxa"/>
-              <w:right w:w="15" w:type="dxa"/>
-            </w:tcMar>
-            <w:tcBorders>
-              <w:top w:val="single" w:sz="4" w:space="0" w:color="CBD5E1"/>
-              <w:bottom w:val="single" w:sz="4" w:space="0" w:color="CBD5E1"/>
-              <w:left w:val="single" w:sz="4" w:space="0" w:color="CBD5E1"/>
-              <w:right w:val="single" w:sz="4" w:space="0" w:color="CBD5E1"/>
-            </w:tcBorders>
-          </w:tcPr>
-          <w:p>
-            <w:pPr>
-              <w:spacing w:before="0" w:after="0"/>
-            </w:pPr>
-            <w:r>
-              <w:rPr>
-                <w:rFonts w:ascii="Calibri" w:hAnsi="Calibri"/>
-                <w:color w:val="1E293B"/>
-                <w:sz w:val="17"/>
-              </w:rPr>
-              <w:t>Signature: __________________</w:t>
-            </w:r>
-          </w:p>
-        </w:tc>
-        <w:tc>
-          <w:tcPr>
-            <w:tcW w:type="dxa" w:w="3360"/>
-            <w:tcMar>
-              <w:top w:w="22" w:type="dxa"/>
-              <w:bottom w:w="22" w:type="dxa"/>
-              <w:left w:w="15" w:type="dxa"/>
-              <w:right w:w="15" w:type="dxa"/>
-            </w:tcMar>
-            <w:tcBorders>
-              <w:top w:val="single" w:sz="4" w:space="0" w:color="CBD5E1"/>
-              <w:bottom w:val="single" w:sz="4" w:space="0" w:color="CBD5E1"/>
-              <w:left w:val="single" w:sz="4" w:space="0" w:color="CBD5E1"/>
-              <w:right w:val="single" w:sz="4" w:space="0" w:color="CBD5E1"/>
-            </w:tcBorders>
-          </w:tcPr>
-          <w:p>
-            <w:pPr>
-              <w:spacing w:before="0" w:after="0"/>
-            </w:pPr>
-            <w:r>
-              <w:rPr>
-                <w:rFonts w:ascii="Calibri" w:hAnsi="Calibri"/>
-                <w:color w:val="1E293B"/>
-                <w:sz w:val="17"/>
-              </w:rPr>
-              <w:t>Date: ___/___/2026</w:t>
-            </w:r>
-          </w:p>
-        </w:tc>
-      </w:tr>
-      <w:tr>
-        <w:tc>
-          <w:tcPr>
-            <w:tcW w:type="dxa" w:w="3360"/>
-            <w:tcMar>
-              <w:top w:w="22" w:type="dxa"/>
-              <w:bottom w:w="22" w:type="dxa"/>
-              <w:left w:w="15" w:type="dxa"/>
-              <w:right w:w="15" w:type="dxa"/>
-            </w:tcMar>
-            <w:tcBorders>
-              <w:top w:val="single" w:sz="4" w:space="0" w:color="CBD5E1"/>
-              <w:bottom w:val="single" w:sz="4" w:space="0" w:color="CBD5E1"/>
-              <w:left w:val="single" w:sz="4" w:space="0" w:color="CBD5E1"/>
-              <w:right w:val="single" w:sz="4" w:space="0" w:color="CBD5E1"/>
-            </w:tcBorders>
-          </w:tcPr>
-          <w:p>
-            <w:pPr>
-              <w:spacing w:before="0" w:after="0"/>
-            </w:pPr>
-            <w:r>
-              <w:rPr>
-                <w:rFonts w:ascii="Calibri" w:hAnsi="Calibri"/>
-                <w:b/>
-                <w:color w:val="1B365D"/>
-                <w:sz w:val="17"/>
-              </w:rPr>
-              <w:t>Course Coordinator:</w:t>
-            </w:r>
-          </w:p>
-        </w:tc>
-        <w:tc>
-          <w:tcPr>
-            <w:tcW w:type="dxa" w:w="3360"/>
-            <w:tcMar>
-              <w:top w:w="22" w:type="dxa"/>
-              <w:bottom w:w="22" w:type="dxa"/>
-              <w:left w:w="15" w:type="dxa"/>
-              <w:right w:w="15" w:type="dxa"/>
-            </w:tcMar>
-            <w:tcBorders>
-              <w:top w:val="single" w:sz="4" w:space="0" w:color="CBD5E1"/>
-              <w:bottom w:val="single" w:sz="4" w:space="0" w:color="CBD5E1"/>
-              <w:left w:val="single" w:sz="4" w:space="0" w:color="CBD5E1"/>
-              <w:right w:val="single" w:sz="4" w:space="0" w:color="CBD5E1"/>
-            </w:tcBorders>
-          </w:tcPr>
-          <w:p>
-            <w:pPr>
-              <w:spacing w:before="0" w:after="0"/>
-            </w:pPr>
-            <w:r>
-              <w:rPr>
-                <w:rFonts w:ascii="Calibri" w:hAnsi="Calibri"/>
-                <w:color w:val="1E293B"/>
-                <w:sz w:val="17"/>
-              </w:rPr>
-              <w:t>Signature: __________________</w:t>
-            </w:r>
-          </w:p>
-        </w:tc>
-        <w:tc>
-          <w:tcPr>
-            <w:tcW w:type="dxa" w:w="3360"/>
-            <w:tcMar>
-              <w:top w:w="22" w:type="dxa"/>
-              <w:bottom w:w="22" w:type="dxa"/>
-              <w:left w:w="15" w:type="dxa"/>
-              <w:right w:w="15" w:type="dxa"/>
-            </w:tcMar>
-            <w:tcBorders>
-              <w:top w:val="single" w:sz="4" w:space="0" w:color="CBD5E1"/>
-              <w:bottom w:val="single" w:sz="4" w:space="0" w:color="CBD5E1"/>
-              <w:left w:val="single" w:sz="4" w:space="0" w:color="CBD5E1"/>
-              <w:right w:val="single" w:sz="4" w:space="0" w:color="CBD5E1"/>
-            </w:tcBorders>
-          </w:tcPr>
-          <w:p>
-            <w:pPr>
-              <w:spacing w:before="0" w:after="0"/>
-            </w:pPr>
-            <w:r>
-              <w:rPr>
-                <w:rFonts w:ascii="Calibri" w:hAnsi="Calibri"/>
-                <w:color w:val="1E293B"/>
-                <w:sz w:val="17"/>
-              </w:rPr>
-              <w:t>Assessment: [ PASS / EXCELLENT ]</w:t>
-            </w:r>
-          </w:p>
-        </w:tc>
-      </w:tr>
-    </w:tbl>
-    <w:p>
-      <w:pPr>
-        <w:spacing w:before="80" w:after="0"/>
-      </w:pPr>
-      <w:r>
-        <w:rPr>
-          <w:rFonts w:ascii="Calibri" w:hAnsi="Calibri"/>
-          <w:b/>
-          <w:color w:val="2B4C7E"/>
-          <w:sz w:val="17"/>
-        </w:rPr>
-        <w:t>Final Grade Awarded: [  A+ / 100%  ]    |    Evaluator Seal &amp; Verification Stamp: __________________________________</w:t>
-      </w:r>
+        <w:spacing w:before="0" w:after="0"/>
+      </w:pPr>
     </w:p>
     <w:p>
       <w:r>
@@ -5270,7 +4211,7 @@
         <w:tabs>
           <w:tab w:pos="10080" w:val="right" w:leader="dot"/>
         </w:tabs>
-        <w:spacing w:before="30" w:after="30" w:line="252" w:lineRule="auto"/>
+        <w:spacing w:before="10" w:after="10" w:line="252" w:lineRule="auto"/>
       </w:pPr>
       <w:r>
         <w:rPr>
@@ -5298,7 +4239,7 @@
         <w:tabs>
           <w:tab w:pos="10080" w:val="right" w:leader="dot"/>
         </w:tabs>
-        <w:spacing w:before="30" w:after="30" w:line="252" w:lineRule="auto"/>
+        <w:spacing w:before="10" w:after="10" w:line="252" w:lineRule="auto"/>
       </w:pPr>
       <w:r>
         <w:rPr>
@@ -5326,7 +4267,7 @@
         <w:tabs>
           <w:tab w:pos="10080" w:val="right" w:leader="dot"/>
         </w:tabs>
-        <w:spacing w:before="30" w:after="30" w:line="252" w:lineRule="auto"/>
+        <w:spacing w:before="10" w:after="10" w:line="252" w:lineRule="auto"/>
       </w:pPr>
       <w:r>
         <w:rPr>
@@ -5354,7 +4295,7 @@
         <w:tabs>
           <w:tab w:pos="10080" w:val="right" w:leader="dot"/>
         </w:tabs>
-        <w:spacing w:before="30" w:after="30" w:line="252" w:lineRule="auto"/>
+        <w:spacing w:before="10" w:after="10" w:line="252" w:lineRule="auto"/>
       </w:pPr>
       <w:r>
         <w:rPr>
@@ -5382,7 +4323,7 @@
         <w:tabs>
           <w:tab w:pos="10080" w:val="right" w:leader="dot"/>
         </w:tabs>
-        <w:spacing w:before="30" w:after="30" w:line="252" w:lineRule="auto"/>
+        <w:spacing w:before="10" w:after="10" w:line="252" w:lineRule="auto"/>
       </w:pPr>
       <w:r>
         <w:rPr>
@@ -5410,7 +4351,7 @@
         <w:tabs>
           <w:tab w:pos="10080" w:val="right" w:leader="dot"/>
         </w:tabs>
-        <w:spacing w:before="30" w:after="30" w:line="252" w:lineRule="auto"/>
+        <w:spacing w:before="10" w:after="10" w:line="252" w:lineRule="auto"/>
       </w:pPr>
       <w:r>
         <w:rPr>
@@ -5438,7 +4379,7 @@
         <w:tabs>
           <w:tab w:pos="10080" w:val="right" w:leader="dot"/>
         </w:tabs>
-        <w:spacing w:before="30" w:after="30" w:line="252" w:lineRule="auto"/>
+        <w:spacing w:before="10" w:after="10" w:line="252" w:lineRule="auto"/>
       </w:pPr>
       <w:r>
         <w:rPr>
@@ -5466,7 +4407,7 @@
         <w:tabs>
           <w:tab w:pos="10080" w:val="right" w:leader="dot"/>
         </w:tabs>
-        <w:spacing w:before="30" w:after="30" w:line="252" w:lineRule="auto"/>
+        <w:spacing w:before="10" w:after="10" w:line="252" w:lineRule="auto"/>
       </w:pPr>
       <w:r>
         <w:rPr>
@@ -5494,7 +4435,7 @@
         <w:tabs>
           <w:tab w:pos="10080" w:val="right" w:leader="dot"/>
         </w:tabs>
-        <w:spacing w:before="30" w:after="30" w:line="252" w:lineRule="auto"/>
+        <w:spacing w:before="10" w:after="10" w:line="252" w:lineRule="auto"/>
       </w:pPr>
       <w:r>
         <w:rPr>
@@ -5522,7 +4463,7 @@
         <w:tabs>
           <w:tab w:pos="10080" w:val="right" w:leader="dot"/>
         </w:tabs>
-        <w:spacing w:before="30" w:after="30" w:line="252" w:lineRule="auto"/>
+        <w:spacing w:before="10" w:after="10" w:line="252" w:lineRule="auto"/>
       </w:pPr>
       <w:r>
         <w:rPr>
@@ -5550,7 +4491,7 @@
         <w:tabs>
           <w:tab w:pos="10080" w:val="right" w:leader="dot"/>
         </w:tabs>
-        <w:spacing w:before="30" w:after="30" w:line="252" w:lineRule="auto"/>
+        <w:spacing w:before="10" w:after="10" w:line="252" w:lineRule="auto"/>
       </w:pPr>
       <w:r>
         <w:rPr>
@@ -5578,7 +4519,7 @@
         <w:tabs>
           <w:tab w:pos="10080" w:val="right" w:leader="dot"/>
         </w:tabs>
-        <w:spacing w:before="30" w:after="30" w:line="252" w:lineRule="auto"/>
+        <w:spacing w:before="10" w:after="10" w:line="252" w:lineRule="auto"/>
       </w:pPr>
       <w:r>
         <w:rPr>
@@ -5606,7 +4547,7 @@
         <w:tabs>
           <w:tab w:pos="10080" w:val="right" w:leader="dot"/>
         </w:tabs>
-        <w:spacing w:before="30" w:after="30" w:line="252" w:lineRule="auto"/>
+        <w:spacing w:before="10" w:after="10" w:line="252" w:lineRule="auto"/>
       </w:pPr>
       <w:r>
         <w:rPr>
@@ -5634,7 +4575,7 @@
         <w:tabs>
           <w:tab w:pos="10080" w:val="right" w:leader="dot"/>
         </w:tabs>
-        <w:spacing w:before="30" w:after="30" w:line="252" w:lineRule="auto"/>
+        <w:spacing w:before="10" w:after="10" w:line="252" w:lineRule="auto"/>
       </w:pPr>
       <w:r>
         <w:rPr>
@@ -5662,7 +4603,7 @@
         <w:tabs>
           <w:tab w:pos="10080" w:val="right" w:leader="dot"/>
         </w:tabs>
-        <w:spacing w:before="30" w:after="30" w:line="252" w:lineRule="auto"/>
+        <w:spacing w:before="10" w:after="10" w:line="252" w:lineRule="auto"/>
       </w:pPr>
       <w:r>
         <w:rPr>
@@ -5705,7 +4646,7 @@
         <w:tabs>
           <w:tab w:pos="10080" w:val="right" w:leader="dot"/>
         </w:tabs>
-        <w:spacing w:before="30" w:after="30" w:line="252" w:lineRule="auto"/>
+        <w:spacing w:before="10" w:after="10" w:line="252" w:lineRule="auto"/>
       </w:pPr>
       <w:r>
         <w:rPr>
@@ -5733,7 +4674,7 @@
         <w:tabs>
           <w:tab w:pos="10080" w:val="right" w:leader="dot"/>
         </w:tabs>
-        <w:spacing w:before="30" w:after="30" w:line="252" w:lineRule="auto"/>
+        <w:spacing w:before="10" w:after="10" w:line="252" w:lineRule="auto"/>
       </w:pPr>
       <w:r>
         <w:rPr>
@@ -5761,7 +4702,7 @@
         <w:tabs>
           <w:tab w:pos="10080" w:val="right" w:leader="dot"/>
         </w:tabs>
-        <w:spacing w:before="30" w:after="30" w:line="252" w:lineRule="auto"/>
+        <w:spacing w:before="10" w:after="10" w:line="252" w:lineRule="auto"/>
       </w:pPr>
       <w:r>
         <w:rPr>
@@ -5789,7 +4730,7 @@
         <w:tabs>
           <w:tab w:pos="10080" w:val="right" w:leader="dot"/>
         </w:tabs>
-        <w:spacing w:before="30" w:after="30" w:line="252" w:lineRule="auto"/>
+        <w:spacing w:before="10" w:after="10" w:line="252" w:lineRule="auto"/>
       </w:pPr>
       <w:r>
         <w:rPr>
@@ -5817,7 +4758,7 @@
         <w:tabs>
           <w:tab w:pos="10080" w:val="right" w:leader="dot"/>
         </w:tabs>
-        <w:spacing w:before="30" w:after="30" w:line="252" w:lineRule="auto"/>
+        <w:spacing w:before="10" w:after="10" w:line="252" w:lineRule="auto"/>
       </w:pPr>
       <w:r>
         <w:rPr>
@@ -5875,8 +4816,8 @@
           <w:tcPr>
             <w:tcW w:type="dxa" w:w="1440"/>
             <w:tcMar>
-              <w:top w:w="28" w:type="dxa"/>
-              <w:bottom w:w="28" w:type="dxa"/>
+              <w:top w:w="24" w:type="dxa"/>
+              <w:bottom w:w="24" w:type="dxa"/>
               <w:left w:w="35" w:type="dxa"/>
               <w:right w:w="35" w:type="dxa"/>
             </w:tcMar>
@@ -5907,8 +4848,8 @@
           <w:tcPr>
             <w:tcW w:type="dxa" w:w="3168"/>
             <w:tcMar>
-              <w:top w:w="28" w:type="dxa"/>
-              <w:bottom w:w="28" w:type="dxa"/>
+              <w:top w:w="24" w:type="dxa"/>
+              <w:bottom w:w="24" w:type="dxa"/>
               <w:left w:w="35" w:type="dxa"/>
               <w:right w:w="35" w:type="dxa"/>
             </w:tcMar>
@@ -5939,8 +4880,8 @@
           <w:tcPr>
             <w:tcW w:type="dxa" w:w="5472"/>
             <w:tcMar>
-              <w:top w:w="28" w:type="dxa"/>
-              <w:bottom w:w="28" w:type="dxa"/>
+              <w:top w:w="24" w:type="dxa"/>
+              <w:bottom w:w="24" w:type="dxa"/>
               <w:left w:w="35" w:type="dxa"/>
               <w:right w:w="35" w:type="dxa"/>
             </w:tcMar>
@@ -5973,8 +4914,8 @@
           <w:tcPr>
             <w:tcW w:type="dxa" w:w="1440"/>
             <w:tcMar>
-              <w:top w:w="24" w:type="dxa"/>
-              <w:bottom w:w="24" w:type="dxa"/>
+              <w:top w:w="20" w:type="dxa"/>
+              <w:bottom w:w="20" w:type="dxa"/>
               <w:left w:w="35" w:type="dxa"/>
               <w:right w:w="35" w:type="dxa"/>
             </w:tcMar>
@@ -6005,8 +4946,8 @@
           <w:tcPr>
             <w:tcW w:type="dxa" w:w="3168"/>
             <w:tcMar>
-              <w:top w:w="24" w:type="dxa"/>
-              <w:bottom w:w="24" w:type="dxa"/>
+              <w:top w:w="20" w:type="dxa"/>
+              <w:bottom w:w="20" w:type="dxa"/>
               <w:left w:w="35" w:type="dxa"/>
               <w:right w:w="35" w:type="dxa"/>
             </w:tcMar>
@@ -6036,8 +4977,8 @@
           <w:tcPr>
             <w:tcW w:type="dxa" w:w="5472"/>
             <w:tcMar>
-              <w:top w:w="24" w:type="dxa"/>
-              <w:bottom w:w="24" w:type="dxa"/>
+              <w:top w:w="20" w:type="dxa"/>
+              <w:bottom w:w="20" w:type="dxa"/>
               <w:left w:w="35" w:type="dxa"/>
               <w:right w:w="35" w:type="dxa"/>
             </w:tcMar>
@@ -6069,8 +5010,8 @@
           <w:tcPr>
             <w:tcW w:type="dxa" w:w="1440"/>
             <w:tcMar>
-              <w:top w:w="24" w:type="dxa"/>
-              <w:bottom w:w="24" w:type="dxa"/>
+              <w:top w:w="20" w:type="dxa"/>
+              <w:bottom w:w="20" w:type="dxa"/>
               <w:left w:w="35" w:type="dxa"/>
               <w:right w:w="35" w:type="dxa"/>
             </w:tcMar>
@@ -6101,8 +5042,8 @@
           <w:tcPr>
             <w:tcW w:type="dxa" w:w="3168"/>
             <w:tcMar>
-              <w:top w:w="24" w:type="dxa"/>
-              <w:bottom w:w="24" w:type="dxa"/>
+              <w:top w:w="20" w:type="dxa"/>
+              <w:bottom w:w="20" w:type="dxa"/>
               <w:left w:w="35" w:type="dxa"/>
               <w:right w:w="35" w:type="dxa"/>
             </w:tcMar>
@@ -6132,8 +5073,8 @@
           <w:tcPr>
             <w:tcW w:type="dxa" w:w="5472"/>
             <w:tcMar>
-              <w:top w:w="24" w:type="dxa"/>
-              <w:bottom w:w="24" w:type="dxa"/>
+              <w:top w:w="20" w:type="dxa"/>
+              <w:bottom w:w="20" w:type="dxa"/>
               <w:left w:w="35" w:type="dxa"/>
               <w:right w:w="35" w:type="dxa"/>
             </w:tcMar>
@@ -6165,8 +5106,8 @@
           <w:tcPr>
             <w:tcW w:type="dxa" w:w="1440"/>
             <w:tcMar>
-              <w:top w:w="24" w:type="dxa"/>
-              <w:bottom w:w="24" w:type="dxa"/>
+              <w:top w:w="20" w:type="dxa"/>
+              <w:bottom w:w="20" w:type="dxa"/>
               <w:left w:w="35" w:type="dxa"/>
               <w:right w:w="35" w:type="dxa"/>
             </w:tcMar>
@@ -6197,8 +5138,8 @@
           <w:tcPr>
             <w:tcW w:type="dxa" w:w="3168"/>
             <w:tcMar>
-              <w:top w:w="24" w:type="dxa"/>
-              <w:bottom w:w="24" w:type="dxa"/>
+              <w:top w:w="20" w:type="dxa"/>
+              <w:bottom w:w="20" w:type="dxa"/>
               <w:left w:w="35" w:type="dxa"/>
               <w:right w:w="35" w:type="dxa"/>
             </w:tcMar>
@@ -6228,8 +5169,8 @@
           <w:tcPr>
             <w:tcW w:type="dxa" w:w="5472"/>
             <w:tcMar>
-              <w:top w:w="24" w:type="dxa"/>
-              <w:bottom w:w="24" w:type="dxa"/>
+              <w:top w:w="20" w:type="dxa"/>
+              <w:bottom w:w="20" w:type="dxa"/>
               <w:left w:w="35" w:type="dxa"/>
               <w:right w:w="35" w:type="dxa"/>
             </w:tcMar>
@@ -6261,8 +5202,8 @@
           <w:tcPr>
             <w:tcW w:type="dxa" w:w="1440"/>
             <w:tcMar>
-              <w:top w:w="24" w:type="dxa"/>
-              <w:bottom w:w="24" w:type="dxa"/>
+              <w:top w:w="20" w:type="dxa"/>
+              <w:bottom w:w="20" w:type="dxa"/>
               <w:left w:w="35" w:type="dxa"/>
               <w:right w:w="35" w:type="dxa"/>
             </w:tcMar>
@@ -6293,8 +5234,8 @@
           <w:tcPr>
             <w:tcW w:type="dxa" w:w="3168"/>
             <w:tcMar>
-              <w:top w:w="24" w:type="dxa"/>
-              <w:bottom w:w="24" w:type="dxa"/>
+              <w:top w:w="20" w:type="dxa"/>
+              <w:bottom w:w="20" w:type="dxa"/>
               <w:left w:w="35" w:type="dxa"/>
               <w:right w:w="35" w:type="dxa"/>
             </w:tcMar>
@@ -6324,8 +5265,8 @@
           <w:tcPr>
             <w:tcW w:type="dxa" w:w="5472"/>
             <w:tcMar>
-              <w:top w:w="24" w:type="dxa"/>
-              <w:bottom w:w="24" w:type="dxa"/>
+              <w:top w:w="20" w:type="dxa"/>
+              <w:bottom w:w="20" w:type="dxa"/>
               <w:left w:w="35" w:type="dxa"/>
               <w:right w:w="35" w:type="dxa"/>
             </w:tcMar>
@@ -6357,8 +5298,8 @@
           <w:tcPr>
             <w:tcW w:type="dxa" w:w="1440"/>
             <w:tcMar>
-              <w:top w:w="24" w:type="dxa"/>
-              <w:bottom w:w="24" w:type="dxa"/>
+              <w:top w:w="20" w:type="dxa"/>
+              <w:bottom w:w="20" w:type="dxa"/>
               <w:left w:w="35" w:type="dxa"/>
               <w:right w:w="35" w:type="dxa"/>
             </w:tcMar>
@@ -6389,8 +5330,8 @@
           <w:tcPr>
             <w:tcW w:type="dxa" w:w="3168"/>
             <w:tcMar>
-              <w:top w:w="24" w:type="dxa"/>
-              <w:bottom w:w="24" w:type="dxa"/>
+              <w:top w:w="20" w:type="dxa"/>
+              <w:bottom w:w="20" w:type="dxa"/>
               <w:left w:w="35" w:type="dxa"/>
               <w:right w:w="35" w:type="dxa"/>
             </w:tcMar>
@@ -6420,8 +5361,8 @@
           <w:tcPr>
             <w:tcW w:type="dxa" w:w="5472"/>
             <w:tcMar>
-              <w:top w:w="24" w:type="dxa"/>
-              <w:bottom w:w="24" w:type="dxa"/>
+              <w:top w:w="20" w:type="dxa"/>
+              <w:bottom w:w="20" w:type="dxa"/>
               <w:left w:w="35" w:type="dxa"/>
               <w:right w:w="35" w:type="dxa"/>
             </w:tcMar>
@@ -6453,8 +5394,8 @@
           <w:tcPr>
             <w:tcW w:type="dxa" w:w="1440"/>
             <w:tcMar>
-              <w:top w:w="24" w:type="dxa"/>
-              <w:bottom w:w="24" w:type="dxa"/>
+              <w:top w:w="20" w:type="dxa"/>
+              <w:bottom w:w="20" w:type="dxa"/>
               <w:left w:w="35" w:type="dxa"/>
               <w:right w:w="35" w:type="dxa"/>
             </w:tcMar>
@@ -6485,8 +5426,8 @@
           <w:tcPr>
             <w:tcW w:type="dxa" w:w="3168"/>
             <w:tcMar>
-              <w:top w:w="24" w:type="dxa"/>
-              <w:bottom w:w="24" w:type="dxa"/>
+              <w:top w:w="20" w:type="dxa"/>
+              <w:bottom w:w="20" w:type="dxa"/>
               <w:left w:w="35" w:type="dxa"/>
               <w:right w:w="35" w:type="dxa"/>
             </w:tcMar>
@@ -6516,8 +5457,8 @@
           <w:tcPr>
             <w:tcW w:type="dxa" w:w="5472"/>
             <w:tcMar>
-              <w:top w:w="24" w:type="dxa"/>
-              <w:bottom w:w="24" w:type="dxa"/>
+              <w:top w:w="20" w:type="dxa"/>
+              <w:bottom w:w="20" w:type="dxa"/>
               <w:left w:w="35" w:type="dxa"/>
               <w:right w:w="35" w:type="dxa"/>
             </w:tcMar>
@@ -6549,8 +5490,8 @@
           <w:tcPr>
             <w:tcW w:type="dxa" w:w="1440"/>
             <w:tcMar>
-              <w:top w:w="24" w:type="dxa"/>
-              <w:bottom w:w="24" w:type="dxa"/>
+              <w:top w:w="20" w:type="dxa"/>
+              <w:bottom w:w="20" w:type="dxa"/>
               <w:left w:w="35" w:type="dxa"/>
               <w:right w:w="35" w:type="dxa"/>
             </w:tcMar>
@@ -6581,8 +5522,8 @@
           <w:tcPr>
             <w:tcW w:type="dxa" w:w="3168"/>
             <w:tcMar>
-              <w:top w:w="24" w:type="dxa"/>
-              <w:bottom w:w="24" w:type="dxa"/>
+              <w:top w:w="20" w:type="dxa"/>
+              <w:bottom w:w="20" w:type="dxa"/>
               <w:left w:w="35" w:type="dxa"/>
               <w:right w:w="35" w:type="dxa"/>
             </w:tcMar>
@@ -6612,8 +5553,8 @@
           <w:tcPr>
             <w:tcW w:type="dxa" w:w="5472"/>
             <w:tcMar>
-              <w:top w:w="24" w:type="dxa"/>
-              <w:bottom w:w="24" w:type="dxa"/>
+              <w:top w:w="20" w:type="dxa"/>
+              <w:bottom w:w="20" w:type="dxa"/>
               <w:left w:w="35" w:type="dxa"/>
               <w:right w:w="35" w:type="dxa"/>
             </w:tcMar>
@@ -6645,8 +5586,8 @@
           <w:tcPr>
             <w:tcW w:type="dxa" w:w="1440"/>
             <w:tcMar>
-              <w:top w:w="24" w:type="dxa"/>
-              <w:bottom w:w="24" w:type="dxa"/>
+              <w:top w:w="20" w:type="dxa"/>
+              <w:bottom w:w="20" w:type="dxa"/>
               <w:left w:w="35" w:type="dxa"/>
               <w:right w:w="35" w:type="dxa"/>
             </w:tcMar>
@@ -6677,8 +5618,8 @@
           <w:tcPr>
             <w:tcW w:type="dxa" w:w="3168"/>
             <w:tcMar>
-              <w:top w:w="24" w:type="dxa"/>
-              <w:bottom w:w="24" w:type="dxa"/>
+              <w:top w:w="20" w:type="dxa"/>
+              <w:bottom w:w="20" w:type="dxa"/>
               <w:left w:w="35" w:type="dxa"/>
               <w:right w:w="35" w:type="dxa"/>
             </w:tcMar>
@@ -6708,8 +5649,8 @@
           <w:tcPr>
             <w:tcW w:type="dxa" w:w="5472"/>
             <w:tcMar>
-              <w:top w:w="24" w:type="dxa"/>
-              <w:bottom w:w="24" w:type="dxa"/>
+              <w:top w:w="20" w:type="dxa"/>
+              <w:bottom w:w="20" w:type="dxa"/>
               <w:left w:w="35" w:type="dxa"/>
               <w:right w:w="35" w:type="dxa"/>
             </w:tcMar>
@@ -6741,8 +5682,8 @@
           <w:tcPr>
             <w:tcW w:type="dxa" w:w="1440"/>
             <w:tcMar>
-              <w:top w:w="24" w:type="dxa"/>
-              <w:bottom w:w="24" w:type="dxa"/>
+              <w:top w:w="20" w:type="dxa"/>
+              <w:bottom w:w="20" w:type="dxa"/>
               <w:left w:w="35" w:type="dxa"/>
               <w:right w:w="35" w:type="dxa"/>
             </w:tcMar>
@@ -6773,8 +5714,8 @@
           <w:tcPr>
             <w:tcW w:type="dxa" w:w="3168"/>
             <w:tcMar>
-              <w:top w:w="24" w:type="dxa"/>
-              <w:bottom w:w="24" w:type="dxa"/>
+              <w:top w:w="20" w:type="dxa"/>
+              <w:bottom w:w="20" w:type="dxa"/>
               <w:left w:w="35" w:type="dxa"/>
               <w:right w:w="35" w:type="dxa"/>
             </w:tcMar>
@@ -6804,8 +5745,8 @@
           <w:tcPr>
             <w:tcW w:type="dxa" w:w="5472"/>
             <w:tcMar>
-              <w:top w:w="24" w:type="dxa"/>
-              <w:bottom w:w="24" w:type="dxa"/>
+              <w:top w:w="20" w:type="dxa"/>
+              <w:bottom w:w="20" w:type="dxa"/>
               <w:left w:w="35" w:type="dxa"/>
               <w:right w:w="35" w:type="dxa"/>
             </w:tcMar>
@@ -6837,8 +5778,8 @@
           <w:tcPr>
             <w:tcW w:type="dxa" w:w="1440"/>
             <w:tcMar>
-              <w:top w:w="24" w:type="dxa"/>
-              <w:bottom w:w="24" w:type="dxa"/>
+              <w:top w:w="20" w:type="dxa"/>
+              <w:bottom w:w="20" w:type="dxa"/>
               <w:left w:w="35" w:type="dxa"/>
               <w:right w:w="35" w:type="dxa"/>
             </w:tcMar>
@@ -6869,8 +5810,8 @@
           <w:tcPr>
             <w:tcW w:type="dxa" w:w="3168"/>
             <w:tcMar>
-              <w:top w:w="24" w:type="dxa"/>
-              <w:bottom w:w="24" w:type="dxa"/>
+              <w:top w:w="20" w:type="dxa"/>
+              <w:bottom w:w="20" w:type="dxa"/>
               <w:left w:w="35" w:type="dxa"/>
               <w:right w:w="35" w:type="dxa"/>
             </w:tcMar>
@@ -6900,8 +5841,8 @@
           <w:tcPr>
             <w:tcW w:type="dxa" w:w="5472"/>
             <w:tcMar>
-              <w:top w:w="24" w:type="dxa"/>
-              <w:bottom w:w="24" w:type="dxa"/>
+              <w:top w:w="20" w:type="dxa"/>
+              <w:bottom w:w="20" w:type="dxa"/>
               <w:left w:w="35" w:type="dxa"/>
               <w:right w:w="35" w:type="dxa"/>
             </w:tcMar>
@@ -6933,8 +5874,8 @@
           <w:tcPr>
             <w:tcW w:type="dxa" w:w="1440"/>
             <w:tcMar>
-              <w:top w:w="24" w:type="dxa"/>
-              <w:bottom w:w="24" w:type="dxa"/>
+              <w:top w:w="20" w:type="dxa"/>
+              <w:bottom w:w="20" w:type="dxa"/>
               <w:left w:w="35" w:type="dxa"/>
               <w:right w:w="35" w:type="dxa"/>
             </w:tcMar>
@@ -6965,8 +5906,8 @@
           <w:tcPr>
             <w:tcW w:type="dxa" w:w="3168"/>
             <w:tcMar>
-              <w:top w:w="24" w:type="dxa"/>
-              <w:bottom w:w="24" w:type="dxa"/>
+              <w:top w:w="20" w:type="dxa"/>
+              <w:bottom w:w="20" w:type="dxa"/>
               <w:left w:w="35" w:type="dxa"/>
               <w:right w:w="35" w:type="dxa"/>
             </w:tcMar>
@@ -6996,8 +5937,8 @@
           <w:tcPr>
             <w:tcW w:type="dxa" w:w="5472"/>
             <w:tcMar>
-              <w:top w:w="24" w:type="dxa"/>
-              <w:bottom w:w="24" w:type="dxa"/>
+              <w:top w:w="20" w:type="dxa"/>
+              <w:bottom w:w="20" w:type="dxa"/>
               <w:left w:w="35" w:type="dxa"/>
               <w:right w:w="35" w:type="dxa"/>
             </w:tcMar>
@@ -7029,8 +5970,8 @@
           <w:tcPr>
             <w:tcW w:type="dxa" w:w="1440"/>
             <w:tcMar>
-              <w:top w:w="24" w:type="dxa"/>
-              <w:bottom w:w="24" w:type="dxa"/>
+              <w:top w:w="20" w:type="dxa"/>
+              <w:bottom w:w="20" w:type="dxa"/>
               <w:left w:w="35" w:type="dxa"/>
               <w:right w:w="35" w:type="dxa"/>
             </w:tcMar>
@@ -7061,8 +6002,8 @@
           <w:tcPr>
             <w:tcW w:type="dxa" w:w="3168"/>
             <w:tcMar>
-              <w:top w:w="24" w:type="dxa"/>
-              <w:bottom w:w="24" w:type="dxa"/>
+              <w:top w:w="20" w:type="dxa"/>
+              <w:bottom w:w="20" w:type="dxa"/>
               <w:left w:w="35" w:type="dxa"/>
               <w:right w:w="35" w:type="dxa"/>
             </w:tcMar>
@@ -7092,8 +6033,8 @@
           <w:tcPr>
             <w:tcW w:type="dxa" w:w="5472"/>
             <w:tcMar>
-              <w:top w:w="24" w:type="dxa"/>
-              <w:bottom w:w="24" w:type="dxa"/>
+              <w:top w:w="20" w:type="dxa"/>
+              <w:bottom w:w="20" w:type="dxa"/>
               <w:left w:w="35" w:type="dxa"/>
               <w:right w:w="35" w:type="dxa"/>
             </w:tcMar>
@@ -7125,8 +6066,8 @@
           <w:tcPr>
             <w:tcW w:type="dxa" w:w="1440"/>
             <w:tcMar>
-              <w:top w:w="24" w:type="dxa"/>
-              <w:bottom w:w="24" w:type="dxa"/>
+              <w:top w:w="20" w:type="dxa"/>
+              <w:bottom w:w="20" w:type="dxa"/>
               <w:left w:w="35" w:type="dxa"/>
               <w:right w:w="35" w:type="dxa"/>
             </w:tcMar>
@@ -7157,8 +6098,8 @@
           <w:tcPr>
             <w:tcW w:type="dxa" w:w="3168"/>
             <w:tcMar>
-              <w:top w:w="24" w:type="dxa"/>
-              <w:bottom w:w="24" w:type="dxa"/>
+              <w:top w:w="20" w:type="dxa"/>
+              <w:bottom w:w="20" w:type="dxa"/>
               <w:left w:w="35" w:type="dxa"/>
               <w:right w:w="35" w:type="dxa"/>
             </w:tcMar>
@@ -7188,8 +6129,8 @@
           <w:tcPr>
             <w:tcW w:type="dxa" w:w="5472"/>
             <w:tcMar>
-              <w:top w:w="24" w:type="dxa"/>
-              <w:bottom w:w="24" w:type="dxa"/>
+              <w:top w:w="20" w:type="dxa"/>
+              <w:bottom w:w="20" w:type="dxa"/>
               <w:left w:w="35" w:type="dxa"/>
               <w:right w:w="35" w:type="dxa"/>
             </w:tcMar>
@@ -7221,8 +6162,8 @@
           <w:tcPr>
             <w:tcW w:type="dxa" w:w="1440"/>
             <w:tcMar>
-              <w:top w:w="24" w:type="dxa"/>
-              <w:bottom w:w="24" w:type="dxa"/>
+              <w:top w:w="20" w:type="dxa"/>
+              <w:bottom w:w="20" w:type="dxa"/>
               <w:left w:w="35" w:type="dxa"/>
               <w:right w:w="35" w:type="dxa"/>
             </w:tcMar>
@@ -7253,8 +6194,8 @@
           <w:tcPr>
             <w:tcW w:type="dxa" w:w="3168"/>
             <w:tcMar>
-              <w:top w:w="24" w:type="dxa"/>
-              <w:bottom w:w="24" w:type="dxa"/>
+              <w:top w:w="20" w:type="dxa"/>
+              <w:bottom w:w="20" w:type="dxa"/>
               <w:left w:w="35" w:type="dxa"/>
               <w:right w:w="35" w:type="dxa"/>
             </w:tcMar>
@@ -7284,8 +6225,8 @@
           <w:tcPr>
             <w:tcW w:type="dxa" w:w="5472"/>
             <w:tcMar>
-              <w:top w:w="24" w:type="dxa"/>
-              <w:bottom w:w="24" w:type="dxa"/>
+              <w:top w:w="20" w:type="dxa"/>
+              <w:bottom w:w="20" w:type="dxa"/>
               <w:left w:w="35" w:type="dxa"/>
               <w:right w:w="35" w:type="dxa"/>
             </w:tcMar>
@@ -7317,8 +6258,8 @@
           <w:tcPr>
             <w:tcW w:type="dxa" w:w="1440"/>
             <w:tcMar>
-              <w:top w:w="24" w:type="dxa"/>
-              <w:bottom w:w="24" w:type="dxa"/>
+              <w:top w:w="20" w:type="dxa"/>
+              <w:bottom w:w="20" w:type="dxa"/>
               <w:left w:w="35" w:type="dxa"/>
               <w:right w:w="35" w:type="dxa"/>
             </w:tcMar>
@@ -7349,8 +6290,8 @@
           <w:tcPr>
             <w:tcW w:type="dxa" w:w="3168"/>
             <w:tcMar>
-              <w:top w:w="24" w:type="dxa"/>
-              <w:bottom w:w="24" w:type="dxa"/>
+              <w:top w:w="20" w:type="dxa"/>
+              <w:bottom w:w="20" w:type="dxa"/>
               <w:left w:w="35" w:type="dxa"/>
               <w:right w:w="35" w:type="dxa"/>
             </w:tcMar>
@@ -7380,8 +6321,8 @@
           <w:tcPr>
             <w:tcW w:type="dxa" w:w="5472"/>
             <w:tcMar>
-              <w:top w:w="24" w:type="dxa"/>
-              <w:bottom w:w="24" w:type="dxa"/>
+              <w:top w:w="20" w:type="dxa"/>
+              <w:bottom w:w="20" w:type="dxa"/>
               <w:left w:w="35" w:type="dxa"/>
               <w:right w:w="35" w:type="dxa"/>
             </w:tcMar>
@@ -7413,8 +6354,8 @@
           <w:tcPr>
             <w:tcW w:type="dxa" w:w="1440"/>
             <w:tcMar>
-              <w:top w:w="24" w:type="dxa"/>
-              <w:bottom w:w="24" w:type="dxa"/>
+              <w:top w:w="20" w:type="dxa"/>
+              <w:bottom w:w="20" w:type="dxa"/>
               <w:left w:w="35" w:type="dxa"/>
               <w:right w:w="35" w:type="dxa"/>
             </w:tcMar>
@@ -7445,8 +6386,8 @@
           <w:tcPr>
             <w:tcW w:type="dxa" w:w="3168"/>
             <w:tcMar>
-              <w:top w:w="24" w:type="dxa"/>
-              <w:bottom w:w="24" w:type="dxa"/>
+              <w:top w:w="20" w:type="dxa"/>
+              <w:bottom w:w="20" w:type="dxa"/>
               <w:left w:w="35" w:type="dxa"/>
               <w:right w:w="35" w:type="dxa"/>
             </w:tcMar>
@@ -7476,8 +6417,8 @@
           <w:tcPr>
             <w:tcW w:type="dxa" w:w="5472"/>
             <w:tcMar>
-              <w:top w:w="24" w:type="dxa"/>
-              <w:bottom w:w="24" w:type="dxa"/>
+              <w:top w:w="20" w:type="dxa"/>
+              <w:bottom w:w="20" w:type="dxa"/>
               <w:left w:w="35" w:type="dxa"/>
               <w:right w:w="35" w:type="dxa"/>
             </w:tcMar>
@@ -7509,8 +6450,8 @@
           <w:tcPr>
             <w:tcW w:type="dxa" w:w="1440"/>
             <w:tcMar>
-              <w:top w:w="24" w:type="dxa"/>
-              <w:bottom w:w="24" w:type="dxa"/>
+              <w:top w:w="20" w:type="dxa"/>
+              <w:bottom w:w="20" w:type="dxa"/>
               <w:left w:w="35" w:type="dxa"/>
               <w:right w:w="35" w:type="dxa"/>
             </w:tcMar>
@@ -7541,8 +6482,8 @@
           <w:tcPr>
             <w:tcW w:type="dxa" w:w="3168"/>
             <w:tcMar>
-              <w:top w:w="24" w:type="dxa"/>
-              <w:bottom w:w="24" w:type="dxa"/>
+              <w:top w:w="20" w:type="dxa"/>
+              <w:bottom w:w="20" w:type="dxa"/>
               <w:left w:w="35" w:type="dxa"/>
               <w:right w:w="35" w:type="dxa"/>
             </w:tcMar>
@@ -7572,8 +6513,8 @@
           <w:tcPr>
             <w:tcW w:type="dxa" w:w="5472"/>
             <w:tcMar>
-              <w:top w:w="24" w:type="dxa"/>
-              <w:bottom w:w="24" w:type="dxa"/>
+              <w:top w:w="20" w:type="dxa"/>
+              <w:bottom w:w="20" w:type="dxa"/>
               <w:left w:w="35" w:type="dxa"/>
               <w:right w:w="35" w:type="dxa"/>
             </w:tcMar>
@@ -7605,8 +6546,8 @@
           <w:tcPr>
             <w:tcW w:type="dxa" w:w="1440"/>
             <w:tcMar>
-              <w:top w:w="24" w:type="dxa"/>
-              <w:bottom w:w="24" w:type="dxa"/>
+              <w:top w:w="20" w:type="dxa"/>
+              <w:bottom w:w="20" w:type="dxa"/>
               <w:left w:w="35" w:type="dxa"/>
               <w:right w:w="35" w:type="dxa"/>
             </w:tcMar>
@@ -7637,8 +6578,8 @@
           <w:tcPr>
             <w:tcW w:type="dxa" w:w="3168"/>
             <w:tcMar>
-              <w:top w:w="24" w:type="dxa"/>
-              <w:bottom w:w="24" w:type="dxa"/>
+              <w:top w:w="20" w:type="dxa"/>
+              <w:bottom w:w="20" w:type="dxa"/>
               <w:left w:w="35" w:type="dxa"/>
               <w:right w:w="35" w:type="dxa"/>
             </w:tcMar>
@@ -7668,8 +6609,8 @@
           <w:tcPr>
             <w:tcW w:type="dxa" w:w="5472"/>
             <w:tcMar>
-              <w:top w:w="24" w:type="dxa"/>
-              <w:bottom w:w="24" w:type="dxa"/>
+              <w:top w:w="20" w:type="dxa"/>
+              <w:bottom w:w="20" w:type="dxa"/>
               <w:left w:w="35" w:type="dxa"/>
               <w:right w:w="35" w:type="dxa"/>
             </w:tcMar>
@@ -7701,8 +6642,8 @@
           <w:tcPr>
             <w:tcW w:type="dxa" w:w="1440"/>
             <w:tcMar>
-              <w:top w:w="24" w:type="dxa"/>
-              <w:bottom w:w="24" w:type="dxa"/>
+              <w:top w:w="20" w:type="dxa"/>
+              <w:bottom w:w="20" w:type="dxa"/>
               <w:left w:w="35" w:type="dxa"/>
               <w:right w:w="35" w:type="dxa"/>
             </w:tcMar>
@@ -7733,8 +6674,8 @@
           <w:tcPr>
             <w:tcW w:type="dxa" w:w="3168"/>
             <w:tcMar>
-              <w:top w:w="24" w:type="dxa"/>
-              <w:bottom w:w="24" w:type="dxa"/>
+              <w:top w:w="20" w:type="dxa"/>
+              <w:bottom w:w="20" w:type="dxa"/>
               <w:left w:w="35" w:type="dxa"/>
               <w:right w:w="35" w:type="dxa"/>
             </w:tcMar>
@@ -7764,8 +6705,8 @@
           <w:tcPr>
             <w:tcW w:type="dxa" w:w="5472"/>
             <w:tcMar>
-              <w:top w:w="24" w:type="dxa"/>
-              <w:bottom w:w="24" w:type="dxa"/>
+              <w:top w:w="20" w:type="dxa"/>
+              <w:bottom w:w="20" w:type="dxa"/>
               <w:left w:w="35" w:type="dxa"/>
               <w:right w:w="35" w:type="dxa"/>
             </w:tcMar>
@@ -13940,7 +12881,7 @@
         <w:tblLook w:firstColumn="1" w:firstRow="1" w:lastColumn="0" w:lastRow="0" w:noHBand="0" w:noVBand="1" w:val="04A0"/>
       </w:tblPr>
       <w:tblGrid>
-        <w:gridCol w:w="7776"/>
+        <w:gridCol w:w="7200"/>
       </w:tblGrid>
       <w:tr>
         <w:tc>
@@ -13968,7 +12909,7 @@
             <w:r>
               <w:drawing>
                 <wp:inline xmlns:a="http://schemas.openxmlformats.org/drawingml/2006/main" xmlns:pic="http://schemas.openxmlformats.org/drawingml/2006/picture">
-                  <wp:extent cx="4937760" cy="3072545"/>
+                  <wp:extent cx="4572000" cy="2844949"/>
                   <wp:docPr id="5" name="Picture 5"/>
                   <wp:cNvGraphicFramePr>
                     <a:graphicFrameLocks noChangeAspect="1"/>
@@ -13989,7 +12930,7 @@
                         <pic:spPr>
                           <a:xfrm>
                             <a:off x="0" y="0"/>
-                            <a:ext cx="4937760" cy="3072545"/>
+                            <a:ext cx="4572000" cy="2844949"/>
                           </a:xfrm>
                           <a:prstGeom prst="rect"/>
                         </pic:spPr>
@@ -14137,8 +13078,8 @@
           <w:tcPr>
             <w:tcW w:type="dxa" w:w="2160"/>
             <w:tcMar>
-              <w:top w:w="24" w:type="dxa"/>
-              <w:bottom w:w="24" w:type="dxa"/>
+              <w:top w:w="20" w:type="dxa"/>
+              <w:bottom w:w="20" w:type="dxa"/>
               <w:left w:w="35" w:type="dxa"/>
               <w:right w:w="35" w:type="dxa"/>
             </w:tcMar>
@@ -14169,8 +13110,8 @@
           <w:tcPr>
             <w:tcW w:type="dxa" w:w="2592"/>
             <w:tcMar>
-              <w:top w:w="24" w:type="dxa"/>
-              <w:bottom w:w="24" w:type="dxa"/>
+              <w:top w:w="20" w:type="dxa"/>
+              <w:bottom w:w="20" w:type="dxa"/>
               <w:left w:w="35" w:type="dxa"/>
               <w:right w:w="35" w:type="dxa"/>
             </w:tcMar>
@@ -14201,8 +13142,8 @@
           <w:tcPr>
             <w:tcW w:type="dxa" w:w="3024"/>
             <w:tcMar>
-              <w:top w:w="24" w:type="dxa"/>
-              <w:bottom w:w="24" w:type="dxa"/>
+              <w:top w:w="20" w:type="dxa"/>
+              <w:bottom w:w="20" w:type="dxa"/>
               <w:left w:w="35" w:type="dxa"/>
               <w:right w:w="35" w:type="dxa"/>
             </w:tcMar>
@@ -14233,8 +13174,8 @@
           <w:tcPr>
             <w:tcW w:type="dxa" w:w="2304"/>
             <w:tcMar>
-              <w:top w:w="24" w:type="dxa"/>
-              <w:bottom w:w="24" w:type="dxa"/>
+              <w:top w:w="20" w:type="dxa"/>
+              <w:bottom w:w="20" w:type="dxa"/>
               <w:left w:w="35" w:type="dxa"/>
               <w:right w:w="35" w:type="dxa"/>
             </w:tcMar>
@@ -14267,8 +13208,8 @@
           <w:tcPr>
             <w:tcW w:type="dxa" w:w="2160"/>
             <w:tcMar>
-              <w:top w:w="20" w:type="dxa"/>
-              <w:bottom w:w="20" w:type="dxa"/>
+              <w:top w:w="16" w:type="dxa"/>
+              <w:bottom w:w="16" w:type="dxa"/>
               <w:left w:w="35" w:type="dxa"/>
               <w:right w:w="35" w:type="dxa"/>
             </w:tcMar>
@@ -14299,8 +13240,8 @@
           <w:tcPr>
             <w:tcW w:type="dxa" w:w="2592"/>
             <w:tcMar>
-              <w:top w:w="20" w:type="dxa"/>
-              <w:bottom w:w="20" w:type="dxa"/>
+              <w:top w:w="16" w:type="dxa"/>
+              <w:bottom w:w="16" w:type="dxa"/>
               <w:left w:w="35" w:type="dxa"/>
               <w:right w:w="35" w:type="dxa"/>
             </w:tcMar>
@@ -14330,8 +13271,8 @@
           <w:tcPr>
             <w:tcW w:type="dxa" w:w="3024"/>
             <w:tcMar>
-              <w:top w:w="20" w:type="dxa"/>
-              <w:bottom w:w="20" w:type="dxa"/>
+              <w:top w:w="16" w:type="dxa"/>
+              <w:bottom w:w="16" w:type="dxa"/>
               <w:left w:w="35" w:type="dxa"/>
               <w:right w:w="35" w:type="dxa"/>
             </w:tcMar>
@@ -14361,8 +13302,8 @@
           <w:tcPr>
             <w:tcW w:type="dxa" w:w="2304"/>
             <w:tcMar>
-              <w:top w:w="20" w:type="dxa"/>
-              <w:bottom w:w="20" w:type="dxa"/>
+              <w:top w:w="16" w:type="dxa"/>
+              <w:bottom w:w="16" w:type="dxa"/>
               <w:left w:w="35" w:type="dxa"/>
               <w:right w:w="35" w:type="dxa"/>
             </w:tcMar>
@@ -14394,8 +13335,8 @@
           <w:tcPr>
             <w:tcW w:type="dxa" w:w="2160"/>
             <w:tcMar>
-              <w:top w:w="20" w:type="dxa"/>
-              <w:bottom w:w="20" w:type="dxa"/>
+              <w:top w:w="16" w:type="dxa"/>
+              <w:bottom w:w="16" w:type="dxa"/>
               <w:left w:w="35" w:type="dxa"/>
               <w:right w:w="35" w:type="dxa"/>
             </w:tcMar>
@@ -14426,8 +13367,8 @@
           <w:tcPr>
             <w:tcW w:type="dxa" w:w="2592"/>
             <w:tcMar>
-              <w:top w:w="20" w:type="dxa"/>
-              <w:bottom w:w="20" w:type="dxa"/>
+              <w:top w:w="16" w:type="dxa"/>
+              <w:bottom w:w="16" w:type="dxa"/>
               <w:left w:w="35" w:type="dxa"/>
               <w:right w:w="35" w:type="dxa"/>
             </w:tcMar>
@@ -14457,8 +13398,8 @@
           <w:tcPr>
             <w:tcW w:type="dxa" w:w="3024"/>
             <w:tcMar>
-              <w:top w:w="20" w:type="dxa"/>
-              <w:bottom w:w="20" w:type="dxa"/>
+              <w:top w:w="16" w:type="dxa"/>
+              <w:bottom w:w="16" w:type="dxa"/>
               <w:left w:w="35" w:type="dxa"/>
               <w:right w:w="35" w:type="dxa"/>
             </w:tcMar>
@@ -14488,8 +13429,8 @@
           <w:tcPr>
             <w:tcW w:type="dxa" w:w="2304"/>
             <w:tcMar>
-              <w:top w:w="20" w:type="dxa"/>
-              <w:bottom w:w="20" w:type="dxa"/>
+              <w:top w:w="16" w:type="dxa"/>
+              <w:bottom w:w="16" w:type="dxa"/>
               <w:left w:w="35" w:type="dxa"/>
               <w:right w:w="35" w:type="dxa"/>
             </w:tcMar>
@@ -14521,8 +13462,8 @@
           <w:tcPr>
             <w:tcW w:type="dxa" w:w="2160"/>
             <w:tcMar>
-              <w:top w:w="20" w:type="dxa"/>
-              <w:bottom w:w="20" w:type="dxa"/>
+              <w:top w:w="16" w:type="dxa"/>
+              <w:bottom w:w="16" w:type="dxa"/>
               <w:left w:w="35" w:type="dxa"/>
               <w:right w:w="35" w:type="dxa"/>
             </w:tcMar>
@@ -14553,8 +13494,8 @@
           <w:tcPr>
             <w:tcW w:type="dxa" w:w="2592"/>
             <w:tcMar>
-              <w:top w:w="20" w:type="dxa"/>
-              <w:bottom w:w="20" w:type="dxa"/>
+              <w:top w:w="16" w:type="dxa"/>
+              <w:bottom w:w="16" w:type="dxa"/>
               <w:left w:w="35" w:type="dxa"/>
               <w:right w:w="35" w:type="dxa"/>
             </w:tcMar>
@@ -14584,8 +13525,8 @@
           <w:tcPr>
             <w:tcW w:type="dxa" w:w="3024"/>
             <w:tcMar>
-              <w:top w:w="20" w:type="dxa"/>
-              <w:bottom w:w="20" w:type="dxa"/>
+              <w:top w:w="16" w:type="dxa"/>
+              <w:bottom w:w="16" w:type="dxa"/>
               <w:left w:w="35" w:type="dxa"/>
               <w:right w:w="35" w:type="dxa"/>
             </w:tcMar>
@@ -14615,8 +13556,8 @@
           <w:tcPr>
             <w:tcW w:type="dxa" w:w="2304"/>
             <w:tcMar>
-              <w:top w:w="20" w:type="dxa"/>
-              <w:bottom w:w="20" w:type="dxa"/>
+              <w:top w:w="16" w:type="dxa"/>
+              <w:bottom w:w="16" w:type="dxa"/>
               <w:left w:w="35" w:type="dxa"/>
               <w:right w:w="35" w:type="dxa"/>
             </w:tcMar>
@@ -29722,7 +28663,7 @@
           <w:color w:val="1E293B"/>
           <w:sz w:val="17"/>
         </w:rPr>
-        <w:t>[9] The PHP Group, "PHP Manual: Prepared Statements and Stored Procedures - PDO &amp; MySQLi," PHP Documentation Group, 2024. Available: https://www.php.net/manual/en/mysqli.quickstart.prepared-statements.php</w:t>
+        <w:t>[9] The PHP Group, "PHP Manual: Prepared Statements and Stored Procedures - MySQLi Extension," PHP Documentation Group, 2024. Available: https://www.php.net/manual/en/mysqli.quickstart.prepared-statements.php</w:t>
       </w:r>
     </w:p>
     <w:p>

</xml_diff>

<commit_message>
fix(csrf): default to Legitimate Same-Origin (localhost) and enforce strict token restriction
</commit_message>
<xml_diff>
--- a/SecureJobLab_Web_Application_Security_Report.docx
+++ b/SecureJobLab_Web_Application_Security_Report.docx
@@ -84,8 +84,8 @@
           <w:tcPr>
             <w:tcW w:type="dxa" w:w="5040"/>
             <w:tcMar>
-              <w:top w:w="34" w:type="dxa"/>
-              <w:bottom w:w="34" w:type="dxa"/>
+              <w:top w:w="36" w:type="dxa"/>
+              <w:bottom w:w="36" w:type="dxa"/>
               <w:left w:w="20" w:type="dxa"/>
               <w:right w:w="20" w:type="dxa"/>
             </w:tcMar>
@@ -116,8 +116,8 @@
           <w:tcPr>
             <w:tcW w:type="dxa" w:w="5040"/>
             <w:tcMar>
-              <w:top w:w="34" w:type="dxa"/>
-              <w:bottom w:w="34" w:type="dxa"/>
+              <w:top w:w="36" w:type="dxa"/>
+              <w:bottom w:w="36" w:type="dxa"/>
               <w:left w:w="20" w:type="dxa"/>
               <w:right w:w="20" w:type="dxa"/>
             </w:tcMar>
@@ -150,8 +150,8 @@
           <w:tcPr>
             <w:tcW w:type="dxa" w:w="5040"/>
             <w:tcMar>
-              <w:top w:w="34" w:type="dxa"/>
-              <w:bottom w:w="34" w:type="dxa"/>
+              <w:top w:w="36" w:type="dxa"/>
+              <w:bottom w:w="36" w:type="dxa"/>
               <w:left w:w="20" w:type="dxa"/>
               <w:right w:w="20" w:type="dxa"/>
             </w:tcMar>
@@ -182,8 +182,8 @@
           <w:tcPr>
             <w:tcW w:type="dxa" w:w="5040"/>
             <w:tcMar>
-              <w:top w:w="34" w:type="dxa"/>
-              <w:bottom w:w="34" w:type="dxa"/>
+              <w:top w:w="36" w:type="dxa"/>
+              <w:bottom w:w="36" w:type="dxa"/>
               <w:left w:w="20" w:type="dxa"/>
               <w:right w:w="20" w:type="dxa"/>
             </w:tcMar>
@@ -215,8 +215,8 @@
           <w:tcPr>
             <w:tcW w:type="dxa" w:w="5040"/>
             <w:tcMar>
-              <w:top w:w="34" w:type="dxa"/>
-              <w:bottom w:w="34" w:type="dxa"/>
+              <w:top w:w="36" w:type="dxa"/>
+              <w:bottom w:w="36" w:type="dxa"/>
               <w:left w:w="20" w:type="dxa"/>
               <w:right w:w="20" w:type="dxa"/>
             </w:tcMar>
@@ -247,8 +247,8 @@
           <w:tcPr>
             <w:tcW w:type="dxa" w:w="5040"/>
             <w:tcMar>
-              <w:top w:w="34" w:type="dxa"/>
-              <w:bottom w:w="34" w:type="dxa"/>
+              <w:top w:w="36" w:type="dxa"/>
+              <w:bottom w:w="36" w:type="dxa"/>
               <w:left w:w="20" w:type="dxa"/>
               <w:right w:w="20" w:type="dxa"/>
             </w:tcMar>
@@ -270,7 +270,7 @@
                 <w:color w:val="1E293B"/>
                 <w:sz w:val="19"/>
               </w:rPr>
-              <w:t>5 Core CWE Modules (CWE-89, CWE-79, CWE-78, CWE-22, CWE-1021)</w:t>
+              <w:t>Strictly 5 Core CWE Modules (CWE-89, CWE-79, CWE-78, CWE-22, CWE-1021)</w:t>
             </w:r>
           </w:p>
         </w:tc>
@@ -280,8 +280,8 @@
           <w:tcPr>
             <w:tcW w:type="dxa" w:w="5040"/>
             <w:tcMar>
-              <w:top w:w="34" w:type="dxa"/>
-              <w:bottom w:w="34" w:type="dxa"/>
+              <w:top w:w="36" w:type="dxa"/>
+              <w:bottom w:w="36" w:type="dxa"/>
               <w:left w:w="20" w:type="dxa"/>
               <w:right w:w="20" w:type="dxa"/>
             </w:tcMar>
@@ -312,8 +312,8 @@
           <w:tcPr>
             <w:tcW w:type="dxa" w:w="5040"/>
             <w:tcMar>
-              <w:top w:w="34" w:type="dxa"/>
-              <w:bottom w:w="34" w:type="dxa"/>
+              <w:top w:w="36" w:type="dxa"/>
+              <w:bottom w:w="36" w:type="dxa"/>
               <w:left w:w="20" w:type="dxa"/>
               <w:right w:w="20" w:type="dxa"/>
             </w:tcMar>
@@ -345,8 +345,8 @@
           <w:tcPr>
             <w:tcW w:type="dxa" w:w="5040"/>
             <w:tcMar>
-              <w:top w:w="34" w:type="dxa"/>
-              <w:bottom w:w="34" w:type="dxa"/>
+              <w:top w:w="36" w:type="dxa"/>
+              <w:bottom w:w="36" w:type="dxa"/>
               <w:left w:w="20" w:type="dxa"/>
               <w:right w:w="20" w:type="dxa"/>
             </w:tcMar>
@@ -369,7 +369,7 @@
                 <w:color w:val="1B365D"/>
                 <w:sz w:val="19"/>
               </w:rPr>
-              <w:t>Evaluation Environment:</w:t>
+              <w:t>Security Engine Model:</w:t>
             </w:r>
           </w:p>
         </w:tc>
@@ -377,8 +377,8 @@
           <w:tcPr>
             <w:tcW w:type="dxa" w:w="5040"/>
             <w:tcMar>
-              <w:top w:w="34" w:type="dxa"/>
-              <w:bottom w:w="34" w:type="dxa"/>
+              <w:top w:w="36" w:type="dxa"/>
+              <w:bottom w:w="36" w:type="dxa"/>
               <w:left w:w="20" w:type="dxa"/>
               <w:right w:w="20" w:type="dxa"/>
             </w:tcMar>
@@ -400,7 +400,7 @@
                 <w:color w:val="1E293B"/>
                 <w:sz w:val="19"/>
               </w:rPr>
-              <w:t>Isolated Localhost Sandbox (C:\xampp\htdocs\SecureWebLab)</w:t>
+              <w:t>Dual-Engine Comparative Architecture ($_SESSION['appsec_mode'])</w:t>
             </w:r>
           </w:p>
         </w:tc>
@@ -410,8 +410,8 @@
           <w:tcPr>
             <w:tcW w:type="dxa" w:w="5040"/>
             <w:tcMar>
-              <w:top w:w="34" w:type="dxa"/>
-              <w:bottom w:w="34" w:type="dxa"/>
+              <w:top w:w="36" w:type="dxa"/>
+              <w:bottom w:w="36" w:type="dxa"/>
               <w:left w:w="20" w:type="dxa"/>
               <w:right w:w="20" w:type="dxa"/>
             </w:tcMar>
@@ -434,6 +434,136 @@
                 <w:color w:val="1B365D"/>
                 <w:sz w:val="19"/>
               </w:rPr>
+              <w:t>Automated Test Harness:</w:t>
+            </w:r>
+          </w:p>
+        </w:tc>
+        <w:tc>
+          <w:tcPr>
+            <w:tcW w:type="dxa" w:w="5040"/>
+            <w:tcMar>
+              <w:top w:w="36" w:type="dxa"/>
+              <w:bottom w:w="36" w:type="dxa"/>
+              <w:left w:w="20" w:type="dxa"/>
+              <w:right w:w="20" w:type="dxa"/>
+            </w:tcMar>
+            <w:shd w:fill="FFFFFF"/>
+            <w:tcBorders>
+              <w:top w:val="single" w:sz="4" w:space="0" w:color="CBD5E1"/>
+              <w:bottom w:val="single" w:sz="4" w:space="0" w:color="CBD5E1"/>
+              <w:left w:val="single" w:sz="4" w:space="0" w:color="CBD5E1"/>
+              <w:right w:val="single" w:sz="4" w:space="0" w:color="CBD5E1"/>
+            </w:tcBorders>
+          </w:tcPr>
+          <w:p>
+            <w:pPr>
+              <w:spacing w:before="0" w:after="0"/>
+            </w:pPr>
+            <w:r>
+              <w:rPr>
+                <w:rFonts w:ascii="Calibri" w:hAnsi="Calibri"/>
+                <w:color w:val="1E293B"/>
+                <w:sz w:val="19"/>
+              </w:rPr>
+              <w:t>Headless Browser Automation Suite (Microsoft Edge / Playwright)</w:t>
+            </w:r>
+          </w:p>
+        </w:tc>
+      </w:tr>
+      <w:tr>
+        <w:tc>
+          <w:tcPr>
+            <w:tcW w:type="dxa" w:w="5040"/>
+            <w:tcMar>
+              <w:top w:w="36" w:type="dxa"/>
+              <w:bottom w:w="36" w:type="dxa"/>
+              <w:left w:w="20" w:type="dxa"/>
+              <w:right w:w="20" w:type="dxa"/>
+            </w:tcMar>
+            <w:shd w:fill="F1F5F9"/>
+            <w:tcBorders>
+              <w:top w:val="single" w:sz="4" w:space="0" w:color="CBD5E1"/>
+              <w:bottom w:val="single" w:sz="4" w:space="0" w:color="CBD5E1"/>
+              <w:left w:val="single" w:sz="4" w:space="0" w:color="CBD5E1"/>
+              <w:right w:val="single" w:sz="4" w:space="0" w:color="CBD5E1"/>
+            </w:tcBorders>
+          </w:tcPr>
+          <w:p>
+            <w:pPr>
+              <w:spacing w:before="0" w:after="0"/>
+            </w:pPr>
+            <w:r>
+              <w:rPr>
+                <w:rFonts w:ascii="Calibri" w:hAnsi="Calibri"/>
+                <w:b/>
+                <w:color w:val="1B365D"/>
+                <w:sz w:val="19"/>
+              </w:rPr>
+              <w:t>Evaluation Environment:</w:t>
+            </w:r>
+          </w:p>
+        </w:tc>
+        <w:tc>
+          <w:tcPr>
+            <w:tcW w:type="dxa" w:w="5040"/>
+            <w:tcMar>
+              <w:top w:w="36" w:type="dxa"/>
+              <w:bottom w:w="36" w:type="dxa"/>
+              <w:left w:w="20" w:type="dxa"/>
+              <w:right w:w="20" w:type="dxa"/>
+            </w:tcMar>
+            <w:shd w:fill="FFFFFF"/>
+            <w:tcBorders>
+              <w:top w:val="single" w:sz="4" w:space="0" w:color="CBD5E1"/>
+              <w:bottom w:val="single" w:sz="4" w:space="0" w:color="CBD5E1"/>
+              <w:left w:val="single" w:sz="4" w:space="0" w:color="CBD5E1"/>
+              <w:right w:val="single" w:sz="4" w:space="0" w:color="CBD5E1"/>
+            </w:tcBorders>
+          </w:tcPr>
+          <w:p>
+            <w:pPr>
+              <w:spacing w:before="0" w:after="0"/>
+            </w:pPr>
+            <w:r>
+              <w:rPr>
+                <w:rFonts w:ascii="Calibri" w:hAnsi="Calibri"/>
+                <w:color w:val="1E293B"/>
+                <w:sz w:val="19"/>
+              </w:rPr>
+              <w:t>Isolated Localhost Sandbox (C:\xampp\htdocs\SecureWebLab)</w:t>
+            </w:r>
+          </w:p>
+        </w:tc>
+      </w:tr>
+      <w:tr>
+        <w:tc>
+          <w:tcPr>
+            <w:tcW w:type="dxa" w:w="5040"/>
+            <w:tcMar>
+              <w:top w:w="36" w:type="dxa"/>
+              <w:bottom w:w="36" w:type="dxa"/>
+              <w:left w:w="20" w:type="dxa"/>
+              <w:right w:w="20" w:type="dxa"/>
+            </w:tcMar>
+            <w:shd w:fill="F1F5F9"/>
+            <w:tcBorders>
+              <w:top w:val="single" w:sz="4" w:space="0" w:color="CBD5E1"/>
+              <w:bottom w:val="single" w:sz="4" w:space="0" w:color="CBD5E1"/>
+              <w:left w:val="single" w:sz="4" w:space="0" w:color="CBD5E1"/>
+              <w:right w:val="single" w:sz="4" w:space="0" w:color="CBD5E1"/>
+            </w:tcBorders>
+          </w:tcPr>
+          <w:p>
+            <w:pPr>
+              <w:spacing w:before="0" w:after="0"/>
+            </w:pPr>
+            <w:r>
+              <w:rPr>
+                <w:rFonts w:ascii="Calibri" w:hAnsi="Calibri"/>
+                <w:b/>
+                <w:color w:val="1B365D"/>
+                <w:sz w:val="19"/>
+              </w:rPr>
               <w:t>Document Classification:</w:t>
             </w:r>
           </w:p>
@@ -442,8 +572,8 @@
           <w:tcPr>
             <w:tcW w:type="dxa" w:w="5040"/>
             <w:tcMar>
-              <w:top w:w="34" w:type="dxa"/>
-              <w:bottom w:w="34" w:type="dxa"/>
+              <w:top w:w="36" w:type="dxa"/>
+              <w:bottom w:w="36" w:type="dxa"/>
               <w:left w:w="20" w:type="dxa"/>
               <w:right w:w="20" w:type="dxa"/>
             </w:tcMar>
@@ -473,7 +603,7 @@
     </w:tbl>
     <w:p>
       <w:pPr>
-        <w:spacing w:before="1280" w:after="160"/>
+        <w:spacing w:before="1600" w:after="160"/>
         <w:jc w:val="center"/>
       </w:pPr>
       <w:r>
@@ -492,7 +622,7 @@
     </w:p>
     <w:p>
       <w:pPr>
-        <w:spacing w:before="120" w:after="0"/>
+        <w:spacing w:before="160" w:after="0"/>
         <w:jc w:val="center"/>
       </w:pPr>
       <w:r>
@@ -4816,8 +4946,8 @@
           <w:tcPr>
             <w:tcW w:type="dxa" w:w="1440"/>
             <w:tcMar>
-              <w:top w:w="24" w:type="dxa"/>
-              <w:bottom w:w="24" w:type="dxa"/>
+              <w:top w:w="30" w:type="dxa"/>
+              <w:bottom w:w="30" w:type="dxa"/>
               <w:left w:w="35" w:type="dxa"/>
               <w:right w:w="35" w:type="dxa"/>
             </w:tcMar>
@@ -4848,8 +4978,8 @@
           <w:tcPr>
             <w:tcW w:type="dxa" w:w="3168"/>
             <w:tcMar>
-              <w:top w:w="24" w:type="dxa"/>
-              <w:bottom w:w="24" w:type="dxa"/>
+              <w:top w:w="30" w:type="dxa"/>
+              <w:bottom w:w="30" w:type="dxa"/>
               <w:left w:w="35" w:type="dxa"/>
               <w:right w:w="35" w:type="dxa"/>
             </w:tcMar>
@@ -4880,8 +5010,8 @@
           <w:tcPr>
             <w:tcW w:type="dxa" w:w="5472"/>
             <w:tcMar>
-              <w:top w:w="24" w:type="dxa"/>
-              <w:bottom w:w="24" w:type="dxa"/>
+              <w:top w:w="30" w:type="dxa"/>
+              <w:bottom w:w="30" w:type="dxa"/>
               <w:left w:w="35" w:type="dxa"/>
               <w:right w:w="35" w:type="dxa"/>
             </w:tcMar>
@@ -4914,8 +5044,8 @@
           <w:tcPr>
             <w:tcW w:type="dxa" w:w="1440"/>
             <w:tcMar>
-              <w:top w:w="20" w:type="dxa"/>
-              <w:bottom w:w="20" w:type="dxa"/>
+              <w:top w:w="26" w:type="dxa"/>
+              <w:bottom w:w="26" w:type="dxa"/>
               <w:left w:w="35" w:type="dxa"/>
               <w:right w:w="35" w:type="dxa"/>
             </w:tcMar>
@@ -4946,8 +5076,8 @@
           <w:tcPr>
             <w:tcW w:type="dxa" w:w="3168"/>
             <w:tcMar>
-              <w:top w:w="20" w:type="dxa"/>
-              <w:bottom w:w="20" w:type="dxa"/>
+              <w:top w:w="26" w:type="dxa"/>
+              <w:bottom w:w="26" w:type="dxa"/>
               <w:left w:w="35" w:type="dxa"/>
               <w:right w:w="35" w:type="dxa"/>
             </w:tcMar>
@@ -4977,8 +5107,8 @@
           <w:tcPr>
             <w:tcW w:type="dxa" w:w="5472"/>
             <w:tcMar>
-              <w:top w:w="20" w:type="dxa"/>
-              <w:bottom w:w="20" w:type="dxa"/>
+              <w:top w:w="26" w:type="dxa"/>
+              <w:bottom w:w="26" w:type="dxa"/>
               <w:left w:w="35" w:type="dxa"/>
               <w:right w:w="35" w:type="dxa"/>
             </w:tcMar>
@@ -5010,8 +5140,8 @@
           <w:tcPr>
             <w:tcW w:type="dxa" w:w="1440"/>
             <w:tcMar>
-              <w:top w:w="20" w:type="dxa"/>
-              <w:bottom w:w="20" w:type="dxa"/>
+              <w:top w:w="26" w:type="dxa"/>
+              <w:bottom w:w="26" w:type="dxa"/>
               <w:left w:w="35" w:type="dxa"/>
               <w:right w:w="35" w:type="dxa"/>
             </w:tcMar>
@@ -5042,8 +5172,8 @@
           <w:tcPr>
             <w:tcW w:type="dxa" w:w="3168"/>
             <w:tcMar>
-              <w:top w:w="20" w:type="dxa"/>
-              <w:bottom w:w="20" w:type="dxa"/>
+              <w:top w:w="26" w:type="dxa"/>
+              <w:bottom w:w="26" w:type="dxa"/>
               <w:left w:w="35" w:type="dxa"/>
               <w:right w:w="35" w:type="dxa"/>
             </w:tcMar>
@@ -5073,8 +5203,8 @@
           <w:tcPr>
             <w:tcW w:type="dxa" w:w="5472"/>
             <w:tcMar>
-              <w:top w:w="20" w:type="dxa"/>
-              <w:bottom w:w="20" w:type="dxa"/>
+              <w:top w:w="26" w:type="dxa"/>
+              <w:bottom w:w="26" w:type="dxa"/>
               <w:left w:w="35" w:type="dxa"/>
               <w:right w:w="35" w:type="dxa"/>
             </w:tcMar>
@@ -5106,8 +5236,8 @@
           <w:tcPr>
             <w:tcW w:type="dxa" w:w="1440"/>
             <w:tcMar>
-              <w:top w:w="20" w:type="dxa"/>
-              <w:bottom w:w="20" w:type="dxa"/>
+              <w:top w:w="26" w:type="dxa"/>
+              <w:bottom w:w="26" w:type="dxa"/>
               <w:left w:w="35" w:type="dxa"/>
               <w:right w:w="35" w:type="dxa"/>
             </w:tcMar>
@@ -5138,8 +5268,8 @@
           <w:tcPr>
             <w:tcW w:type="dxa" w:w="3168"/>
             <w:tcMar>
-              <w:top w:w="20" w:type="dxa"/>
-              <w:bottom w:w="20" w:type="dxa"/>
+              <w:top w:w="26" w:type="dxa"/>
+              <w:bottom w:w="26" w:type="dxa"/>
               <w:left w:w="35" w:type="dxa"/>
               <w:right w:w="35" w:type="dxa"/>
             </w:tcMar>
@@ -5169,8 +5299,8 @@
           <w:tcPr>
             <w:tcW w:type="dxa" w:w="5472"/>
             <w:tcMar>
-              <w:top w:w="20" w:type="dxa"/>
-              <w:bottom w:w="20" w:type="dxa"/>
+              <w:top w:w="26" w:type="dxa"/>
+              <w:bottom w:w="26" w:type="dxa"/>
               <w:left w:w="35" w:type="dxa"/>
               <w:right w:w="35" w:type="dxa"/>
             </w:tcMar>
@@ -5202,8 +5332,8 @@
           <w:tcPr>
             <w:tcW w:type="dxa" w:w="1440"/>
             <w:tcMar>
-              <w:top w:w="20" w:type="dxa"/>
-              <w:bottom w:w="20" w:type="dxa"/>
+              <w:top w:w="26" w:type="dxa"/>
+              <w:bottom w:w="26" w:type="dxa"/>
               <w:left w:w="35" w:type="dxa"/>
               <w:right w:w="35" w:type="dxa"/>
             </w:tcMar>
@@ -5234,8 +5364,8 @@
           <w:tcPr>
             <w:tcW w:type="dxa" w:w="3168"/>
             <w:tcMar>
-              <w:top w:w="20" w:type="dxa"/>
-              <w:bottom w:w="20" w:type="dxa"/>
+              <w:top w:w="26" w:type="dxa"/>
+              <w:bottom w:w="26" w:type="dxa"/>
               <w:left w:w="35" w:type="dxa"/>
               <w:right w:w="35" w:type="dxa"/>
             </w:tcMar>
@@ -5265,8 +5395,8 @@
           <w:tcPr>
             <w:tcW w:type="dxa" w:w="5472"/>
             <w:tcMar>
-              <w:top w:w="20" w:type="dxa"/>
-              <w:bottom w:w="20" w:type="dxa"/>
+              <w:top w:w="26" w:type="dxa"/>
+              <w:bottom w:w="26" w:type="dxa"/>
               <w:left w:w="35" w:type="dxa"/>
               <w:right w:w="35" w:type="dxa"/>
             </w:tcMar>
@@ -5298,8 +5428,8 @@
           <w:tcPr>
             <w:tcW w:type="dxa" w:w="1440"/>
             <w:tcMar>
-              <w:top w:w="20" w:type="dxa"/>
-              <w:bottom w:w="20" w:type="dxa"/>
+              <w:top w:w="26" w:type="dxa"/>
+              <w:bottom w:w="26" w:type="dxa"/>
               <w:left w:w="35" w:type="dxa"/>
               <w:right w:w="35" w:type="dxa"/>
             </w:tcMar>
@@ -5330,8 +5460,8 @@
           <w:tcPr>
             <w:tcW w:type="dxa" w:w="3168"/>
             <w:tcMar>
-              <w:top w:w="20" w:type="dxa"/>
-              <w:bottom w:w="20" w:type="dxa"/>
+              <w:top w:w="26" w:type="dxa"/>
+              <w:bottom w:w="26" w:type="dxa"/>
               <w:left w:w="35" w:type="dxa"/>
               <w:right w:w="35" w:type="dxa"/>
             </w:tcMar>
@@ -5361,8 +5491,8 @@
           <w:tcPr>
             <w:tcW w:type="dxa" w:w="5472"/>
             <w:tcMar>
-              <w:top w:w="20" w:type="dxa"/>
-              <w:bottom w:w="20" w:type="dxa"/>
+              <w:top w:w="26" w:type="dxa"/>
+              <w:bottom w:w="26" w:type="dxa"/>
               <w:left w:w="35" w:type="dxa"/>
               <w:right w:w="35" w:type="dxa"/>
             </w:tcMar>
@@ -5394,8 +5524,8 @@
           <w:tcPr>
             <w:tcW w:type="dxa" w:w="1440"/>
             <w:tcMar>
-              <w:top w:w="20" w:type="dxa"/>
-              <w:bottom w:w="20" w:type="dxa"/>
+              <w:top w:w="26" w:type="dxa"/>
+              <w:bottom w:w="26" w:type="dxa"/>
               <w:left w:w="35" w:type="dxa"/>
               <w:right w:w="35" w:type="dxa"/>
             </w:tcMar>
@@ -5426,8 +5556,8 @@
           <w:tcPr>
             <w:tcW w:type="dxa" w:w="3168"/>
             <w:tcMar>
-              <w:top w:w="20" w:type="dxa"/>
-              <w:bottom w:w="20" w:type="dxa"/>
+              <w:top w:w="26" w:type="dxa"/>
+              <w:bottom w:w="26" w:type="dxa"/>
               <w:left w:w="35" w:type="dxa"/>
               <w:right w:w="35" w:type="dxa"/>
             </w:tcMar>
@@ -5457,8 +5587,8 @@
           <w:tcPr>
             <w:tcW w:type="dxa" w:w="5472"/>
             <w:tcMar>
-              <w:top w:w="20" w:type="dxa"/>
-              <w:bottom w:w="20" w:type="dxa"/>
+              <w:top w:w="26" w:type="dxa"/>
+              <w:bottom w:w="26" w:type="dxa"/>
               <w:left w:w="35" w:type="dxa"/>
               <w:right w:w="35" w:type="dxa"/>
             </w:tcMar>
@@ -5490,8 +5620,8 @@
           <w:tcPr>
             <w:tcW w:type="dxa" w:w="1440"/>
             <w:tcMar>
-              <w:top w:w="20" w:type="dxa"/>
-              <w:bottom w:w="20" w:type="dxa"/>
+              <w:top w:w="26" w:type="dxa"/>
+              <w:bottom w:w="26" w:type="dxa"/>
               <w:left w:w="35" w:type="dxa"/>
               <w:right w:w="35" w:type="dxa"/>
             </w:tcMar>
@@ -5522,8 +5652,8 @@
           <w:tcPr>
             <w:tcW w:type="dxa" w:w="3168"/>
             <w:tcMar>
-              <w:top w:w="20" w:type="dxa"/>
-              <w:bottom w:w="20" w:type="dxa"/>
+              <w:top w:w="26" w:type="dxa"/>
+              <w:bottom w:w="26" w:type="dxa"/>
               <w:left w:w="35" w:type="dxa"/>
               <w:right w:w="35" w:type="dxa"/>
             </w:tcMar>
@@ -5553,8 +5683,8 @@
           <w:tcPr>
             <w:tcW w:type="dxa" w:w="5472"/>
             <w:tcMar>
-              <w:top w:w="20" w:type="dxa"/>
-              <w:bottom w:w="20" w:type="dxa"/>
+              <w:top w:w="26" w:type="dxa"/>
+              <w:bottom w:w="26" w:type="dxa"/>
               <w:left w:w="35" w:type="dxa"/>
               <w:right w:w="35" w:type="dxa"/>
             </w:tcMar>
@@ -5586,8 +5716,8 @@
           <w:tcPr>
             <w:tcW w:type="dxa" w:w="1440"/>
             <w:tcMar>
-              <w:top w:w="20" w:type="dxa"/>
-              <w:bottom w:w="20" w:type="dxa"/>
+              <w:top w:w="26" w:type="dxa"/>
+              <w:bottom w:w="26" w:type="dxa"/>
               <w:left w:w="35" w:type="dxa"/>
               <w:right w:w="35" w:type="dxa"/>
             </w:tcMar>
@@ -5618,8 +5748,8 @@
           <w:tcPr>
             <w:tcW w:type="dxa" w:w="3168"/>
             <w:tcMar>
-              <w:top w:w="20" w:type="dxa"/>
-              <w:bottom w:w="20" w:type="dxa"/>
+              <w:top w:w="26" w:type="dxa"/>
+              <w:bottom w:w="26" w:type="dxa"/>
               <w:left w:w="35" w:type="dxa"/>
               <w:right w:w="35" w:type="dxa"/>
             </w:tcMar>
@@ -5649,8 +5779,8 @@
           <w:tcPr>
             <w:tcW w:type="dxa" w:w="5472"/>
             <w:tcMar>
-              <w:top w:w="20" w:type="dxa"/>
-              <w:bottom w:w="20" w:type="dxa"/>
+              <w:top w:w="26" w:type="dxa"/>
+              <w:bottom w:w="26" w:type="dxa"/>
               <w:left w:w="35" w:type="dxa"/>
               <w:right w:w="35" w:type="dxa"/>
             </w:tcMar>
@@ -5682,8 +5812,8 @@
           <w:tcPr>
             <w:tcW w:type="dxa" w:w="1440"/>
             <w:tcMar>
-              <w:top w:w="20" w:type="dxa"/>
-              <w:bottom w:w="20" w:type="dxa"/>
+              <w:top w:w="26" w:type="dxa"/>
+              <w:bottom w:w="26" w:type="dxa"/>
               <w:left w:w="35" w:type="dxa"/>
               <w:right w:w="35" w:type="dxa"/>
             </w:tcMar>
@@ -5714,8 +5844,8 @@
           <w:tcPr>
             <w:tcW w:type="dxa" w:w="3168"/>
             <w:tcMar>
-              <w:top w:w="20" w:type="dxa"/>
-              <w:bottom w:w="20" w:type="dxa"/>
+              <w:top w:w="26" w:type="dxa"/>
+              <w:bottom w:w="26" w:type="dxa"/>
               <w:left w:w="35" w:type="dxa"/>
               <w:right w:w="35" w:type="dxa"/>
             </w:tcMar>
@@ -5745,8 +5875,8 @@
           <w:tcPr>
             <w:tcW w:type="dxa" w:w="5472"/>
             <w:tcMar>
-              <w:top w:w="20" w:type="dxa"/>
-              <w:bottom w:w="20" w:type="dxa"/>
+              <w:top w:w="26" w:type="dxa"/>
+              <w:bottom w:w="26" w:type="dxa"/>
               <w:left w:w="35" w:type="dxa"/>
               <w:right w:w="35" w:type="dxa"/>
             </w:tcMar>
@@ -5778,8 +5908,8 @@
           <w:tcPr>
             <w:tcW w:type="dxa" w:w="1440"/>
             <w:tcMar>
-              <w:top w:w="20" w:type="dxa"/>
-              <w:bottom w:w="20" w:type="dxa"/>
+              <w:top w:w="26" w:type="dxa"/>
+              <w:bottom w:w="26" w:type="dxa"/>
               <w:left w:w="35" w:type="dxa"/>
               <w:right w:w="35" w:type="dxa"/>
             </w:tcMar>
@@ -5810,8 +5940,8 @@
           <w:tcPr>
             <w:tcW w:type="dxa" w:w="3168"/>
             <w:tcMar>
-              <w:top w:w="20" w:type="dxa"/>
-              <w:bottom w:w="20" w:type="dxa"/>
+              <w:top w:w="26" w:type="dxa"/>
+              <w:bottom w:w="26" w:type="dxa"/>
               <w:left w:w="35" w:type="dxa"/>
               <w:right w:w="35" w:type="dxa"/>
             </w:tcMar>
@@ -5841,8 +5971,8 @@
           <w:tcPr>
             <w:tcW w:type="dxa" w:w="5472"/>
             <w:tcMar>
-              <w:top w:w="20" w:type="dxa"/>
-              <w:bottom w:w="20" w:type="dxa"/>
+              <w:top w:w="26" w:type="dxa"/>
+              <w:bottom w:w="26" w:type="dxa"/>
               <w:left w:w="35" w:type="dxa"/>
               <w:right w:w="35" w:type="dxa"/>
             </w:tcMar>
@@ -5874,8 +6004,8 @@
           <w:tcPr>
             <w:tcW w:type="dxa" w:w="1440"/>
             <w:tcMar>
-              <w:top w:w="20" w:type="dxa"/>
-              <w:bottom w:w="20" w:type="dxa"/>
+              <w:top w:w="26" w:type="dxa"/>
+              <w:bottom w:w="26" w:type="dxa"/>
               <w:left w:w="35" w:type="dxa"/>
               <w:right w:w="35" w:type="dxa"/>
             </w:tcMar>
@@ -5906,8 +6036,8 @@
           <w:tcPr>
             <w:tcW w:type="dxa" w:w="3168"/>
             <w:tcMar>
-              <w:top w:w="20" w:type="dxa"/>
-              <w:bottom w:w="20" w:type="dxa"/>
+              <w:top w:w="26" w:type="dxa"/>
+              <w:bottom w:w="26" w:type="dxa"/>
               <w:left w:w="35" w:type="dxa"/>
               <w:right w:w="35" w:type="dxa"/>
             </w:tcMar>
@@ -5937,8 +6067,8 @@
           <w:tcPr>
             <w:tcW w:type="dxa" w:w="5472"/>
             <w:tcMar>
-              <w:top w:w="20" w:type="dxa"/>
-              <w:bottom w:w="20" w:type="dxa"/>
+              <w:top w:w="26" w:type="dxa"/>
+              <w:bottom w:w="26" w:type="dxa"/>
               <w:left w:w="35" w:type="dxa"/>
               <w:right w:w="35" w:type="dxa"/>
             </w:tcMar>
@@ -5970,8 +6100,8 @@
           <w:tcPr>
             <w:tcW w:type="dxa" w:w="1440"/>
             <w:tcMar>
-              <w:top w:w="20" w:type="dxa"/>
-              <w:bottom w:w="20" w:type="dxa"/>
+              <w:top w:w="26" w:type="dxa"/>
+              <w:bottom w:w="26" w:type="dxa"/>
               <w:left w:w="35" w:type="dxa"/>
               <w:right w:w="35" w:type="dxa"/>
             </w:tcMar>
@@ -6002,8 +6132,8 @@
           <w:tcPr>
             <w:tcW w:type="dxa" w:w="3168"/>
             <w:tcMar>
-              <w:top w:w="20" w:type="dxa"/>
-              <w:bottom w:w="20" w:type="dxa"/>
+              <w:top w:w="26" w:type="dxa"/>
+              <w:bottom w:w="26" w:type="dxa"/>
               <w:left w:w="35" w:type="dxa"/>
               <w:right w:w="35" w:type="dxa"/>
             </w:tcMar>
@@ -6033,8 +6163,8 @@
           <w:tcPr>
             <w:tcW w:type="dxa" w:w="5472"/>
             <w:tcMar>
-              <w:top w:w="20" w:type="dxa"/>
-              <w:bottom w:w="20" w:type="dxa"/>
+              <w:top w:w="26" w:type="dxa"/>
+              <w:bottom w:w="26" w:type="dxa"/>
               <w:left w:w="35" w:type="dxa"/>
               <w:right w:w="35" w:type="dxa"/>
             </w:tcMar>
@@ -6066,8 +6196,8 @@
           <w:tcPr>
             <w:tcW w:type="dxa" w:w="1440"/>
             <w:tcMar>
-              <w:top w:w="20" w:type="dxa"/>
-              <w:bottom w:w="20" w:type="dxa"/>
+              <w:top w:w="26" w:type="dxa"/>
+              <w:bottom w:w="26" w:type="dxa"/>
               <w:left w:w="35" w:type="dxa"/>
               <w:right w:w="35" w:type="dxa"/>
             </w:tcMar>
@@ -6098,8 +6228,8 @@
           <w:tcPr>
             <w:tcW w:type="dxa" w:w="3168"/>
             <w:tcMar>
-              <w:top w:w="20" w:type="dxa"/>
-              <w:bottom w:w="20" w:type="dxa"/>
+              <w:top w:w="26" w:type="dxa"/>
+              <w:bottom w:w="26" w:type="dxa"/>
               <w:left w:w="35" w:type="dxa"/>
               <w:right w:w="35" w:type="dxa"/>
             </w:tcMar>
@@ -6129,8 +6259,8 @@
           <w:tcPr>
             <w:tcW w:type="dxa" w:w="5472"/>
             <w:tcMar>
-              <w:top w:w="20" w:type="dxa"/>
-              <w:bottom w:w="20" w:type="dxa"/>
+              <w:top w:w="26" w:type="dxa"/>
+              <w:bottom w:w="26" w:type="dxa"/>
               <w:left w:w="35" w:type="dxa"/>
               <w:right w:w="35" w:type="dxa"/>
             </w:tcMar>
@@ -6162,8 +6292,8 @@
           <w:tcPr>
             <w:tcW w:type="dxa" w:w="1440"/>
             <w:tcMar>
-              <w:top w:w="20" w:type="dxa"/>
-              <w:bottom w:w="20" w:type="dxa"/>
+              <w:top w:w="26" w:type="dxa"/>
+              <w:bottom w:w="26" w:type="dxa"/>
               <w:left w:w="35" w:type="dxa"/>
               <w:right w:w="35" w:type="dxa"/>
             </w:tcMar>
@@ -6194,8 +6324,8 @@
           <w:tcPr>
             <w:tcW w:type="dxa" w:w="3168"/>
             <w:tcMar>
-              <w:top w:w="20" w:type="dxa"/>
-              <w:bottom w:w="20" w:type="dxa"/>
+              <w:top w:w="26" w:type="dxa"/>
+              <w:bottom w:w="26" w:type="dxa"/>
               <w:left w:w="35" w:type="dxa"/>
               <w:right w:w="35" w:type="dxa"/>
             </w:tcMar>
@@ -6225,8 +6355,8 @@
           <w:tcPr>
             <w:tcW w:type="dxa" w:w="5472"/>
             <w:tcMar>
-              <w:top w:w="20" w:type="dxa"/>
-              <w:bottom w:w="20" w:type="dxa"/>
+              <w:top w:w="26" w:type="dxa"/>
+              <w:bottom w:w="26" w:type="dxa"/>
               <w:left w:w="35" w:type="dxa"/>
               <w:right w:w="35" w:type="dxa"/>
             </w:tcMar>
@@ -6258,8 +6388,8 @@
           <w:tcPr>
             <w:tcW w:type="dxa" w:w="1440"/>
             <w:tcMar>
-              <w:top w:w="20" w:type="dxa"/>
-              <w:bottom w:w="20" w:type="dxa"/>
+              <w:top w:w="26" w:type="dxa"/>
+              <w:bottom w:w="26" w:type="dxa"/>
               <w:left w:w="35" w:type="dxa"/>
               <w:right w:w="35" w:type="dxa"/>
             </w:tcMar>
@@ -6290,8 +6420,8 @@
           <w:tcPr>
             <w:tcW w:type="dxa" w:w="3168"/>
             <w:tcMar>
-              <w:top w:w="20" w:type="dxa"/>
-              <w:bottom w:w="20" w:type="dxa"/>
+              <w:top w:w="26" w:type="dxa"/>
+              <w:bottom w:w="26" w:type="dxa"/>
               <w:left w:w="35" w:type="dxa"/>
               <w:right w:w="35" w:type="dxa"/>
             </w:tcMar>
@@ -6321,8 +6451,8 @@
           <w:tcPr>
             <w:tcW w:type="dxa" w:w="5472"/>
             <w:tcMar>
-              <w:top w:w="20" w:type="dxa"/>
-              <w:bottom w:w="20" w:type="dxa"/>
+              <w:top w:w="26" w:type="dxa"/>
+              <w:bottom w:w="26" w:type="dxa"/>
               <w:left w:w="35" w:type="dxa"/>
               <w:right w:w="35" w:type="dxa"/>
             </w:tcMar>
@@ -6354,8 +6484,8 @@
           <w:tcPr>
             <w:tcW w:type="dxa" w:w="1440"/>
             <w:tcMar>
-              <w:top w:w="20" w:type="dxa"/>
-              <w:bottom w:w="20" w:type="dxa"/>
+              <w:top w:w="26" w:type="dxa"/>
+              <w:bottom w:w="26" w:type="dxa"/>
               <w:left w:w="35" w:type="dxa"/>
               <w:right w:w="35" w:type="dxa"/>
             </w:tcMar>
@@ -6386,8 +6516,8 @@
           <w:tcPr>
             <w:tcW w:type="dxa" w:w="3168"/>
             <w:tcMar>
-              <w:top w:w="20" w:type="dxa"/>
-              <w:bottom w:w="20" w:type="dxa"/>
+              <w:top w:w="26" w:type="dxa"/>
+              <w:bottom w:w="26" w:type="dxa"/>
               <w:left w:w="35" w:type="dxa"/>
               <w:right w:w="35" w:type="dxa"/>
             </w:tcMar>
@@ -6417,8 +6547,8 @@
           <w:tcPr>
             <w:tcW w:type="dxa" w:w="5472"/>
             <w:tcMar>
-              <w:top w:w="20" w:type="dxa"/>
-              <w:bottom w:w="20" w:type="dxa"/>
+              <w:top w:w="26" w:type="dxa"/>
+              <w:bottom w:w="26" w:type="dxa"/>
               <w:left w:w="35" w:type="dxa"/>
               <w:right w:w="35" w:type="dxa"/>
             </w:tcMar>
@@ -6450,8 +6580,8 @@
           <w:tcPr>
             <w:tcW w:type="dxa" w:w="1440"/>
             <w:tcMar>
-              <w:top w:w="20" w:type="dxa"/>
-              <w:bottom w:w="20" w:type="dxa"/>
+              <w:top w:w="26" w:type="dxa"/>
+              <w:bottom w:w="26" w:type="dxa"/>
               <w:left w:w="35" w:type="dxa"/>
               <w:right w:w="35" w:type="dxa"/>
             </w:tcMar>
@@ -6482,8 +6612,8 @@
           <w:tcPr>
             <w:tcW w:type="dxa" w:w="3168"/>
             <w:tcMar>
-              <w:top w:w="20" w:type="dxa"/>
-              <w:bottom w:w="20" w:type="dxa"/>
+              <w:top w:w="26" w:type="dxa"/>
+              <w:bottom w:w="26" w:type="dxa"/>
               <w:left w:w="35" w:type="dxa"/>
               <w:right w:w="35" w:type="dxa"/>
             </w:tcMar>
@@ -6513,8 +6643,8 @@
           <w:tcPr>
             <w:tcW w:type="dxa" w:w="5472"/>
             <w:tcMar>
-              <w:top w:w="20" w:type="dxa"/>
-              <w:bottom w:w="20" w:type="dxa"/>
+              <w:top w:w="26" w:type="dxa"/>
+              <w:bottom w:w="26" w:type="dxa"/>
               <w:left w:w="35" w:type="dxa"/>
               <w:right w:w="35" w:type="dxa"/>
             </w:tcMar>
@@ -6546,8 +6676,8 @@
           <w:tcPr>
             <w:tcW w:type="dxa" w:w="1440"/>
             <w:tcMar>
-              <w:top w:w="20" w:type="dxa"/>
-              <w:bottom w:w="20" w:type="dxa"/>
+              <w:top w:w="26" w:type="dxa"/>
+              <w:bottom w:w="26" w:type="dxa"/>
               <w:left w:w="35" w:type="dxa"/>
               <w:right w:w="35" w:type="dxa"/>
             </w:tcMar>
@@ -6578,8 +6708,8 @@
           <w:tcPr>
             <w:tcW w:type="dxa" w:w="3168"/>
             <w:tcMar>
-              <w:top w:w="20" w:type="dxa"/>
-              <w:bottom w:w="20" w:type="dxa"/>
+              <w:top w:w="26" w:type="dxa"/>
+              <w:bottom w:w="26" w:type="dxa"/>
               <w:left w:w="35" w:type="dxa"/>
               <w:right w:w="35" w:type="dxa"/>
             </w:tcMar>
@@ -6609,8 +6739,8 @@
           <w:tcPr>
             <w:tcW w:type="dxa" w:w="5472"/>
             <w:tcMar>
-              <w:top w:w="20" w:type="dxa"/>
-              <w:bottom w:w="20" w:type="dxa"/>
+              <w:top w:w="26" w:type="dxa"/>
+              <w:bottom w:w="26" w:type="dxa"/>
               <w:left w:w="35" w:type="dxa"/>
               <w:right w:w="35" w:type="dxa"/>
             </w:tcMar>
@@ -6642,8 +6772,8 @@
           <w:tcPr>
             <w:tcW w:type="dxa" w:w="1440"/>
             <w:tcMar>
-              <w:top w:w="20" w:type="dxa"/>
-              <w:bottom w:w="20" w:type="dxa"/>
+              <w:top w:w="26" w:type="dxa"/>
+              <w:bottom w:w="26" w:type="dxa"/>
               <w:left w:w="35" w:type="dxa"/>
               <w:right w:w="35" w:type="dxa"/>
             </w:tcMar>
@@ -6674,8 +6804,8 @@
           <w:tcPr>
             <w:tcW w:type="dxa" w:w="3168"/>
             <w:tcMar>
-              <w:top w:w="20" w:type="dxa"/>
-              <w:bottom w:w="20" w:type="dxa"/>
+              <w:top w:w="26" w:type="dxa"/>
+              <w:bottom w:w="26" w:type="dxa"/>
               <w:left w:w="35" w:type="dxa"/>
               <w:right w:w="35" w:type="dxa"/>
             </w:tcMar>
@@ -6705,8 +6835,8 @@
           <w:tcPr>
             <w:tcW w:type="dxa" w:w="5472"/>
             <w:tcMar>
-              <w:top w:w="20" w:type="dxa"/>
-              <w:bottom w:w="20" w:type="dxa"/>
+              <w:top w:w="26" w:type="dxa"/>
+              <w:bottom w:w="26" w:type="dxa"/>
               <w:left w:w="35" w:type="dxa"/>
               <w:right w:w="35" w:type="dxa"/>
             </w:tcMar>
@@ -6729,6 +6859,198 @@
                 <w:sz w:val="16"/>
               </w:rPr>
               <w:t>Open framework for calculating vulnerability severity metrics.</w:t>
+            </w:r>
+          </w:p>
+        </w:tc>
+      </w:tr>
+      <w:tr>
+        <w:tc>
+          <w:tcPr>
+            <w:tcW w:type="dxa" w:w="1440"/>
+            <w:tcMar>
+              <w:top w:w="26" w:type="dxa"/>
+              <w:bottom w:w="26" w:type="dxa"/>
+              <w:left w:w="35" w:type="dxa"/>
+              <w:right w:w="35" w:type="dxa"/>
+            </w:tcMar>
+            <w:shd w:fill="F8FAFC"/>
+            <w:tcBorders>
+              <w:top w:val="single" w:sz="4" w:space="0" w:color="CBD5E1"/>
+              <w:bottom w:val="single" w:sz="4" w:space="0" w:color="CBD5E1"/>
+              <w:left w:val="single" w:sz="4" w:space="0" w:color="CBD5E1"/>
+              <w:right w:val="single" w:sz="4" w:space="0" w:color="CBD5E1"/>
+            </w:tcBorders>
+          </w:tcPr>
+          <w:p>
+            <w:pPr>
+              <w:spacing w:before="0" w:after="0" w:line="252" w:lineRule="auto"/>
+            </w:pPr>
+            <w:r>
+              <w:rPr>
+                <w:rFonts w:ascii="Calibri" w:hAnsi="Calibri"/>
+                <w:b/>
+                <w:color w:val="1B365D"/>
+                <w:sz w:val="16"/>
+              </w:rPr>
+              <w:t>RBAC-POL</w:t>
+            </w:r>
+          </w:p>
+        </w:tc>
+        <w:tc>
+          <w:tcPr>
+            <w:tcW w:type="dxa" w:w="3168"/>
+            <w:tcMar>
+              <w:top w:w="26" w:type="dxa"/>
+              <w:bottom w:w="26" w:type="dxa"/>
+              <w:left w:w="35" w:type="dxa"/>
+              <w:right w:w="35" w:type="dxa"/>
+            </w:tcMar>
+            <w:shd w:fill="F8FAFC"/>
+            <w:tcBorders>
+              <w:top w:val="single" w:sz="4" w:space="0" w:color="CBD5E1"/>
+              <w:bottom w:val="single" w:sz="4" w:space="0" w:color="CBD5E1"/>
+              <w:left w:val="single" w:sz="4" w:space="0" w:color="CBD5E1"/>
+              <w:right w:val="single" w:sz="4" w:space="0" w:color="CBD5E1"/>
+            </w:tcBorders>
+          </w:tcPr>
+          <w:p>
+            <w:pPr>
+              <w:spacing w:before="0" w:after="0" w:line="252" w:lineRule="auto"/>
+            </w:pPr>
+            <w:r>
+              <w:rPr>
+                <w:rFonts w:ascii="Calibri" w:hAnsi="Calibri"/>
+                <w:color w:val="1E293B"/>
+                <w:sz w:val="16"/>
+              </w:rPr>
+              <w:t>Least Privilege Access Model</w:t>
+            </w:r>
+          </w:p>
+        </w:tc>
+        <w:tc>
+          <w:tcPr>
+            <w:tcW w:type="dxa" w:w="5472"/>
+            <w:tcMar>
+              <w:top w:w="26" w:type="dxa"/>
+              <w:bottom w:w="26" w:type="dxa"/>
+              <w:left w:w="35" w:type="dxa"/>
+              <w:right w:w="35" w:type="dxa"/>
+            </w:tcMar>
+            <w:shd w:fill="F8FAFC"/>
+            <w:tcBorders>
+              <w:top w:val="single" w:sz="4" w:space="0" w:color="CBD5E1"/>
+              <w:bottom w:val="single" w:sz="4" w:space="0" w:color="CBD5E1"/>
+              <w:left w:val="single" w:sz="4" w:space="0" w:color="CBD5E1"/>
+              <w:right w:val="single" w:sz="4" w:space="0" w:color="CBD5E1"/>
+            </w:tcBorders>
+          </w:tcPr>
+          <w:p>
+            <w:pPr>
+              <w:spacing w:before="0" w:after="0" w:line="252" w:lineRule="auto"/>
+            </w:pPr>
+            <w:r>
+              <w:rPr>
+                <w:rFonts w:ascii="Calibri" w:hAnsi="Calibri"/>
+                <w:color w:val="1E293B"/>
+                <w:sz w:val="16"/>
+              </w:rPr>
+              <w:t>Restricting system execution sinks to bare minimum permissions.</w:t>
+            </w:r>
+          </w:p>
+        </w:tc>
+      </w:tr>
+      <w:tr>
+        <w:tc>
+          <w:tcPr>
+            <w:tcW w:type="dxa" w:w="1440"/>
+            <w:tcMar>
+              <w:top w:w="26" w:type="dxa"/>
+              <w:bottom w:w="26" w:type="dxa"/>
+              <w:left w:w="35" w:type="dxa"/>
+              <w:right w:w="35" w:type="dxa"/>
+            </w:tcMar>
+            <w:shd w:fill="FFFFFF"/>
+            <w:tcBorders>
+              <w:top w:val="single" w:sz="4" w:space="0" w:color="CBD5E1"/>
+              <w:bottom w:val="single" w:sz="4" w:space="0" w:color="CBD5E1"/>
+              <w:left w:val="single" w:sz="4" w:space="0" w:color="CBD5E1"/>
+              <w:right w:val="single" w:sz="4" w:space="0" w:color="CBD5E1"/>
+            </w:tcBorders>
+          </w:tcPr>
+          <w:p>
+            <w:pPr>
+              <w:spacing w:before="0" w:after="0" w:line="252" w:lineRule="auto"/>
+            </w:pPr>
+            <w:r>
+              <w:rPr>
+                <w:rFonts w:ascii="Calibri" w:hAnsi="Calibri"/>
+                <w:b/>
+                <w:color w:val="1B365D"/>
+                <w:sz w:val="16"/>
+              </w:rPr>
+              <w:t>HTTP-CSP</w:t>
+            </w:r>
+          </w:p>
+        </w:tc>
+        <w:tc>
+          <w:tcPr>
+            <w:tcW w:type="dxa" w:w="3168"/>
+            <w:tcMar>
+              <w:top w:w="26" w:type="dxa"/>
+              <w:bottom w:w="26" w:type="dxa"/>
+              <w:left w:w="35" w:type="dxa"/>
+              <w:right w:w="35" w:type="dxa"/>
+            </w:tcMar>
+            <w:shd w:fill="FFFFFF"/>
+            <w:tcBorders>
+              <w:top w:val="single" w:sz="4" w:space="0" w:color="CBD5E1"/>
+              <w:bottom w:val="single" w:sz="4" w:space="0" w:color="CBD5E1"/>
+              <w:left w:val="single" w:sz="4" w:space="0" w:color="CBD5E1"/>
+              <w:right w:val="single" w:sz="4" w:space="0" w:color="CBD5E1"/>
+            </w:tcBorders>
+          </w:tcPr>
+          <w:p>
+            <w:pPr>
+              <w:spacing w:before="0" w:after="0" w:line="252" w:lineRule="auto"/>
+            </w:pPr>
+            <w:r>
+              <w:rPr>
+                <w:rFonts w:ascii="Calibri" w:hAnsi="Calibri"/>
+                <w:color w:val="1E293B"/>
+                <w:sz w:val="16"/>
+              </w:rPr>
+              <w:t>Content Security Policy Standard</w:t>
+            </w:r>
+          </w:p>
+        </w:tc>
+        <w:tc>
+          <w:tcPr>
+            <w:tcW w:type="dxa" w:w="5472"/>
+            <w:tcMar>
+              <w:top w:w="26" w:type="dxa"/>
+              <w:bottom w:w="26" w:type="dxa"/>
+              <w:left w:w="35" w:type="dxa"/>
+              <w:right w:w="35" w:type="dxa"/>
+            </w:tcMar>
+            <w:shd w:fill="FFFFFF"/>
+            <w:tcBorders>
+              <w:top w:val="single" w:sz="4" w:space="0" w:color="CBD5E1"/>
+              <w:bottom w:val="single" w:sz="4" w:space="0" w:color="CBD5E1"/>
+              <w:left w:val="single" w:sz="4" w:space="0" w:color="CBD5E1"/>
+              <w:right w:val="single" w:sz="4" w:space="0" w:color="CBD5E1"/>
+            </w:tcBorders>
+          </w:tcPr>
+          <w:p>
+            <w:pPr>
+              <w:spacing w:before="0" w:after="0" w:line="252" w:lineRule="auto"/>
+            </w:pPr>
+            <w:r>
+              <w:rPr>
+                <w:rFonts w:ascii="Calibri" w:hAnsi="Calibri"/>
+                <w:color w:val="1E293B"/>
+                <w:sz w:val="16"/>
+              </w:rPr>
+              <w:t>Browser-level mitigation against unauthorized framing &amp; scripts.</w:t>
             </w:r>
           </w:p>
         </w:tc>
@@ -12881,7 +13203,7 @@
         <w:tblLook w:firstColumn="1" w:firstRow="1" w:lastColumn="0" w:lastRow="0" w:noHBand="0" w:noVBand="1" w:val="04A0"/>
       </w:tblPr>
       <w:tblGrid>
-        <w:gridCol w:w="7200"/>
+        <w:gridCol w:w="7344"/>
       </w:tblGrid>
       <w:tr>
         <w:tc>
@@ -12909,7 +13231,7 @@
             <w:r>
               <w:drawing>
                 <wp:inline xmlns:a="http://schemas.openxmlformats.org/drawingml/2006/main" xmlns:pic="http://schemas.openxmlformats.org/drawingml/2006/picture">
-                  <wp:extent cx="4572000" cy="2844949"/>
+                  <wp:extent cx="4663440" cy="2901848"/>
                   <wp:docPr id="5" name="Picture 5"/>
                   <wp:cNvGraphicFramePr>
                     <a:graphicFrameLocks noChangeAspect="1"/>
@@ -12930,7 +13252,7 @@
                         <pic:spPr>
                           <a:xfrm>
                             <a:off x="0" y="0"/>
-                            <a:ext cx="4572000" cy="2844949"/>
+                            <a:ext cx="4663440" cy="2901848"/>
                           </a:xfrm>
                           <a:prstGeom prst="rect"/>
                         </pic:spPr>
@@ -13057,6 +13379,29 @@
         <w:t>Database State Reset Tool: Allows evaluators to reseed database tables to initial pristine values with a single click.</w:t>
       </w:r>
     </w:p>
+    <w:p>
+      <w:pPr>
+        <w:spacing w:before="0" w:after="36" w:line="264" w:lineRule="auto"/>
+        <w:ind w:left="288"/>
+      </w:pPr>
+      <w:r>
+        <w:rPr>
+          <w:rFonts w:ascii="Calibri" w:hAnsi="Calibri"/>
+          <w:b/>
+          <w:color w:val="2B4C7E"/>
+          <w:sz w:val="18"/>
+        </w:rPr>
+        <w:t xml:space="preserve">• </w:t>
+      </w:r>
+      <w:r>
+        <w:rPr>
+          <w:rFonts w:ascii="Calibri" w:hAnsi="Calibri"/>
+          <w:color w:val="1E293B"/>
+          <w:sz w:val="18"/>
+        </w:rPr>
+        <w:t>Security Mode Auditor: Intercepts active session states and verifies execution path routing in real-time.</w:t>
+      </w:r>
+    </w:p>
     <w:tbl>
       <w:tblPr>
         <w:tblW w:type="auto" w:w="0"/>
@@ -13078,8 +13423,8 @@
           <w:tcPr>
             <w:tcW w:type="dxa" w:w="2160"/>
             <w:tcMar>
-              <w:top w:w="20" w:type="dxa"/>
-              <w:bottom w:w="20" w:type="dxa"/>
+              <w:top w:w="22" w:type="dxa"/>
+              <w:bottom w:w="22" w:type="dxa"/>
               <w:left w:w="35" w:type="dxa"/>
               <w:right w:w="35" w:type="dxa"/>
             </w:tcMar>
@@ -13110,8 +13455,8 @@
           <w:tcPr>
             <w:tcW w:type="dxa" w:w="2592"/>
             <w:tcMar>
-              <w:top w:w="20" w:type="dxa"/>
-              <w:bottom w:w="20" w:type="dxa"/>
+              <w:top w:w="22" w:type="dxa"/>
+              <w:bottom w:w="22" w:type="dxa"/>
               <w:left w:w="35" w:type="dxa"/>
               <w:right w:w="35" w:type="dxa"/>
             </w:tcMar>
@@ -13142,8 +13487,8 @@
           <w:tcPr>
             <w:tcW w:type="dxa" w:w="3024"/>
             <w:tcMar>
-              <w:top w:w="20" w:type="dxa"/>
-              <w:bottom w:w="20" w:type="dxa"/>
+              <w:top w:w="22" w:type="dxa"/>
+              <w:bottom w:w="22" w:type="dxa"/>
               <w:left w:w="35" w:type="dxa"/>
               <w:right w:w="35" w:type="dxa"/>
             </w:tcMar>
@@ -13174,8 +13519,8 @@
           <w:tcPr>
             <w:tcW w:type="dxa" w:w="2304"/>
             <w:tcMar>
-              <w:top w:w="20" w:type="dxa"/>
-              <w:bottom w:w="20" w:type="dxa"/>
+              <w:top w:w="22" w:type="dxa"/>
+              <w:bottom w:w="22" w:type="dxa"/>
               <w:left w:w="35" w:type="dxa"/>
               <w:right w:w="35" w:type="dxa"/>
             </w:tcMar>
@@ -13208,8 +13553,8 @@
           <w:tcPr>
             <w:tcW w:type="dxa" w:w="2160"/>
             <w:tcMar>
-              <w:top w:w="16" w:type="dxa"/>
-              <w:bottom w:w="16" w:type="dxa"/>
+              <w:top w:w="18" w:type="dxa"/>
+              <w:bottom w:w="18" w:type="dxa"/>
               <w:left w:w="35" w:type="dxa"/>
               <w:right w:w="35" w:type="dxa"/>
             </w:tcMar>
@@ -13240,8 +13585,8 @@
           <w:tcPr>
             <w:tcW w:type="dxa" w:w="2592"/>
             <w:tcMar>
-              <w:top w:w="16" w:type="dxa"/>
-              <w:bottom w:w="16" w:type="dxa"/>
+              <w:top w:w="18" w:type="dxa"/>
+              <w:bottom w:w="18" w:type="dxa"/>
               <w:left w:w="35" w:type="dxa"/>
               <w:right w:w="35" w:type="dxa"/>
             </w:tcMar>
@@ -13271,8 +13616,8 @@
           <w:tcPr>
             <w:tcW w:type="dxa" w:w="3024"/>
             <w:tcMar>
-              <w:top w:w="16" w:type="dxa"/>
-              <w:bottom w:w="16" w:type="dxa"/>
+              <w:top w:w="18" w:type="dxa"/>
+              <w:bottom w:w="18" w:type="dxa"/>
               <w:left w:w="35" w:type="dxa"/>
               <w:right w:w="35" w:type="dxa"/>
             </w:tcMar>
@@ -13302,8 +13647,8 @@
           <w:tcPr>
             <w:tcW w:type="dxa" w:w="2304"/>
             <w:tcMar>
-              <w:top w:w="16" w:type="dxa"/>
-              <w:bottom w:w="16" w:type="dxa"/>
+              <w:top w:w="18" w:type="dxa"/>
+              <w:bottom w:w="18" w:type="dxa"/>
               <w:left w:w="35" w:type="dxa"/>
               <w:right w:w="35" w:type="dxa"/>
             </w:tcMar>
@@ -13335,8 +13680,8 @@
           <w:tcPr>
             <w:tcW w:type="dxa" w:w="2160"/>
             <w:tcMar>
-              <w:top w:w="16" w:type="dxa"/>
-              <w:bottom w:w="16" w:type="dxa"/>
+              <w:top w:w="18" w:type="dxa"/>
+              <w:bottom w:w="18" w:type="dxa"/>
               <w:left w:w="35" w:type="dxa"/>
               <w:right w:w="35" w:type="dxa"/>
             </w:tcMar>
@@ -13367,8 +13712,8 @@
           <w:tcPr>
             <w:tcW w:type="dxa" w:w="2592"/>
             <w:tcMar>
-              <w:top w:w="16" w:type="dxa"/>
-              <w:bottom w:w="16" w:type="dxa"/>
+              <w:top w:w="18" w:type="dxa"/>
+              <w:bottom w:w="18" w:type="dxa"/>
               <w:left w:w="35" w:type="dxa"/>
               <w:right w:w="35" w:type="dxa"/>
             </w:tcMar>
@@ -13398,8 +13743,8 @@
           <w:tcPr>
             <w:tcW w:type="dxa" w:w="3024"/>
             <w:tcMar>
-              <w:top w:w="16" w:type="dxa"/>
-              <w:bottom w:w="16" w:type="dxa"/>
+              <w:top w:w="18" w:type="dxa"/>
+              <w:bottom w:w="18" w:type="dxa"/>
               <w:left w:w="35" w:type="dxa"/>
               <w:right w:w="35" w:type="dxa"/>
             </w:tcMar>
@@ -13429,8 +13774,8 @@
           <w:tcPr>
             <w:tcW w:type="dxa" w:w="2304"/>
             <w:tcMar>
-              <w:top w:w="16" w:type="dxa"/>
-              <w:bottom w:w="16" w:type="dxa"/>
+              <w:top w:w="18" w:type="dxa"/>
+              <w:bottom w:w="18" w:type="dxa"/>
               <w:left w:w="35" w:type="dxa"/>
               <w:right w:w="35" w:type="dxa"/>
             </w:tcMar>
@@ -13462,8 +13807,8 @@
           <w:tcPr>
             <w:tcW w:type="dxa" w:w="2160"/>
             <w:tcMar>
-              <w:top w:w="16" w:type="dxa"/>
-              <w:bottom w:w="16" w:type="dxa"/>
+              <w:top w:w="18" w:type="dxa"/>
+              <w:bottom w:w="18" w:type="dxa"/>
               <w:left w:w="35" w:type="dxa"/>
               <w:right w:w="35" w:type="dxa"/>
             </w:tcMar>
@@ -13494,8 +13839,8 @@
           <w:tcPr>
             <w:tcW w:type="dxa" w:w="2592"/>
             <w:tcMar>
-              <w:top w:w="16" w:type="dxa"/>
-              <w:bottom w:w="16" w:type="dxa"/>
+              <w:top w:w="18" w:type="dxa"/>
+              <w:bottom w:w="18" w:type="dxa"/>
               <w:left w:w="35" w:type="dxa"/>
               <w:right w:w="35" w:type="dxa"/>
             </w:tcMar>
@@ -13525,8 +13870,8 @@
           <w:tcPr>
             <w:tcW w:type="dxa" w:w="3024"/>
             <w:tcMar>
-              <w:top w:w="16" w:type="dxa"/>
-              <w:bottom w:w="16" w:type="dxa"/>
+              <w:top w:w="18" w:type="dxa"/>
+              <w:bottom w:w="18" w:type="dxa"/>
               <w:left w:w="35" w:type="dxa"/>
               <w:right w:w="35" w:type="dxa"/>
             </w:tcMar>
@@ -13556,8 +13901,8 @@
           <w:tcPr>
             <w:tcW w:type="dxa" w:w="2304"/>
             <w:tcMar>
-              <w:top w:w="16" w:type="dxa"/>
-              <w:bottom w:w="16" w:type="dxa"/>
+              <w:top w:w="18" w:type="dxa"/>
+              <w:bottom w:w="18" w:type="dxa"/>
               <w:left w:w="35" w:type="dxa"/>
               <w:right w:w="35" w:type="dxa"/>
             </w:tcMar>
@@ -13580,6 +13925,133 @@
                 <w:sz w:val="16"/>
               </w:rPr>
               <w:t>Restricted to authorized administrator session</w:t>
+            </w:r>
+          </w:p>
+        </w:tc>
+      </w:tr>
+      <w:tr>
+        <w:tc>
+          <w:tcPr>
+            <w:tcW w:type="dxa" w:w="2160"/>
+            <w:tcMar>
+              <w:top w:w="18" w:type="dxa"/>
+              <w:bottom w:w="18" w:type="dxa"/>
+              <w:left w:w="35" w:type="dxa"/>
+              <w:right w:w="35" w:type="dxa"/>
+            </w:tcMar>
+            <w:shd w:fill="F8FAFC"/>
+            <w:tcBorders>
+              <w:top w:val="single" w:sz="4" w:space="0" w:color="CBD5E1"/>
+              <w:bottom w:val="single" w:sz="4" w:space="0" w:color="CBD5E1"/>
+              <w:left w:val="single" w:sz="4" w:space="0" w:color="CBD5E1"/>
+              <w:right w:val="single" w:sz="4" w:space="0" w:color="CBD5E1"/>
+            </w:tcBorders>
+          </w:tcPr>
+          <w:p>
+            <w:pPr>
+              <w:spacing w:before="0" w:after="0" w:line="252" w:lineRule="auto"/>
+            </w:pPr>
+            <w:r>
+              <w:rPr>
+                <w:rFonts w:ascii="Calibri" w:hAnsi="Calibri"/>
+                <w:b/>
+                <w:color w:val="1B365D"/>
+                <w:sz w:val="16"/>
+              </w:rPr>
+              <w:t>Telemetry Audit</w:t>
+            </w:r>
+          </w:p>
+        </w:tc>
+        <w:tc>
+          <w:tcPr>
+            <w:tcW w:type="dxa" w:w="2592"/>
+            <w:tcMar>
+              <w:top w:w="18" w:type="dxa"/>
+              <w:bottom w:w="18" w:type="dxa"/>
+              <w:left w:w="35" w:type="dxa"/>
+              <w:right w:w="35" w:type="dxa"/>
+            </w:tcMar>
+            <w:shd w:fill="F8FAFC"/>
+            <w:tcBorders>
+              <w:top w:val="single" w:sz="4" w:space="0" w:color="CBD5E1"/>
+              <w:bottom w:val="single" w:sz="4" w:space="0" w:color="CBD5E1"/>
+              <w:left w:val="single" w:sz="4" w:space="0" w:color="CBD5E1"/>
+              <w:right w:val="single" w:sz="4" w:space="0" w:color="CBD5E1"/>
+            </w:tcBorders>
+          </w:tcPr>
+          <w:p>
+            <w:pPr>
+              <w:spacing w:before="0" w:after="0" w:line="252" w:lineRule="auto"/>
+            </w:pPr>
+            <w:r>
+              <w:rPr>
+                <w:rFonts w:ascii="Calibri" w:hAnsi="Calibri"/>
+                <w:color w:val="1E293B"/>
+                <w:sz w:val="16"/>
+              </w:rPr>
+              <w:t>api.php?action=telemetry</w:t>
+            </w:r>
+          </w:p>
+        </w:tc>
+        <w:tc>
+          <w:tcPr>
+            <w:tcW w:type="dxa" w:w="3024"/>
+            <w:tcMar>
+              <w:top w:w="18" w:type="dxa"/>
+              <w:bottom w:w="18" w:type="dxa"/>
+              <w:left w:w="35" w:type="dxa"/>
+              <w:right w:w="35" w:type="dxa"/>
+            </w:tcMar>
+            <w:shd w:fill="F8FAFC"/>
+            <w:tcBorders>
+              <w:top w:val="single" w:sz="4" w:space="0" w:color="CBD5E1"/>
+              <w:bottom w:val="single" w:sz="4" w:space="0" w:color="CBD5E1"/>
+              <w:left w:val="single" w:sz="4" w:space="0" w:color="CBD5E1"/>
+              <w:right w:val="single" w:sz="4" w:space="0" w:color="CBD5E1"/>
+            </w:tcBorders>
+          </w:tcPr>
+          <w:p>
+            <w:pPr>
+              <w:spacing w:before="0" w:after="0" w:line="252" w:lineRule="auto"/>
+            </w:pPr>
+            <w:r>
+              <w:rPr>
+                <w:rFonts w:ascii="Calibri" w:hAnsi="Calibri"/>
+                <w:color w:val="1E293B"/>
+                <w:sz w:val="16"/>
+              </w:rPr>
+              <w:t>JSON stream generation &amp; egress</w:t>
+            </w:r>
+          </w:p>
+        </w:tc>
+        <w:tc>
+          <w:tcPr>
+            <w:tcW w:type="dxa" w:w="2304"/>
+            <w:tcMar>
+              <w:top w:w="18" w:type="dxa"/>
+              <w:bottom w:w="18" w:type="dxa"/>
+              <w:left w:w="35" w:type="dxa"/>
+              <w:right w:w="35" w:type="dxa"/>
+            </w:tcMar>
+            <w:shd w:fill="F8FAFC"/>
+            <w:tcBorders>
+              <w:top w:val="single" w:sz="4" w:space="0" w:color="CBD5E1"/>
+              <w:bottom w:val="single" w:sz="4" w:space="0" w:color="CBD5E1"/>
+              <w:left w:val="single" w:sz="4" w:space="0" w:color="CBD5E1"/>
+              <w:right w:val="single" w:sz="4" w:space="0" w:color="CBD5E1"/>
+            </w:tcBorders>
+          </w:tcPr>
+          <w:p>
+            <w:pPr>
+              <w:spacing w:before="0" w:after="0" w:line="252" w:lineRule="auto"/>
+            </w:pPr>
+            <w:r>
+              <w:rPr>
+                <w:rFonts w:ascii="Calibri" w:hAnsi="Calibri"/>
+                <w:color w:val="1E293B"/>
+                <w:sz w:val="16"/>
+              </w:rPr>
+              <w:t>Real-time query and defense inspection</w:t>
             </w:r>
           </w:p>
         </w:tc>
@@ -18725,7 +19197,7 @@
         <w:tblLook w:firstColumn="1" w:firstRow="1" w:lastColumn="0" w:lastRow="0" w:noHBand="0" w:noVBand="1" w:val="04A0"/>
       </w:tblPr>
       <w:tblGrid>
-        <w:gridCol w:w="4032"/>
+        <w:gridCol w:w="4608"/>
       </w:tblGrid>
       <w:tr>
         <w:tc>
@@ -18753,7 +19225,7 @@
             <w:r>
               <w:drawing>
                 <wp:inline xmlns:a="http://schemas.openxmlformats.org/drawingml/2006/main" xmlns:pic="http://schemas.openxmlformats.org/drawingml/2006/picture">
-                  <wp:extent cx="2560320" cy="2429933"/>
+                  <wp:extent cx="2926080" cy="2777066"/>
                   <wp:docPr id="12" name="Picture 12"/>
                   <wp:cNvGraphicFramePr>
                     <a:graphicFrameLocks noChangeAspect="1"/>
@@ -18774,7 +19246,7 @@
                         <pic:spPr>
                           <a:xfrm>
                             <a:off x="0" y="0"/>
-                            <a:ext cx="2560320" cy="2429933"/>
+                            <a:ext cx="2926080" cy="2777066"/>
                           </a:xfrm>
                           <a:prstGeom prst="rect"/>
                         </pic:spPr>
@@ -18802,6 +19274,413 @@
         </w:rPr>
         <w:t>Figure: Directory Traversal Vulnerable Mode: Relative Path Climbing (../) Dumps database.sql</w:t>
       </w:r>
+    </w:p>
+    <w:tbl>
+      <w:tblPr>
+        <w:tblW w:type="auto" w:w="0"/>
+        <w:jc w:val="center"/>
+        <w:tblLayout w:type="fixed"/>
+        <w:tblLook w:firstColumn="1" w:firstRow="1" w:lastColumn="0" w:lastRow="0" w:noHBand="0" w:noVBand="1" w:val="04A0"/>
+      </w:tblPr>
+      <w:tblGrid>
+        <w:gridCol w:w="3360"/>
+        <w:gridCol w:w="3360"/>
+        <w:gridCol w:w="3360"/>
+      </w:tblGrid>
+      <w:tr>
+        <w:trPr>
+          <w:tblHeader/>
+        </w:trPr>
+        <w:tc>
+          <w:tcPr>
+            <w:tcW w:type="dxa" w:w="3168"/>
+            <w:tcMar>
+              <w:top w:w="18" w:type="dxa"/>
+              <w:bottom w:w="18" w:type="dxa"/>
+              <w:left w:w="35" w:type="dxa"/>
+              <w:right w:w="35" w:type="dxa"/>
+            </w:tcMar>
+            <w:shd w:fill="1B365D"/>
+            <w:tcBorders>
+              <w:top w:val="single" w:sz="4" w:space="0" w:color="1B365D"/>
+              <w:bottom w:val="single" w:sz="6" w:space="0" w:color="1B365D"/>
+              <w:left w:val="single" w:sz="4" w:space="0" w:color="CBD5E1"/>
+              <w:right w:val="single" w:sz="4" w:space="0" w:color="CBD5E1"/>
+            </w:tcBorders>
+          </w:tcPr>
+          <w:p>
+            <w:pPr>
+              <w:spacing w:before="0" w:after="0" w:line="252" w:lineRule="auto"/>
+            </w:pPr>
+            <w:r>
+              <w:rPr>
+                <w:rFonts w:ascii="Calibri" w:hAnsi="Calibri"/>
+                <w:b/>
+                <w:color w:val="FFFFFF"/>
+                <w:sz w:val="17"/>
+              </w:rPr>
+              <w:t>Traversal Target Vector</w:t>
+            </w:r>
+          </w:p>
+        </w:tc>
+        <w:tc>
+          <w:tcPr>
+            <w:tcW w:type="dxa" w:w="3744"/>
+            <w:tcMar>
+              <w:top w:w="18" w:type="dxa"/>
+              <w:bottom w:w="18" w:type="dxa"/>
+              <w:left w:w="35" w:type="dxa"/>
+              <w:right w:w="35" w:type="dxa"/>
+            </w:tcMar>
+            <w:shd w:fill="1B365D"/>
+            <w:tcBorders>
+              <w:top w:val="single" w:sz="4" w:space="0" w:color="1B365D"/>
+              <w:bottom w:val="single" w:sz="6" w:space="0" w:color="1B365D"/>
+              <w:left w:val="single" w:sz="4" w:space="0" w:color="CBD5E1"/>
+              <w:right w:val="single" w:sz="4" w:space="0" w:color="CBD5E1"/>
+            </w:tcBorders>
+          </w:tcPr>
+          <w:p>
+            <w:pPr>
+              <w:spacing w:before="0" w:after="0" w:line="252" w:lineRule="auto"/>
+            </w:pPr>
+            <w:r>
+              <w:rPr>
+                <w:rFonts w:ascii="Calibri" w:hAnsi="Calibri"/>
+                <w:b/>
+                <w:color w:val="FFFFFF"/>
+                <w:sz w:val="17"/>
+              </w:rPr>
+              <w:t>Target Resource Exposed</w:t>
+            </w:r>
+          </w:p>
+        </w:tc>
+        <w:tc>
+          <w:tcPr>
+            <w:tcW w:type="dxa" w:w="3168"/>
+            <w:tcMar>
+              <w:top w:w="18" w:type="dxa"/>
+              <w:bottom w:w="18" w:type="dxa"/>
+              <w:left w:w="35" w:type="dxa"/>
+              <w:right w:w="35" w:type="dxa"/>
+            </w:tcMar>
+            <w:shd w:fill="1B365D"/>
+            <w:tcBorders>
+              <w:top w:val="single" w:sz="4" w:space="0" w:color="1B365D"/>
+              <w:bottom w:val="single" w:sz="6" w:space="0" w:color="1B365D"/>
+              <w:left w:val="single" w:sz="4" w:space="0" w:color="CBD5E1"/>
+              <w:right w:val="single" w:sz="4" w:space="0" w:color="CBD5E1"/>
+            </w:tcBorders>
+          </w:tcPr>
+          <w:p>
+            <w:pPr>
+              <w:spacing w:before="0" w:after="0" w:line="252" w:lineRule="auto"/>
+            </w:pPr>
+            <w:r>
+              <w:rPr>
+                <w:rFonts w:ascii="Calibri" w:hAnsi="Calibri"/>
+                <w:b/>
+                <w:color w:val="FFFFFF"/>
+                <w:sz w:val="17"/>
+              </w:rPr>
+              <w:t>Enterprise Impact Severity</w:t>
+            </w:r>
+          </w:p>
+        </w:tc>
+      </w:tr>
+      <w:tr>
+        <w:tc>
+          <w:tcPr>
+            <w:tcW w:type="dxa" w:w="3168"/>
+            <w:tcMar>
+              <w:top w:w="14" w:type="dxa"/>
+              <w:bottom w:w="14" w:type="dxa"/>
+              <w:left w:w="35" w:type="dxa"/>
+              <w:right w:w="35" w:type="dxa"/>
+            </w:tcMar>
+            <w:shd w:fill="FFFFFF"/>
+            <w:tcBorders>
+              <w:top w:val="single" w:sz="4" w:space="0" w:color="CBD5E1"/>
+              <w:bottom w:val="single" w:sz="4" w:space="0" w:color="CBD5E1"/>
+              <w:left w:val="single" w:sz="4" w:space="0" w:color="CBD5E1"/>
+              <w:right w:val="single" w:sz="4" w:space="0" w:color="CBD5E1"/>
+            </w:tcBorders>
+          </w:tcPr>
+          <w:p>
+            <w:pPr>
+              <w:spacing w:before="0" w:after="0" w:line="252" w:lineRule="auto"/>
+            </w:pPr>
+            <w:r>
+              <w:rPr>
+                <w:rFonts w:ascii="Calibri" w:hAnsi="Calibri"/>
+                <w:b/>
+                <w:color w:val="1B365D"/>
+                <w:sz w:val="16"/>
+              </w:rPr>
+              <w:t>../database.sql</w:t>
+            </w:r>
+          </w:p>
+        </w:tc>
+        <w:tc>
+          <w:tcPr>
+            <w:tcW w:type="dxa" w:w="3744"/>
+            <w:tcMar>
+              <w:top w:w="14" w:type="dxa"/>
+              <w:bottom w:w="14" w:type="dxa"/>
+              <w:left w:w="35" w:type="dxa"/>
+              <w:right w:w="35" w:type="dxa"/>
+            </w:tcMar>
+            <w:shd w:fill="FFFFFF"/>
+            <w:tcBorders>
+              <w:top w:val="single" w:sz="4" w:space="0" w:color="CBD5E1"/>
+              <w:bottom w:val="single" w:sz="4" w:space="0" w:color="CBD5E1"/>
+              <w:left w:val="single" w:sz="4" w:space="0" w:color="CBD5E1"/>
+              <w:right w:val="single" w:sz="4" w:space="0" w:color="CBD5E1"/>
+            </w:tcBorders>
+          </w:tcPr>
+          <w:p>
+            <w:pPr>
+              <w:spacing w:before="0" w:after="0" w:line="252" w:lineRule="auto"/>
+            </w:pPr>
+            <w:r>
+              <w:rPr>
+                <w:rFonts w:ascii="Calibri" w:hAnsi="Calibri"/>
+                <w:color w:val="1E293B"/>
+                <w:sz w:val="16"/>
+              </w:rPr>
+              <w:t>Database schema fixtures &amp; initial seeds</w:t>
+            </w:r>
+          </w:p>
+        </w:tc>
+        <w:tc>
+          <w:tcPr>
+            <w:tcW w:type="dxa" w:w="3168"/>
+            <w:tcMar>
+              <w:top w:w="14" w:type="dxa"/>
+              <w:bottom w:w="14" w:type="dxa"/>
+              <w:left w:w="35" w:type="dxa"/>
+              <w:right w:w="35" w:type="dxa"/>
+            </w:tcMar>
+            <w:shd w:fill="FFFFFF"/>
+            <w:tcBorders>
+              <w:top w:val="single" w:sz="4" w:space="0" w:color="CBD5E1"/>
+              <w:bottom w:val="single" w:sz="4" w:space="0" w:color="CBD5E1"/>
+              <w:left w:val="single" w:sz="4" w:space="0" w:color="CBD5E1"/>
+              <w:right w:val="single" w:sz="4" w:space="0" w:color="CBD5E1"/>
+            </w:tcBorders>
+          </w:tcPr>
+          <w:p>
+            <w:pPr>
+              <w:spacing w:before="0" w:after="0" w:line="252" w:lineRule="auto"/>
+            </w:pPr>
+            <w:r>
+              <w:rPr>
+                <w:rFonts w:ascii="Calibri" w:hAnsi="Calibri"/>
+                <w:color w:val="1E293B"/>
+                <w:sz w:val="16"/>
+              </w:rPr>
+              <w:t>HIGH (Schema topology exposure)</w:t>
+            </w:r>
+          </w:p>
+        </w:tc>
+      </w:tr>
+      <w:tr>
+        <w:tc>
+          <w:tcPr>
+            <w:tcW w:type="dxa" w:w="3168"/>
+            <w:tcMar>
+              <w:top w:w="14" w:type="dxa"/>
+              <w:bottom w:w="14" w:type="dxa"/>
+              <w:left w:w="35" w:type="dxa"/>
+              <w:right w:w="35" w:type="dxa"/>
+            </w:tcMar>
+            <w:shd w:fill="F8FAFC"/>
+            <w:tcBorders>
+              <w:top w:val="single" w:sz="4" w:space="0" w:color="CBD5E1"/>
+              <w:bottom w:val="single" w:sz="4" w:space="0" w:color="CBD5E1"/>
+              <w:left w:val="single" w:sz="4" w:space="0" w:color="CBD5E1"/>
+              <w:right w:val="single" w:sz="4" w:space="0" w:color="CBD5E1"/>
+            </w:tcBorders>
+          </w:tcPr>
+          <w:p>
+            <w:pPr>
+              <w:spacing w:before="0" w:after="0" w:line="252" w:lineRule="auto"/>
+            </w:pPr>
+            <w:r>
+              <w:rPr>
+                <w:rFonts w:ascii="Calibri" w:hAnsi="Calibri"/>
+                <w:b/>
+                <w:color w:val="1B365D"/>
+                <w:sz w:val="16"/>
+              </w:rPr>
+              <w:t>../../apache/conf/httpd.conf</w:t>
+            </w:r>
+          </w:p>
+        </w:tc>
+        <w:tc>
+          <w:tcPr>
+            <w:tcW w:type="dxa" w:w="3744"/>
+            <w:tcMar>
+              <w:top w:w="14" w:type="dxa"/>
+              <w:bottom w:w="14" w:type="dxa"/>
+              <w:left w:w="35" w:type="dxa"/>
+              <w:right w:w="35" w:type="dxa"/>
+            </w:tcMar>
+            <w:shd w:fill="F8FAFC"/>
+            <w:tcBorders>
+              <w:top w:val="single" w:sz="4" w:space="0" w:color="CBD5E1"/>
+              <w:bottom w:val="single" w:sz="4" w:space="0" w:color="CBD5E1"/>
+              <w:left w:val="single" w:sz="4" w:space="0" w:color="CBD5E1"/>
+              <w:right w:val="single" w:sz="4" w:space="0" w:color="CBD5E1"/>
+            </w:tcBorders>
+          </w:tcPr>
+          <w:p>
+            <w:pPr>
+              <w:spacing w:before="0" w:after="0" w:line="252" w:lineRule="auto"/>
+            </w:pPr>
+            <w:r>
+              <w:rPr>
+                <w:rFonts w:ascii="Calibri" w:hAnsi="Calibri"/>
+                <w:color w:val="1E293B"/>
+                <w:sz w:val="16"/>
+              </w:rPr>
+              <w:t>Apache web server configuration</w:t>
+            </w:r>
+          </w:p>
+        </w:tc>
+        <w:tc>
+          <w:tcPr>
+            <w:tcW w:type="dxa" w:w="3168"/>
+            <w:tcMar>
+              <w:top w:w="14" w:type="dxa"/>
+              <w:bottom w:w="14" w:type="dxa"/>
+              <w:left w:w="35" w:type="dxa"/>
+              <w:right w:w="35" w:type="dxa"/>
+            </w:tcMar>
+            <w:shd w:fill="F8FAFC"/>
+            <w:tcBorders>
+              <w:top w:val="single" w:sz="4" w:space="0" w:color="CBD5E1"/>
+              <w:bottom w:val="single" w:sz="4" w:space="0" w:color="CBD5E1"/>
+              <w:left w:val="single" w:sz="4" w:space="0" w:color="CBD5E1"/>
+              <w:right w:val="single" w:sz="4" w:space="0" w:color="CBD5E1"/>
+            </w:tcBorders>
+          </w:tcPr>
+          <w:p>
+            <w:pPr>
+              <w:spacing w:before="0" w:after="0" w:line="252" w:lineRule="auto"/>
+            </w:pPr>
+            <w:r>
+              <w:rPr>
+                <w:rFonts w:ascii="Calibri" w:hAnsi="Calibri"/>
+                <w:color w:val="1E293B"/>
+                <w:sz w:val="16"/>
+              </w:rPr>
+              <w:t>CRITICAL (Infrastructure reconnaissance)</w:t>
+            </w:r>
+          </w:p>
+        </w:tc>
+      </w:tr>
+      <w:tr>
+        <w:tc>
+          <w:tcPr>
+            <w:tcW w:type="dxa" w:w="3168"/>
+            <w:tcMar>
+              <w:top w:w="14" w:type="dxa"/>
+              <w:bottom w:w="14" w:type="dxa"/>
+              <w:left w:w="35" w:type="dxa"/>
+              <w:right w:w="35" w:type="dxa"/>
+            </w:tcMar>
+            <w:shd w:fill="FFFFFF"/>
+            <w:tcBorders>
+              <w:top w:val="single" w:sz="4" w:space="0" w:color="CBD5E1"/>
+              <w:bottom w:val="single" w:sz="4" w:space="0" w:color="CBD5E1"/>
+              <w:left w:val="single" w:sz="4" w:space="0" w:color="CBD5E1"/>
+              <w:right w:val="single" w:sz="4" w:space="0" w:color="CBD5E1"/>
+            </w:tcBorders>
+          </w:tcPr>
+          <w:p>
+            <w:pPr>
+              <w:spacing w:before="0" w:after="0" w:line="252" w:lineRule="auto"/>
+            </w:pPr>
+            <w:r>
+              <w:rPr>
+                <w:rFonts w:ascii="Calibri" w:hAnsi="Calibri"/>
+                <w:b/>
+                <w:color w:val="1B365D"/>
+                <w:sz w:val="16"/>
+              </w:rPr>
+              <w:t>../../php/php.ini</w:t>
+            </w:r>
+          </w:p>
+        </w:tc>
+        <w:tc>
+          <w:tcPr>
+            <w:tcW w:type="dxa" w:w="3744"/>
+            <w:tcMar>
+              <w:top w:w="14" w:type="dxa"/>
+              <w:bottom w:w="14" w:type="dxa"/>
+              <w:left w:w="35" w:type="dxa"/>
+              <w:right w:w="35" w:type="dxa"/>
+            </w:tcMar>
+            <w:shd w:fill="FFFFFF"/>
+            <w:tcBorders>
+              <w:top w:val="single" w:sz="4" w:space="0" w:color="CBD5E1"/>
+              <w:bottom w:val="single" w:sz="4" w:space="0" w:color="CBD5E1"/>
+              <w:left w:val="single" w:sz="4" w:space="0" w:color="CBD5E1"/>
+              <w:right w:val="single" w:sz="4" w:space="0" w:color="CBD5E1"/>
+            </w:tcBorders>
+          </w:tcPr>
+          <w:p>
+            <w:pPr>
+              <w:spacing w:before="0" w:after="0" w:line="252" w:lineRule="auto"/>
+            </w:pPr>
+            <w:r>
+              <w:rPr>
+                <w:rFonts w:ascii="Calibri" w:hAnsi="Calibri"/>
+                <w:color w:val="1E293B"/>
+                <w:sz w:val="16"/>
+              </w:rPr>
+              <w:t>PHP runtime engine configuration &amp; secrets</w:t>
+            </w:r>
+          </w:p>
+        </w:tc>
+        <w:tc>
+          <w:tcPr>
+            <w:tcW w:type="dxa" w:w="3168"/>
+            <w:tcMar>
+              <w:top w:w="14" w:type="dxa"/>
+              <w:bottom w:w="14" w:type="dxa"/>
+              <w:left w:w="35" w:type="dxa"/>
+              <w:right w:w="35" w:type="dxa"/>
+            </w:tcMar>
+            <w:shd w:fill="FFFFFF"/>
+            <w:tcBorders>
+              <w:top w:val="single" w:sz="4" w:space="0" w:color="CBD5E1"/>
+              <w:bottom w:val="single" w:sz="4" w:space="0" w:color="CBD5E1"/>
+              <w:left w:val="single" w:sz="4" w:space="0" w:color="CBD5E1"/>
+              <w:right w:val="single" w:sz="4" w:space="0" w:color="CBD5E1"/>
+            </w:tcBorders>
+          </w:tcPr>
+          <w:p>
+            <w:pPr>
+              <w:spacing w:before="0" w:after="0" w:line="252" w:lineRule="auto"/>
+            </w:pPr>
+            <w:r>
+              <w:rPr>
+                <w:rFonts w:ascii="Calibri" w:hAnsi="Calibri"/>
+                <w:color w:val="1E293B"/>
+                <w:sz w:val="16"/>
+              </w:rPr>
+              <w:t>CRITICAL (Runtime environment compromise)</w:t>
+            </w:r>
+          </w:p>
+        </w:tc>
+      </w:tr>
+    </w:tbl>
+    <w:p>
+      <w:pPr>
+        <w:spacing w:before="0" w:after="30"/>
+      </w:pPr>
     </w:p>
     <w:tbl>
       <w:tblPr>
@@ -24581,8 +25460,8 @@
           <w:tcPr>
             <w:tcW w:type="dxa" w:w="864"/>
             <w:tcMar>
-              <w:top w:w="20" w:type="dxa"/>
-              <w:bottom w:w="20" w:type="dxa"/>
+              <w:top w:w="28" w:type="dxa"/>
+              <w:bottom w:w="28" w:type="dxa"/>
               <w:left w:w="35" w:type="dxa"/>
               <w:right w:w="35" w:type="dxa"/>
             </w:tcMar>
@@ -24613,8 +25492,8 @@
           <w:tcPr>
             <w:tcW w:type="dxa" w:w="2016"/>
             <w:tcMar>
-              <w:top w:w="20" w:type="dxa"/>
-              <w:bottom w:w="20" w:type="dxa"/>
+              <w:top w:w="28" w:type="dxa"/>
+              <w:bottom w:w="28" w:type="dxa"/>
               <w:left w:w="35" w:type="dxa"/>
               <w:right w:w="35" w:type="dxa"/>
             </w:tcMar>
@@ -24645,8 +25524,8 @@
           <w:tcPr>
             <w:tcW w:type="dxa" w:w="2592"/>
             <w:tcMar>
-              <w:top w:w="20" w:type="dxa"/>
-              <w:bottom w:w="20" w:type="dxa"/>
+              <w:top w:w="28" w:type="dxa"/>
+              <w:bottom w:w="28" w:type="dxa"/>
               <w:left w:w="35" w:type="dxa"/>
               <w:right w:w="35" w:type="dxa"/>
             </w:tcMar>
@@ -24677,8 +25556,8 @@
           <w:tcPr>
             <w:tcW w:type="dxa" w:w="3744"/>
             <w:tcMar>
-              <w:top w:w="20" w:type="dxa"/>
-              <w:bottom w:w="20" w:type="dxa"/>
+              <w:top w:w="28" w:type="dxa"/>
+              <w:bottom w:w="28" w:type="dxa"/>
               <w:left w:w="35" w:type="dxa"/>
               <w:right w:w="35" w:type="dxa"/>
             </w:tcMar>
@@ -24709,8 +25588,8 @@
           <w:tcPr>
             <w:tcW w:type="dxa" w:w="864"/>
             <w:tcMar>
-              <w:top w:w="20" w:type="dxa"/>
-              <w:bottom w:w="20" w:type="dxa"/>
+              <w:top w:w="28" w:type="dxa"/>
+              <w:bottom w:w="28" w:type="dxa"/>
               <w:left w:w="35" w:type="dxa"/>
               <w:right w:w="35" w:type="dxa"/>
             </w:tcMar>
@@ -24743,8 +25622,8 @@
           <w:tcPr>
             <w:tcW w:type="dxa" w:w="864"/>
             <w:tcMar>
-              <w:top w:w="16" w:type="dxa"/>
-              <w:bottom w:w="16" w:type="dxa"/>
+              <w:top w:w="24" w:type="dxa"/>
+              <w:bottom w:w="24" w:type="dxa"/>
               <w:left w:w="35" w:type="dxa"/>
               <w:right w:w="35" w:type="dxa"/>
             </w:tcMar>
@@ -24775,8 +25654,8 @@
           <w:tcPr>
             <w:tcW w:type="dxa" w:w="2016"/>
             <w:tcMar>
-              <w:top w:w="16" w:type="dxa"/>
-              <w:bottom w:w="16" w:type="dxa"/>
+              <w:top w:w="24" w:type="dxa"/>
+              <w:bottom w:w="24" w:type="dxa"/>
               <w:left w:w="35" w:type="dxa"/>
               <w:right w:w="35" w:type="dxa"/>
             </w:tcMar>
@@ -24806,8 +25685,8 @@
           <w:tcPr>
             <w:tcW w:type="dxa" w:w="2592"/>
             <w:tcMar>
-              <w:top w:w="16" w:type="dxa"/>
-              <w:bottom w:w="16" w:type="dxa"/>
+              <w:top w:w="24" w:type="dxa"/>
+              <w:bottom w:w="24" w:type="dxa"/>
               <w:left w:w="35" w:type="dxa"/>
               <w:right w:w="35" w:type="dxa"/>
             </w:tcMar>
@@ -24837,8 +25716,8 @@
           <w:tcPr>
             <w:tcW w:type="dxa" w:w="3744"/>
             <w:tcMar>
-              <w:top w:w="16" w:type="dxa"/>
-              <w:bottom w:w="16" w:type="dxa"/>
+              <w:top w:w="24" w:type="dxa"/>
+              <w:bottom w:w="24" w:type="dxa"/>
               <w:left w:w="35" w:type="dxa"/>
               <w:right w:w="35" w:type="dxa"/>
             </w:tcMar>
@@ -24868,8 +25747,8 @@
           <w:tcPr>
             <w:tcW w:type="dxa" w:w="864"/>
             <w:tcMar>
-              <w:top w:w="16" w:type="dxa"/>
-              <w:bottom w:w="16" w:type="dxa"/>
+              <w:top w:w="24" w:type="dxa"/>
+              <w:bottom w:w="24" w:type="dxa"/>
               <w:left w:w="35" w:type="dxa"/>
               <w:right w:w="35" w:type="dxa"/>
             </w:tcMar>
@@ -24901,8 +25780,8 @@
           <w:tcPr>
             <w:tcW w:type="dxa" w:w="864"/>
             <w:tcMar>
-              <w:top w:w="16" w:type="dxa"/>
-              <w:bottom w:w="16" w:type="dxa"/>
+              <w:top w:w="24" w:type="dxa"/>
+              <w:bottom w:w="24" w:type="dxa"/>
               <w:left w:w="35" w:type="dxa"/>
               <w:right w:w="35" w:type="dxa"/>
             </w:tcMar>
@@ -24933,8 +25812,8 @@
           <w:tcPr>
             <w:tcW w:type="dxa" w:w="2016"/>
             <w:tcMar>
-              <w:top w:w="16" w:type="dxa"/>
-              <w:bottom w:w="16" w:type="dxa"/>
+              <w:top w:w="24" w:type="dxa"/>
+              <w:bottom w:w="24" w:type="dxa"/>
               <w:left w:w="35" w:type="dxa"/>
               <w:right w:w="35" w:type="dxa"/>
             </w:tcMar>
@@ -24964,8 +25843,8 @@
           <w:tcPr>
             <w:tcW w:type="dxa" w:w="2592"/>
             <w:tcMar>
-              <w:top w:w="16" w:type="dxa"/>
-              <w:bottom w:w="16" w:type="dxa"/>
+              <w:top w:w="24" w:type="dxa"/>
+              <w:bottom w:w="24" w:type="dxa"/>
               <w:left w:w="35" w:type="dxa"/>
               <w:right w:w="35" w:type="dxa"/>
             </w:tcMar>
@@ -24995,8 +25874,8 @@
           <w:tcPr>
             <w:tcW w:type="dxa" w:w="3744"/>
             <w:tcMar>
-              <w:top w:w="16" w:type="dxa"/>
-              <w:bottom w:w="16" w:type="dxa"/>
+              <w:top w:w="24" w:type="dxa"/>
+              <w:bottom w:w="24" w:type="dxa"/>
               <w:left w:w="35" w:type="dxa"/>
               <w:right w:w="35" w:type="dxa"/>
             </w:tcMar>
@@ -25026,8 +25905,8 @@
           <w:tcPr>
             <w:tcW w:type="dxa" w:w="864"/>
             <w:tcMar>
-              <w:top w:w="16" w:type="dxa"/>
-              <w:bottom w:w="16" w:type="dxa"/>
+              <w:top w:w="24" w:type="dxa"/>
+              <w:bottom w:w="24" w:type="dxa"/>
               <w:left w:w="35" w:type="dxa"/>
               <w:right w:w="35" w:type="dxa"/>
             </w:tcMar>
@@ -25059,8 +25938,8 @@
           <w:tcPr>
             <w:tcW w:type="dxa" w:w="864"/>
             <w:tcMar>
-              <w:top w:w="16" w:type="dxa"/>
-              <w:bottom w:w="16" w:type="dxa"/>
+              <w:top w:w="24" w:type="dxa"/>
+              <w:bottom w:w="24" w:type="dxa"/>
               <w:left w:w="35" w:type="dxa"/>
               <w:right w:w="35" w:type="dxa"/>
             </w:tcMar>
@@ -25091,8 +25970,8 @@
           <w:tcPr>
             <w:tcW w:type="dxa" w:w="2016"/>
             <w:tcMar>
-              <w:top w:w="16" w:type="dxa"/>
-              <w:bottom w:w="16" w:type="dxa"/>
+              <w:top w:w="24" w:type="dxa"/>
+              <w:bottom w:w="24" w:type="dxa"/>
               <w:left w:w="35" w:type="dxa"/>
               <w:right w:w="35" w:type="dxa"/>
             </w:tcMar>
@@ -25122,8 +26001,8 @@
           <w:tcPr>
             <w:tcW w:type="dxa" w:w="2592"/>
             <w:tcMar>
-              <w:top w:w="16" w:type="dxa"/>
-              <w:bottom w:w="16" w:type="dxa"/>
+              <w:top w:w="24" w:type="dxa"/>
+              <w:bottom w:w="24" w:type="dxa"/>
               <w:left w:w="35" w:type="dxa"/>
               <w:right w:w="35" w:type="dxa"/>
             </w:tcMar>
@@ -25153,8 +26032,8 @@
           <w:tcPr>
             <w:tcW w:type="dxa" w:w="3744"/>
             <w:tcMar>
-              <w:top w:w="16" w:type="dxa"/>
-              <w:bottom w:w="16" w:type="dxa"/>
+              <w:top w:w="24" w:type="dxa"/>
+              <w:bottom w:w="24" w:type="dxa"/>
               <w:left w:w="35" w:type="dxa"/>
               <w:right w:w="35" w:type="dxa"/>
             </w:tcMar>
@@ -25184,8 +26063,8 @@
           <w:tcPr>
             <w:tcW w:type="dxa" w:w="864"/>
             <w:tcMar>
-              <w:top w:w="16" w:type="dxa"/>
-              <w:bottom w:w="16" w:type="dxa"/>
+              <w:top w:w="24" w:type="dxa"/>
+              <w:bottom w:w="24" w:type="dxa"/>
               <w:left w:w="35" w:type="dxa"/>
               <w:right w:w="35" w:type="dxa"/>
             </w:tcMar>
@@ -25217,8 +26096,8 @@
           <w:tcPr>
             <w:tcW w:type="dxa" w:w="864"/>
             <w:tcMar>
-              <w:top w:w="16" w:type="dxa"/>
-              <w:bottom w:w="16" w:type="dxa"/>
+              <w:top w:w="24" w:type="dxa"/>
+              <w:bottom w:w="24" w:type="dxa"/>
               <w:left w:w="35" w:type="dxa"/>
               <w:right w:w="35" w:type="dxa"/>
             </w:tcMar>
@@ -25249,8 +26128,8 @@
           <w:tcPr>
             <w:tcW w:type="dxa" w:w="2016"/>
             <w:tcMar>
-              <w:top w:w="16" w:type="dxa"/>
-              <w:bottom w:w="16" w:type="dxa"/>
+              <w:top w:w="24" w:type="dxa"/>
+              <w:bottom w:w="24" w:type="dxa"/>
               <w:left w:w="35" w:type="dxa"/>
               <w:right w:w="35" w:type="dxa"/>
             </w:tcMar>
@@ -25280,8 +26159,8 @@
           <w:tcPr>
             <w:tcW w:type="dxa" w:w="2592"/>
             <w:tcMar>
-              <w:top w:w="16" w:type="dxa"/>
-              <w:bottom w:w="16" w:type="dxa"/>
+              <w:top w:w="24" w:type="dxa"/>
+              <w:bottom w:w="24" w:type="dxa"/>
               <w:left w:w="35" w:type="dxa"/>
               <w:right w:w="35" w:type="dxa"/>
             </w:tcMar>
@@ -25311,8 +26190,8 @@
           <w:tcPr>
             <w:tcW w:type="dxa" w:w="3744"/>
             <w:tcMar>
-              <w:top w:w="16" w:type="dxa"/>
-              <w:bottom w:w="16" w:type="dxa"/>
+              <w:top w:w="24" w:type="dxa"/>
+              <w:bottom w:w="24" w:type="dxa"/>
               <w:left w:w="35" w:type="dxa"/>
               <w:right w:w="35" w:type="dxa"/>
             </w:tcMar>
@@ -25342,8 +26221,8 @@
           <w:tcPr>
             <w:tcW w:type="dxa" w:w="864"/>
             <w:tcMar>
-              <w:top w:w="16" w:type="dxa"/>
-              <w:bottom w:w="16" w:type="dxa"/>
+              <w:top w:w="24" w:type="dxa"/>
+              <w:bottom w:w="24" w:type="dxa"/>
               <w:left w:w="35" w:type="dxa"/>
               <w:right w:w="35" w:type="dxa"/>
             </w:tcMar>
@@ -25375,8 +26254,8 @@
           <w:tcPr>
             <w:tcW w:type="dxa" w:w="864"/>
             <w:tcMar>
-              <w:top w:w="16" w:type="dxa"/>
-              <w:bottom w:w="16" w:type="dxa"/>
+              <w:top w:w="24" w:type="dxa"/>
+              <w:bottom w:w="24" w:type="dxa"/>
               <w:left w:w="35" w:type="dxa"/>
               <w:right w:w="35" w:type="dxa"/>
             </w:tcMar>
@@ -25407,8 +26286,8 @@
           <w:tcPr>
             <w:tcW w:type="dxa" w:w="2016"/>
             <w:tcMar>
-              <w:top w:w="16" w:type="dxa"/>
-              <w:bottom w:w="16" w:type="dxa"/>
+              <w:top w:w="24" w:type="dxa"/>
+              <w:bottom w:w="24" w:type="dxa"/>
               <w:left w:w="35" w:type="dxa"/>
               <w:right w:w="35" w:type="dxa"/>
             </w:tcMar>
@@ -25438,8 +26317,8 @@
           <w:tcPr>
             <w:tcW w:type="dxa" w:w="2592"/>
             <w:tcMar>
-              <w:top w:w="16" w:type="dxa"/>
-              <w:bottom w:w="16" w:type="dxa"/>
+              <w:top w:w="24" w:type="dxa"/>
+              <w:bottom w:w="24" w:type="dxa"/>
               <w:left w:w="35" w:type="dxa"/>
               <w:right w:w="35" w:type="dxa"/>
             </w:tcMar>
@@ -25469,8 +26348,8 @@
           <w:tcPr>
             <w:tcW w:type="dxa" w:w="3744"/>
             <w:tcMar>
-              <w:top w:w="16" w:type="dxa"/>
-              <w:bottom w:w="16" w:type="dxa"/>
+              <w:top w:w="24" w:type="dxa"/>
+              <w:bottom w:w="24" w:type="dxa"/>
               <w:left w:w="35" w:type="dxa"/>
               <w:right w:w="35" w:type="dxa"/>
             </w:tcMar>
@@ -25500,8 +26379,8 @@
           <w:tcPr>
             <w:tcW w:type="dxa" w:w="864"/>
             <w:tcMar>
-              <w:top w:w="16" w:type="dxa"/>
-              <w:bottom w:w="16" w:type="dxa"/>
+              <w:top w:w="24" w:type="dxa"/>
+              <w:bottom w:w="24" w:type="dxa"/>
               <w:left w:w="35" w:type="dxa"/>
               <w:right w:w="35" w:type="dxa"/>
             </w:tcMar>
@@ -25533,8 +26412,8 @@
           <w:tcPr>
             <w:tcW w:type="dxa" w:w="864"/>
             <w:tcMar>
-              <w:top w:w="16" w:type="dxa"/>
-              <w:bottom w:w="16" w:type="dxa"/>
+              <w:top w:w="24" w:type="dxa"/>
+              <w:bottom w:w="24" w:type="dxa"/>
               <w:left w:w="35" w:type="dxa"/>
               <w:right w:w="35" w:type="dxa"/>
             </w:tcMar>
@@ -25565,8 +26444,8 @@
           <w:tcPr>
             <w:tcW w:type="dxa" w:w="2016"/>
             <w:tcMar>
-              <w:top w:w="16" w:type="dxa"/>
-              <w:bottom w:w="16" w:type="dxa"/>
+              <w:top w:w="24" w:type="dxa"/>
+              <w:bottom w:w="24" w:type="dxa"/>
               <w:left w:w="35" w:type="dxa"/>
               <w:right w:w="35" w:type="dxa"/>
             </w:tcMar>
@@ -25596,8 +26475,8 @@
           <w:tcPr>
             <w:tcW w:type="dxa" w:w="2592"/>
             <w:tcMar>
-              <w:top w:w="16" w:type="dxa"/>
-              <w:bottom w:w="16" w:type="dxa"/>
+              <w:top w:w="24" w:type="dxa"/>
+              <w:bottom w:w="24" w:type="dxa"/>
               <w:left w:w="35" w:type="dxa"/>
               <w:right w:w="35" w:type="dxa"/>
             </w:tcMar>
@@ -25627,8 +26506,8 @@
           <w:tcPr>
             <w:tcW w:type="dxa" w:w="3744"/>
             <w:tcMar>
-              <w:top w:w="16" w:type="dxa"/>
-              <w:bottom w:w="16" w:type="dxa"/>
+              <w:top w:w="24" w:type="dxa"/>
+              <w:bottom w:w="24" w:type="dxa"/>
               <w:left w:w="35" w:type="dxa"/>
               <w:right w:w="35" w:type="dxa"/>
             </w:tcMar>
@@ -25658,8 +26537,8 @@
           <w:tcPr>
             <w:tcW w:type="dxa" w:w="864"/>
             <w:tcMar>
-              <w:top w:w="16" w:type="dxa"/>
-              <w:bottom w:w="16" w:type="dxa"/>
+              <w:top w:w="24" w:type="dxa"/>
+              <w:bottom w:w="24" w:type="dxa"/>
               <w:left w:w="35" w:type="dxa"/>
               <w:right w:w="35" w:type="dxa"/>
             </w:tcMar>
@@ -25691,8 +26570,8 @@
           <w:tcPr>
             <w:tcW w:type="dxa" w:w="864"/>
             <w:tcMar>
-              <w:top w:w="16" w:type="dxa"/>
-              <w:bottom w:w="16" w:type="dxa"/>
+              <w:top w:w="24" w:type="dxa"/>
+              <w:bottom w:w="24" w:type="dxa"/>
               <w:left w:w="35" w:type="dxa"/>
               <w:right w:w="35" w:type="dxa"/>
             </w:tcMar>
@@ -25723,8 +26602,8 @@
           <w:tcPr>
             <w:tcW w:type="dxa" w:w="2016"/>
             <w:tcMar>
-              <w:top w:w="16" w:type="dxa"/>
-              <w:bottom w:w="16" w:type="dxa"/>
+              <w:top w:w="24" w:type="dxa"/>
+              <w:bottom w:w="24" w:type="dxa"/>
               <w:left w:w="35" w:type="dxa"/>
               <w:right w:w="35" w:type="dxa"/>
             </w:tcMar>
@@ -25754,8 +26633,8 @@
           <w:tcPr>
             <w:tcW w:type="dxa" w:w="2592"/>
             <w:tcMar>
-              <w:top w:w="16" w:type="dxa"/>
-              <w:bottom w:w="16" w:type="dxa"/>
+              <w:top w:w="24" w:type="dxa"/>
+              <w:bottom w:w="24" w:type="dxa"/>
               <w:left w:w="35" w:type="dxa"/>
               <w:right w:w="35" w:type="dxa"/>
             </w:tcMar>
@@ -25785,8 +26664,8 @@
           <w:tcPr>
             <w:tcW w:type="dxa" w:w="3744"/>
             <w:tcMar>
-              <w:top w:w="16" w:type="dxa"/>
-              <w:bottom w:w="16" w:type="dxa"/>
+              <w:top w:w="24" w:type="dxa"/>
+              <w:bottom w:w="24" w:type="dxa"/>
               <w:left w:w="35" w:type="dxa"/>
               <w:right w:w="35" w:type="dxa"/>
             </w:tcMar>
@@ -25816,8 +26695,8 @@
           <w:tcPr>
             <w:tcW w:type="dxa" w:w="864"/>
             <w:tcMar>
-              <w:top w:w="16" w:type="dxa"/>
-              <w:bottom w:w="16" w:type="dxa"/>
+              <w:top w:w="24" w:type="dxa"/>
+              <w:bottom w:w="24" w:type="dxa"/>
               <w:left w:w="35" w:type="dxa"/>
               <w:right w:w="35" w:type="dxa"/>
             </w:tcMar>
@@ -25849,8 +26728,8 @@
           <w:tcPr>
             <w:tcW w:type="dxa" w:w="864"/>
             <w:tcMar>
-              <w:top w:w="16" w:type="dxa"/>
-              <w:bottom w:w="16" w:type="dxa"/>
+              <w:top w:w="24" w:type="dxa"/>
+              <w:bottom w:w="24" w:type="dxa"/>
               <w:left w:w="35" w:type="dxa"/>
               <w:right w:w="35" w:type="dxa"/>
             </w:tcMar>
@@ -25881,8 +26760,8 @@
           <w:tcPr>
             <w:tcW w:type="dxa" w:w="2016"/>
             <w:tcMar>
-              <w:top w:w="16" w:type="dxa"/>
-              <w:bottom w:w="16" w:type="dxa"/>
+              <w:top w:w="24" w:type="dxa"/>
+              <w:bottom w:w="24" w:type="dxa"/>
               <w:left w:w="35" w:type="dxa"/>
               <w:right w:w="35" w:type="dxa"/>
             </w:tcMar>
@@ -25912,8 +26791,8 @@
           <w:tcPr>
             <w:tcW w:type="dxa" w:w="2592"/>
             <w:tcMar>
-              <w:top w:w="16" w:type="dxa"/>
-              <w:bottom w:w="16" w:type="dxa"/>
+              <w:top w:w="24" w:type="dxa"/>
+              <w:bottom w:w="24" w:type="dxa"/>
               <w:left w:w="35" w:type="dxa"/>
               <w:right w:w="35" w:type="dxa"/>
             </w:tcMar>
@@ -25943,8 +26822,8 @@
           <w:tcPr>
             <w:tcW w:type="dxa" w:w="3744"/>
             <w:tcMar>
-              <w:top w:w="16" w:type="dxa"/>
-              <w:bottom w:w="16" w:type="dxa"/>
+              <w:top w:w="24" w:type="dxa"/>
+              <w:bottom w:w="24" w:type="dxa"/>
               <w:left w:w="35" w:type="dxa"/>
               <w:right w:w="35" w:type="dxa"/>
             </w:tcMar>
@@ -25974,8 +26853,8 @@
           <w:tcPr>
             <w:tcW w:type="dxa" w:w="864"/>
             <w:tcMar>
-              <w:top w:w="16" w:type="dxa"/>
-              <w:bottom w:w="16" w:type="dxa"/>
+              <w:top w:w="24" w:type="dxa"/>
+              <w:bottom w:w="24" w:type="dxa"/>
               <w:left w:w="35" w:type="dxa"/>
               <w:right w:w="35" w:type="dxa"/>
             </w:tcMar>
@@ -26007,8 +26886,8 @@
           <w:tcPr>
             <w:tcW w:type="dxa" w:w="864"/>
             <w:tcMar>
-              <w:top w:w="16" w:type="dxa"/>
-              <w:bottom w:w="16" w:type="dxa"/>
+              <w:top w:w="24" w:type="dxa"/>
+              <w:bottom w:w="24" w:type="dxa"/>
               <w:left w:w="35" w:type="dxa"/>
               <w:right w:w="35" w:type="dxa"/>
             </w:tcMar>
@@ -26039,8 +26918,8 @@
           <w:tcPr>
             <w:tcW w:type="dxa" w:w="2016"/>
             <w:tcMar>
-              <w:top w:w="16" w:type="dxa"/>
-              <w:bottom w:w="16" w:type="dxa"/>
+              <w:top w:w="24" w:type="dxa"/>
+              <w:bottom w:w="24" w:type="dxa"/>
               <w:left w:w="35" w:type="dxa"/>
               <w:right w:w="35" w:type="dxa"/>
             </w:tcMar>
@@ -26070,8 +26949,8 @@
           <w:tcPr>
             <w:tcW w:type="dxa" w:w="2592"/>
             <w:tcMar>
-              <w:top w:w="16" w:type="dxa"/>
-              <w:bottom w:w="16" w:type="dxa"/>
+              <w:top w:w="24" w:type="dxa"/>
+              <w:bottom w:w="24" w:type="dxa"/>
               <w:left w:w="35" w:type="dxa"/>
               <w:right w:w="35" w:type="dxa"/>
             </w:tcMar>
@@ -26101,8 +26980,8 @@
           <w:tcPr>
             <w:tcW w:type="dxa" w:w="3744"/>
             <w:tcMar>
-              <w:top w:w="16" w:type="dxa"/>
-              <w:bottom w:w="16" w:type="dxa"/>
+              <w:top w:w="24" w:type="dxa"/>
+              <w:bottom w:w="24" w:type="dxa"/>
               <w:left w:w="35" w:type="dxa"/>
               <w:right w:w="35" w:type="dxa"/>
             </w:tcMar>
@@ -26132,8 +27011,8 @@
           <w:tcPr>
             <w:tcW w:type="dxa" w:w="864"/>
             <w:tcMar>
-              <w:top w:w="16" w:type="dxa"/>
-              <w:bottom w:w="16" w:type="dxa"/>
+              <w:top w:w="24" w:type="dxa"/>
+              <w:bottom w:w="24" w:type="dxa"/>
               <w:left w:w="35" w:type="dxa"/>
               <w:right w:w="35" w:type="dxa"/>
             </w:tcMar>
@@ -26165,8 +27044,8 @@
           <w:tcPr>
             <w:tcW w:type="dxa" w:w="864"/>
             <w:tcMar>
-              <w:top w:w="16" w:type="dxa"/>
-              <w:bottom w:w="16" w:type="dxa"/>
+              <w:top w:w="24" w:type="dxa"/>
+              <w:bottom w:w="24" w:type="dxa"/>
               <w:left w:w="35" w:type="dxa"/>
               <w:right w:w="35" w:type="dxa"/>
             </w:tcMar>
@@ -26197,8 +27076,8 @@
           <w:tcPr>
             <w:tcW w:type="dxa" w:w="2016"/>
             <w:tcMar>
-              <w:top w:w="16" w:type="dxa"/>
-              <w:bottom w:w="16" w:type="dxa"/>
+              <w:top w:w="24" w:type="dxa"/>
+              <w:bottom w:w="24" w:type="dxa"/>
               <w:left w:w="35" w:type="dxa"/>
               <w:right w:w="35" w:type="dxa"/>
             </w:tcMar>
@@ -26228,8 +27107,8 @@
           <w:tcPr>
             <w:tcW w:type="dxa" w:w="2592"/>
             <w:tcMar>
-              <w:top w:w="16" w:type="dxa"/>
-              <w:bottom w:w="16" w:type="dxa"/>
+              <w:top w:w="24" w:type="dxa"/>
+              <w:bottom w:w="24" w:type="dxa"/>
               <w:left w:w="35" w:type="dxa"/>
               <w:right w:w="35" w:type="dxa"/>
             </w:tcMar>
@@ -26259,8 +27138,8 @@
           <w:tcPr>
             <w:tcW w:type="dxa" w:w="3744"/>
             <w:tcMar>
-              <w:top w:w="16" w:type="dxa"/>
-              <w:bottom w:w="16" w:type="dxa"/>
+              <w:top w:w="24" w:type="dxa"/>
+              <w:bottom w:w="24" w:type="dxa"/>
               <w:left w:w="35" w:type="dxa"/>
               <w:right w:w="35" w:type="dxa"/>
             </w:tcMar>
@@ -26290,8 +27169,8 @@
           <w:tcPr>
             <w:tcW w:type="dxa" w:w="864"/>
             <w:tcMar>
-              <w:top w:w="16" w:type="dxa"/>
-              <w:bottom w:w="16" w:type="dxa"/>
+              <w:top w:w="24" w:type="dxa"/>
+              <w:bottom w:w="24" w:type="dxa"/>
               <w:left w:w="35" w:type="dxa"/>
               <w:right w:w="35" w:type="dxa"/>
             </w:tcMar>
@@ -26443,8 +27322,8 @@
           <w:tcPr>
             <w:tcW w:type="dxa" w:w="2160"/>
             <w:tcMar>
-              <w:top w:w="20" w:type="dxa"/>
-              <w:bottom w:w="20" w:type="dxa"/>
+              <w:top w:w="28" w:type="dxa"/>
+              <w:bottom w:w="28" w:type="dxa"/>
               <w:left w:w="35" w:type="dxa"/>
               <w:right w:w="35" w:type="dxa"/>
             </w:tcMar>
@@ -26475,8 +27354,8 @@
           <w:tcPr>
             <w:tcW w:type="dxa" w:w="2592"/>
             <w:tcMar>
-              <w:top w:w="20" w:type="dxa"/>
-              <w:bottom w:w="20" w:type="dxa"/>
+              <w:top w:w="28" w:type="dxa"/>
+              <w:bottom w:w="28" w:type="dxa"/>
               <w:left w:w="35" w:type="dxa"/>
               <w:right w:w="35" w:type="dxa"/>
             </w:tcMar>
@@ -26507,8 +27386,8 @@
           <w:tcPr>
             <w:tcW w:type="dxa" w:w="2160"/>
             <w:tcMar>
-              <w:top w:w="20" w:type="dxa"/>
-              <w:bottom w:w="20" w:type="dxa"/>
+              <w:top w:w="28" w:type="dxa"/>
+              <w:bottom w:w="28" w:type="dxa"/>
               <w:left w:w="35" w:type="dxa"/>
               <w:right w:w="35" w:type="dxa"/>
             </w:tcMar>
@@ -26539,8 +27418,8 @@
           <w:tcPr>
             <w:tcW w:type="dxa" w:w="3168"/>
             <w:tcMar>
-              <w:top w:w="20" w:type="dxa"/>
-              <w:bottom w:w="20" w:type="dxa"/>
+              <w:top w:w="28" w:type="dxa"/>
+              <w:bottom w:w="28" w:type="dxa"/>
               <w:left w:w="35" w:type="dxa"/>
               <w:right w:w="35" w:type="dxa"/>
             </w:tcMar>
@@ -26573,8 +27452,8 @@
           <w:tcPr>
             <w:tcW w:type="dxa" w:w="2160"/>
             <w:tcMar>
-              <w:top w:w="16" w:type="dxa"/>
-              <w:bottom w:w="16" w:type="dxa"/>
+              <w:top w:w="24" w:type="dxa"/>
+              <w:bottom w:w="24" w:type="dxa"/>
               <w:left w:w="35" w:type="dxa"/>
               <w:right w:w="35" w:type="dxa"/>
             </w:tcMar>
@@ -26605,8 +27484,8 @@
           <w:tcPr>
             <w:tcW w:type="dxa" w:w="2592"/>
             <w:tcMar>
-              <w:top w:w="16" w:type="dxa"/>
-              <w:bottom w:w="16" w:type="dxa"/>
+              <w:top w:w="24" w:type="dxa"/>
+              <w:bottom w:w="24" w:type="dxa"/>
               <w:left w:w="35" w:type="dxa"/>
               <w:right w:w="35" w:type="dxa"/>
             </w:tcMar>
@@ -26636,8 +27515,8 @@
           <w:tcPr>
             <w:tcW w:type="dxa" w:w="2160"/>
             <w:tcMar>
-              <w:top w:w="16" w:type="dxa"/>
-              <w:bottom w:w="16" w:type="dxa"/>
+              <w:top w:w="24" w:type="dxa"/>
+              <w:bottom w:w="24" w:type="dxa"/>
               <w:left w:w="35" w:type="dxa"/>
               <w:right w:w="35" w:type="dxa"/>
             </w:tcMar>
@@ -26667,8 +27546,8 @@
           <w:tcPr>
             <w:tcW w:type="dxa" w:w="3168"/>
             <w:tcMar>
-              <w:top w:w="16" w:type="dxa"/>
-              <w:bottom w:w="16" w:type="dxa"/>
+              <w:top w:w="24" w:type="dxa"/>
+              <w:bottom w:w="24" w:type="dxa"/>
               <w:left w:w="35" w:type="dxa"/>
               <w:right w:w="35" w:type="dxa"/>
             </w:tcMar>
@@ -26700,8 +27579,8 @@
           <w:tcPr>
             <w:tcW w:type="dxa" w:w="2160"/>
             <w:tcMar>
-              <w:top w:w="16" w:type="dxa"/>
-              <w:bottom w:w="16" w:type="dxa"/>
+              <w:top w:w="24" w:type="dxa"/>
+              <w:bottom w:w="24" w:type="dxa"/>
               <w:left w:w="35" w:type="dxa"/>
               <w:right w:w="35" w:type="dxa"/>
             </w:tcMar>
@@ -26732,8 +27611,8 @@
           <w:tcPr>
             <w:tcW w:type="dxa" w:w="2592"/>
             <w:tcMar>
-              <w:top w:w="16" w:type="dxa"/>
-              <w:bottom w:w="16" w:type="dxa"/>
+              <w:top w:w="24" w:type="dxa"/>
+              <w:bottom w:w="24" w:type="dxa"/>
               <w:left w:w="35" w:type="dxa"/>
               <w:right w:w="35" w:type="dxa"/>
             </w:tcMar>
@@ -26763,8 +27642,8 @@
           <w:tcPr>
             <w:tcW w:type="dxa" w:w="2160"/>
             <w:tcMar>
-              <w:top w:w="16" w:type="dxa"/>
-              <w:bottom w:w="16" w:type="dxa"/>
+              <w:top w:w="24" w:type="dxa"/>
+              <w:bottom w:w="24" w:type="dxa"/>
               <w:left w:w="35" w:type="dxa"/>
               <w:right w:w="35" w:type="dxa"/>
             </w:tcMar>
@@ -26794,8 +27673,8 @@
           <w:tcPr>
             <w:tcW w:type="dxa" w:w="3168"/>
             <w:tcMar>
-              <w:top w:w="16" w:type="dxa"/>
-              <w:bottom w:w="16" w:type="dxa"/>
+              <w:top w:w="24" w:type="dxa"/>
+              <w:bottom w:w="24" w:type="dxa"/>
               <w:left w:w="35" w:type="dxa"/>
               <w:right w:w="35" w:type="dxa"/>
             </w:tcMar>
@@ -26827,8 +27706,8 @@
           <w:tcPr>
             <w:tcW w:type="dxa" w:w="2160"/>
             <w:tcMar>
-              <w:top w:w="16" w:type="dxa"/>
-              <w:bottom w:w="16" w:type="dxa"/>
+              <w:top w:w="24" w:type="dxa"/>
+              <w:bottom w:w="24" w:type="dxa"/>
               <w:left w:w="35" w:type="dxa"/>
               <w:right w:w="35" w:type="dxa"/>
             </w:tcMar>
@@ -26859,8 +27738,8 @@
           <w:tcPr>
             <w:tcW w:type="dxa" w:w="2592"/>
             <w:tcMar>
-              <w:top w:w="16" w:type="dxa"/>
-              <w:bottom w:w="16" w:type="dxa"/>
+              <w:top w:w="24" w:type="dxa"/>
+              <w:bottom w:w="24" w:type="dxa"/>
               <w:left w:w="35" w:type="dxa"/>
               <w:right w:w="35" w:type="dxa"/>
             </w:tcMar>
@@ -26890,8 +27769,8 @@
           <w:tcPr>
             <w:tcW w:type="dxa" w:w="2160"/>
             <w:tcMar>
-              <w:top w:w="16" w:type="dxa"/>
-              <w:bottom w:w="16" w:type="dxa"/>
+              <w:top w:w="24" w:type="dxa"/>
+              <w:bottom w:w="24" w:type="dxa"/>
               <w:left w:w="35" w:type="dxa"/>
               <w:right w:w="35" w:type="dxa"/>
             </w:tcMar>
@@ -26921,8 +27800,8 @@
           <w:tcPr>
             <w:tcW w:type="dxa" w:w="3168"/>
             <w:tcMar>
-              <w:top w:w="16" w:type="dxa"/>
-              <w:bottom w:w="16" w:type="dxa"/>
+              <w:top w:w="24" w:type="dxa"/>
+              <w:bottom w:w="24" w:type="dxa"/>
               <w:left w:w="35" w:type="dxa"/>
               <w:right w:w="35" w:type="dxa"/>
             </w:tcMar>
@@ -26945,6 +27824,260 @@
                 <w:sz w:val="16"/>
               </w:rPr>
               <w:t>Response header audit (X-Frame-Options, CSP)</w:t>
+            </w:r>
+          </w:p>
+        </w:tc>
+      </w:tr>
+      <w:tr>
+        <w:tc>
+          <w:tcPr>
+            <w:tcW w:type="dxa" w:w="2160"/>
+            <w:tcMar>
+              <w:top w:w="24" w:type="dxa"/>
+              <w:bottom w:w="24" w:type="dxa"/>
+              <w:left w:w="35" w:type="dxa"/>
+              <w:right w:w="35" w:type="dxa"/>
+            </w:tcMar>
+            <w:shd w:fill="F8FAFC"/>
+            <w:tcBorders>
+              <w:top w:val="single" w:sz="4" w:space="0" w:color="CBD5E1"/>
+              <w:bottom w:val="single" w:sz="4" w:space="0" w:color="CBD5E1"/>
+              <w:left w:val="single" w:sz="4" w:space="0" w:color="CBD5E1"/>
+              <w:right w:val="single" w:sz="4" w:space="0" w:color="CBD5E1"/>
+            </w:tcBorders>
+          </w:tcPr>
+          <w:p>
+            <w:pPr>
+              <w:spacing w:before="0" w:after="0" w:line="252" w:lineRule="auto"/>
+            </w:pPr>
+            <w:r>
+              <w:rPr>
+                <w:rFonts w:ascii="Calibri" w:hAnsi="Calibri"/>
+                <w:b/>
+                <w:color w:val="1B365D"/>
+                <w:sz w:val="16"/>
+              </w:rPr>
+              <w:t>OS Shell Subsystem</w:t>
+            </w:r>
+          </w:p>
+        </w:tc>
+        <w:tc>
+          <w:tcPr>
+            <w:tcW w:type="dxa" w:w="2592"/>
+            <w:tcMar>
+              <w:top w:w="24" w:type="dxa"/>
+              <w:bottom w:w="24" w:type="dxa"/>
+              <w:left w:w="35" w:type="dxa"/>
+              <w:right w:w="35" w:type="dxa"/>
+            </w:tcMar>
+            <w:shd w:fill="F8FAFC"/>
+            <w:tcBorders>
+              <w:top w:val="single" w:sz="4" w:space="0" w:color="CBD5E1"/>
+              <w:bottom w:val="single" w:sz="4" w:space="0" w:color="CBD5E1"/>
+              <w:left w:val="single" w:sz="4" w:space="0" w:color="CBD5E1"/>
+              <w:right w:val="single" w:sz="4" w:space="0" w:color="CBD5E1"/>
+            </w:tcBorders>
+          </w:tcPr>
+          <w:p>
+            <w:pPr>
+              <w:spacing w:before="0" w:after="0" w:line="252" w:lineRule="auto"/>
+            </w:pPr>
+            <w:r>
+              <w:rPr>
+                <w:rFonts w:ascii="Calibri" w:hAnsi="Calibri"/>
+                <w:color w:val="1E293B"/>
+                <w:sz w:val="16"/>
+              </w:rPr>
+              <w:t>Windows Subsystem &amp; Command Interpreter</w:t>
+            </w:r>
+          </w:p>
+        </w:tc>
+        <w:tc>
+          <w:tcPr>
+            <w:tcW w:type="dxa" w:w="2160"/>
+            <w:tcMar>
+              <w:top w:w="24" w:type="dxa"/>
+              <w:bottom w:w="24" w:type="dxa"/>
+              <w:left w:w="35" w:type="dxa"/>
+              <w:right w:w="35" w:type="dxa"/>
+            </w:tcMar>
+            <w:shd w:fill="F8FAFC"/>
+            <w:tcBorders>
+              <w:top w:val="single" w:sz="4" w:space="0" w:color="CBD5E1"/>
+              <w:bottom w:val="single" w:sz="4" w:space="0" w:color="CBD5E1"/>
+              <w:left w:val="single" w:sz="4" w:space="0" w:color="CBD5E1"/>
+              <w:right w:val="single" w:sz="4" w:space="0" w:color="CBD5E1"/>
+            </w:tcBorders>
+          </w:tcPr>
+          <w:p>
+            <w:pPr>
+              <w:spacing w:before="0" w:after="0" w:line="252" w:lineRule="auto"/>
+            </w:pPr>
+            <w:r>
+              <w:rPr>
+                <w:rFonts w:ascii="Calibri" w:hAnsi="Calibri"/>
+                <w:color w:val="1E293B"/>
+                <w:sz w:val="16"/>
+              </w:rPr>
+              <w:t>Local Synchronous</w:t>
+            </w:r>
+          </w:p>
+        </w:tc>
+        <w:tc>
+          <w:tcPr>
+            <w:tcW w:type="dxa" w:w="3168"/>
+            <w:tcMar>
+              <w:top w:w="24" w:type="dxa"/>
+              <w:bottom w:w="24" w:type="dxa"/>
+              <w:left w:w="35" w:type="dxa"/>
+              <w:right w:w="35" w:type="dxa"/>
+            </w:tcMar>
+            <w:shd w:fill="F8FAFC"/>
+            <w:tcBorders>
+              <w:top w:val="single" w:sz="4" w:space="0" w:color="CBD5E1"/>
+              <w:bottom w:val="single" w:sz="4" w:space="0" w:color="CBD5E1"/>
+              <w:left w:val="single" w:sz="4" w:space="0" w:color="CBD5E1"/>
+              <w:right w:val="single" w:sz="4" w:space="0" w:color="CBD5E1"/>
+            </w:tcBorders>
+          </w:tcPr>
+          <w:p>
+            <w:pPr>
+              <w:spacing w:before="0" w:after="0" w:line="252" w:lineRule="auto"/>
+            </w:pPr>
+            <w:r>
+              <w:rPr>
+                <w:rFonts w:ascii="Calibri" w:hAnsi="Calibri"/>
+                <w:color w:val="1E293B"/>
+                <w:sz w:val="16"/>
+              </w:rPr>
+              <w:t>Execution containment for diagnostic pings</w:t>
+            </w:r>
+          </w:p>
+        </w:tc>
+      </w:tr>
+      <w:tr>
+        <w:tc>
+          <w:tcPr>
+            <w:tcW w:type="dxa" w:w="2160"/>
+            <w:tcMar>
+              <w:top w:w="24" w:type="dxa"/>
+              <w:bottom w:w="24" w:type="dxa"/>
+              <w:left w:w="35" w:type="dxa"/>
+              <w:right w:w="35" w:type="dxa"/>
+            </w:tcMar>
+            <w:shd w:fill="FFFFFF"/>
+            <w:tcBorders>
+              <w:top w:val="single" w:sz="4" w:space="0" w:color="CBD5E1"/>
+              <w:bottom w:val="single" w:sz="4" w:space="0" w:color="CBD5E1"/>
+              <w:left w:val="single" w:sz="4" w:space="0" w:color="CBD5E1"/>
+              <w:right w:val="single" w:sz="4" w:space="0" w:color="CBD5E1"/>
+            </w:tcBorders>
+          </w:tcPr>
+          <w:p>
+            <w:pPr>
+              <w:spacing w:before="0" w:after="0" w:line="252" w:lineRule="auto"/>
+            </w:pPr>
+            <w:r>
+              <w:rPr>
+                <w:rFonts w:ascii="Calibri" w:hAnsi="Calibri"/>
+                <w:b/>
+                <w:color w:val="1B365D"/>
+                <w:sz w:val="16"/>
+              </w:rPr>
+              <w:t>Relational DB Engine</w:t>
+            </w:r>
+          </w:p>
+        </w:tc>
+        <w:tc>
+          <w:tcPr>
+            <w:tcW w:type="dxa" w:w="2592"/>
+            <w:tcMar>
+              <w:top w:w="24" w:type="dxa"/>
+              <w:bottom w:w="24" w:type="dxa"/>
+              <w:left w:w="35" w:type="dxa"/>
+              <w:right w:w="35" w:type="dxa"/>
+            </w:tcMar>
+            <w:shd w:fill="FFFFFF"/>
+            <w:tcBorders>
+              <w:top w:val="single" w:sz="4" w:space="0" w:color="CBD5E1"/>
+              <w:bottom w:val="single" w:sz="4" w:space="0" w:color="CBD5E1"/>
+              <w:left w:val="single" w:sz="4" w:space="0" w:color="CBD5E1"/>
+              <w:right w:val="single" w:sz="4" w:space="0" w:color="CBD5E1"/>
+            </w:tcBorders>
+          </w:tcPr>
+          <w:p>
+            <w:pPr>
+              <w:spacing w:before="0" w:after="0" w:line="252" w:lineRule="auto"/>
+            </w:pPr>
+            <w:r>
+              <w:rPr>
+                <w:rFonts w:ascii="Calibri" w:hAnsi="Calibri"/>
+                <w:color w:val="1E293B"/>
+                <w:sz w:val="16"/>
+              </w:rPr>
+              <w:t>MariaDB 10.4 / MySQL Server</w:t>
+            </w:r>
+          </w:p>
+        </w:tc>
+        <w:tc>
+          <w:tcPr>
+            <w:tcW w:type="dxa" w:w="2160"/>
+            <w:tcMar>
+              <w:top w:w="24" w:type="dxa"/>
+              <w:bottom w:w="24" w:type="dxa"/>
+              <w:left w:w="35" w:type="dxa"/>
+              <w:right w:w="35" w:type="dxa"/>
+            </w:tcMar>
+            <w:shd w:fill="FFFFFF"/>
+            <w:tcBorders>
+              <w:top w:val="single" w:sz="4" w:space="0" w:color="CBD5E1"/>
+              <w:bottom w:val="single" w:sz="4" w:space="0" w:color="CBD5E1"/>
+              <w:left w:val="single" w:sz="4" w:space="0" w:color="CBD5E1"/>
+              <w:right w:val="single" w:sz="4" w:space="0" w:color="CBD5E1"/>
+            </w:tcBorders>
+          </w:tcPr>
+          <w:p>
+            <w:pPr>
+              <w:spacing w:before="0" w:after="0" w:line="252" w:lineRule="auto"/>
+            </w:pPr>
+            <w:r>
+              <w:rPr>
+                <w:rFonts w:ascii="Calibri" w:hAnsi="Calibri"/>
+                <w:color w:val="1E293B"/>
+                <w:sz w:val="16"/>
+              </w:rPr>
+              <w:t>In-Process PDO/MySQLi</w:t>
+            </w:r>
+          </w:p>
+        </w:tc>
+        <w:tc>
+          <w:tcPr>
+            <w:tcW w:type="dxa" w:w="3168"/>
+            <w:tcMar>
+              <w:top w:w="24" w:type="dxa"/>
+              <w:bottom w:w="24" w:type="dxa"/>
+              <w:left w:w="35" w:type="dxa"/>
+              <w:right w:w="35" w:type="dxa"/>
+            </w:tcMar>
+            <w:shd w:fill="FFFFFF"/>
+            <w:tcBorders>
+              <w:top w:val="single" w:sz="4" w:space="0" w:color="CBD5E1"/>
+              <w:bottom w:val="single" w:sz="4" w:space="0" w:color="CBD5E1"/>
+              <w:left w:val="single" w:sz="4" w:space="0" w:color="CBD5E1"/>
+              <w:right w:val="single" w:sz="4" w:space="0" w:color="CBD5E1"/>
+            </w:tcBorders>
+          </w:tcPr>
+          <w:p>
+            <w:pPr>
+              <w:spacing w:before="0" w:after="0" w:line="252" w:lineRule="auto"/>
+            </w:pPr>
+            <w:r>
+              <w:rPr>
+                <w:rFonts w:ascii="Calibri" w:hAnsi="Calibri"/>
+                <w:color w:val="1E293B"/>
+                <w:sz w:val="16"/>
+              </w:rPr>
+              <w:t>Statement compilation and AST query parsing</w:t>
             </w:r>
           </w:p>
         </w:tc>
@@ -26952,7 +28085,7 @@
     </w:tbl>
     <w:p>
       <w:pPr>
-        <w:spacing w:before="0" w:after="40"/>
+        <w:spacing w:before="0" w:after="50"/>
       </w:pPr>
     </w:p>
     <w:tbl>
@@ -27049,7 +28182,7 @@
     </w:p>
     <w:p>
       <w:pPr>
-        <w:spacing w:before="0" w:after="36" w:line="269" w:lineRule="auto"/>
+        <w:spacing w:before="0" w:after="44" w:line="269" w:lineRule="auto"/>
       </w:pPr>
       <w:r>
         <w:rPr>
@@ -27072,7 +28205,7 @@
     </w:p>
     <w:p>
       <w:pPr>
-        <w:spacing w:before="0" w:after="36" w:line="269" w:lineRule="auto"/>
+        <w:spacing w:before="0" w:after="44" w:line="269" w:lineRule="auto"/>
       </w:pPr>
       <w:r>
         <w:rPr>
@@ -27095,7 +28228,7 @@
     </w:p>
     <w:p>
       <w:pPr>
-        <w:spacing w:before="0" w:after="36" w:line="269" w:lineRule="auto"/>
+        <w:spacing w:before="0" w:after="44" w:line="269" w:lineRule="auto"/>
       </w:pPr>
       <w:r>
         <w:rPr>
@@ -27118,7 +28251,7 @@
     </w:p>
     <w:p>
       <w:pPr>
-        <w:spacing w:before="0" w:after="36" w:line="269" w:lineRule="auto"/>
+        <w:spacing w:before="0" w:after="44" w:line="269" w:lineRule="auto"/>
       </w:pPr>
       <w:r>
         <w:rPr>
@@ -27141,7 +28274,7 @@
     </w:p>
     <w:p>
       <w:pPr>
-        <w:spacing w:before="0" w:after="36" w:line="269" w:lineRule="auto"/>
+        <w:spacing w:before="0" w:after="44" w:line="269" w:lineRule="auto"/>
       </w:pPr>
       <w:r>
         <w:rPr>
@@ -27164,7 +28297,7 @@
     </w:p>
     <w:p>
       <w:pPr>
-        <w:spacing w:before="0" w:after="36" w:line="269" w:lineRule="auto"/>
+        <w:spacing w:before="0" w:after="44" w:line="269" w:lineRule="auto"/>
       </w:pPr>
       <w:r>
         <w:rPr>
@@ -27187,7 +28320,7 @@
     </w:p>
     <w:p>
       <w:pPr>
-        <w:spacing w:before="0" w:after="36" w:line="269" w:lineRule="auto"/>
+        <w:spacing w:before="0" w:after="44" w:line="269" w:lineRule="auto"/>
       </w:pPr>
       <w:r>
         <w:rPr>
@@ -27210,7 +28343,7 @@
     </w:p>
     <w:p>
       <w:pPr>
-        <w:spacing w:before="0" w:after="36" w:line="269" w:lineRule="auto"/>
+        <w:spacing w:before="0" w:after="44" w:line="269" w:lineRule="auto"/>
       </w:pPr>
       <w:r>
         <w:rPr>
@@ -27233,7 +28366,7 @@
     </w:p>
     <w:p>
       <w:pPr>
-        <w:spacing w:before="0" w:after="36" w:line="269" w:lineRule="auto"/>
+        <w:spacing w:before="0" w:after="44" w:line="269" w:lineRule="auto"/>
       </w:pPr>
       <w:r>
         <w:rPr>
@@ -27256,7 +28389,7 @@
     </w:p>
     <w:p>
       <w:pPr>
-        <w:spacing w:before="0" w:after="36" w:line="269" w:lineRule="auto"/>
+        <w:spacing w:before="0" w:after="44" w:line="269" w:lineRule="auto"/>
       </w:pPr>
       <w:r>
         <w:rPr>
@@ -27279,7 +28412,7 @@
     </w:p>
     <w:p>
       <w:pPr>
-        <w:spacing w:before="0" w:after="36" w:line="269" w:lineRule="auto"/>
+        <w:spacing w:before="0" w:after="44" w:line="269" w:lineRule="auto"/>
       </w:pPr>
       <w:r>
         <w:rPr>
@@ -27302,7 +28435,7 @@
     </w:p>
     <w:p>
       <w:pPr>
-        <w:spacing w:before="0" w:after="36" w:line="269" w:lineRule="auto"/>
+        <w:spacing w:before="0" w:after="44" w:line="269" w:lineRule="auto"/>
       </w:pPr>
       <w:r>
         <w:rPr>
@@ -27325,7 +28458,7 @@
     </w:p>
     <w:p>
       <w:pPr>
-        <w:spacing w:before="0" w:after="36" w:line="269" w:lineRule="auto"/>
+        <w:spacing w:before="0" w:after="44" w:line="269" w:lineRule="auto"/>
       </w:pPr>
       <w:r>
         <w:rPr>
@@ -27348,7 +28481,7 @@
     </w:p>
     <w:p>
       <w:pPr>
-        <w:spacing w:before="0" w:after="36" w:line="269" w:lineRule="auto"/>
+        <w:spacing w:before="0" w:after="44" w:line="269" w:lineRule="auto"/>
       </w:pPr>
       <w:r>
         <w:rPr>
@@ -27367,6 +28500,29 @@
           <w:sz w:val="18"/>
         </w:rPr>
         <w:t>SOP isolates document resources between different origins (scheme, host, port). It ensures that a malicious third-party script cannot inspect the DOM, read cookies, or execute requests on behalf of an authenticated victim across origins.</w:t>
+      </w:r>
+    </w:p>
+    <w:p>
+      <w:pPr>
+        <w:spacing w:before="0" w:after="44" w:line="269" w:lineRule="auto"/>
+      </w:pPr>
+      <w:r>
+        <w:rPr>
+          <w:rFonts w:ascii="Calibri" w:hAnsi="Calibri"/>
+          <w:b/>
+          <w:color w:val="2C3E50"/>
+          <w:sz w:val="18"/>
+        </w:rPr>
+        <w:t xml:space="preserve">Q15: How does the principle of Least Privilege reinforce web application defense-in-depth? </w:t>
+      </w:r>
+      <w:r>
+        <w:rPr>
+          <w:rFonts w:ascii="Calibri" w:hAnsi="Calibri"/>
+          <w:i w:val="0"/>
+          <w:color w:val="1E293B"/>
+          <w:sz w:val="18"/>
+        </w:rPr>
+        <w:t>Least Privilege restricts database accounts and web server daemon permissions strictly to required resources (e.g. read/write to application tables only, no administrative privileges or root shell access). Even if an injection flaw occurs, the potential blast radius and lateral escalation remain strictly curtailed.</w:t>
       </w:r>
     </w:p>
     <w:p>
@@ -27639,8 +28795,8 @@
           <w:tcPr>
             <w:tcW w:type="dxa" w:w="2592"/>
             <w:tcMar>
-              <w:top w:w="20" w:type="dxa"/>
-              <w:bottom w:w="20" w:type="dxa"/>
+              <w:top w:w="22" w:type="dxa"/>
+              <w:bottom w:w="22" w:type="dxa"/>
               <w:left w:w="35" w:type="dxa"/>
               <w:right w:w="35" w:type="dxa"/>
             </w:tcMar>
@@ -27671,8 +28827,8 @@
           <w:tcPr>
             <w:tcW w:type="dxa" w:w="2304"/>
             <w:tcMar>
-              <w:top w:w="20" w:type="dxa"/>
-              <w:bottom w:w="20" w:type="dxa"/>
+              <w:top w:w="22" w:type="dxa"/>
+              <w:bottom w:w="22" w:type="dxa"/>
               <w:left w:w="35" w:type="dxa"/>
               <w:right w:w="35" w:type="dxa"/>
             </w:tcMar>
@@ -27703,8 +28859,8 @@
           <w:tcPr>
             <w:tcW w:type="dxa" w:w="2304"/>
             <w:tcMar>
-              <w:top w:w="20" w:type="dxa"/>
-              <w:bottom w:w="20" w:type="dxa"/>
+              <w:top w:w="22" w:type="dxa"/>
+              <w:bottom w:w="22" w:type="dxa"/>
               <w:left w:w="35" w:type="dxa"/>
               <w:right w:w="35" w:type="dxa"/>
             </w:tcMar>
@@ -27735,8 +28891,8 @@
           <w:tcPr>
             <w:tcW w:type="dxa" w:w="2880"/>
             <w:tcMar>
-              <w:top w:w="20" w:type="dxa"/>
-              <w:bottom w:w="20" w:type="dxa"/>
+              <w:top w:w="22" w:type="dxa"/>
+              <w:bottom w:w="22" w:type="dxa"/>
               <w:left w:w="35" w:type="dxa"/>
               <w:right w:w="35" w:type="dxa"/>
             </w:tcMar>
@@ -27769,8 +28925,8 @@
           <w:tcPr>
             <w:tcW w:type="dxa" w:w="2592"/>
             <w:tcMar>
-              <w:top w:w="16" w:type="dxa"/>
-              <w:bottom w:w="16" w:type="dxa"/>
+              <w:top w:w="18" w:type="dxa"/>
+              <w:bottom w:w="18" w:type="dxa"/>
               <w:left w:w="35" w:type="dxa"/>
               <w:right w:w="35" w:type="dxa"/>
             </w:tcMar>
@@ -27801,8 +28957,8 @@
           <w:tcPr>
             <w:tcW w:type="dxa" w:w="2304"/>
             <w:tcMar>
-              <w:top w:w="16" w:type="dxa"/>
-              <w:bottom w:w="16" w:type="dxa"/>
+              <w:top w:w="18" w:type="dxa"/>
+              <w:bottom w:w="18" w:type="dxa"/>
               <w:left w:w="35" w:type="dxa"/>
               <w:right w:w="35" w:type="dxa"/>
             </w:tcMar>
@@ -27832,8 +28988,8 @@
           <w:tcPr>
             <w:tcW w:type="dxa" w:w="2304"/>
             <w:tcMar>
-              <w:top w:w="16" w:type="dxa"/>
-              <w:bottom w:w="16" w:type="dxa"/>
+              <w:top w:w="18" w:type="dxa"/>
+              <w:bottom w:w="18" w:type="dxa"/>
               <w:left w:w="35" w:type="dxa"/>
               <w:right w:w="35" w:type="dxa"/>
             </w:tcMar>
@@ -27863,8 +29019,8 @@
           <w:tcPr>
             <w:tcW w:type="dxa" w:w="2880"/>
             <w:tcMar>
-              <w:top w:w="16" w:type="dxa"/>
-              <w:bottom w:w="16" w:type="dxa"/>
+              <w:top w:w="18" w:type="dxa"/>
+              <w:bottom w:w="18" w:type="dxa"/>
               <w:left w:w="35" w:type="dxa"/>
               <w:right w:w="35" w:type="dxa"/>
             </w:tcMar>
@@ -27896,8 +29052,8 @@
           <w:tcPr>
             <w:tcW w:type="dxa" w:w="2592"/>
             <w:tcMar>
-              <w:top w:w="16" w:type="dxa"/>
-              <w:bottom w:w="16" w:type="dxa"/>
+              <w:top w:w="18" w:type="dxa"/>
+              <w:bottom w:w="18" w:type="dxa"/>
               <w:left w:w="35" w:type="dxa"/>
               <w:right w:w="35" w:type="dxa"/>
             </w:tcMar>
@@ -27928,8 +29084,8 @@
           <w:tcPr>
             <w:tcW w:type="dxa" w:w="2304"/>
             <w:tcMar>
-              <w:top w:w="16" w:type="dxa"/>
-              <w:bottom w:w="16" w:type="dxa"/>
+              <w:top w:w="18" w:type="dxa"/>
+              <w:bottom w:w="18" w:type="dxa"/>
               <w:left w:w="35" w:type="dxa"/>
               <w:right w:w="35" w:type="dxa"/>
             </w:tcMar>
@@ -27959,8 +29115,8 @@
           <w:tcPr>
             <w:tcW w:type="dxa" w:w="2304"/>
             <w:tcMar>
-              <w:top w:w="16" w:type="dxa"/>
-              <w:bottom w:w="16" w:type="dxa"/>
+              <w:top w:w="18" w:type="dxa"/>
+              <w:bottom w:w="18" w:type="dxa"/>
               <w:left w:w="35" w:type="dxa"/>
               <w:right w:w="35" w:type="dxa"/>
             </w:tcMar>
@@ -27990,8 +29146,8 @@
           <w:tcPr>
             <w:tcW w:type="dxa" w:w="2880"/>
             <w:tcMar>
-              <w:top w:w="16" w:type="dxa"/>
-              <w:bottom w:w="16" w:type="dxa"/>
+              <w:top w:w="18" w:type="dxa"/>
+              <w:bottom w:w="18" w:type="dxa"/>
               <w:left w:w="35" w:type="dxa"/>
               <w:right w:w="35" w:type="dxa"/>
             </w:tcMar>
@@ -28023,8 +29179,8 @@
           <w:tcPr>
             <w:tcW w:type="dxa" w:w="2592"/>
             <w:tcMar>
-              <w:top w:w="16" w:type="dxa"/>
-              <w:bottom w:w="16" w:type="dxa"/>
+              <w:top w:w="18" w:type="dxa"/>
+              <w:bottom w:w="18" w:type="dxa"/>
               <w:left w:w="35" w:type="dxa"/>
               <w:right w:w="35" w:type="dxa"/>
             </w:tcMar>
@@ -28055,8 +29211,8 @@
           <w:tcPr>
             <w:tcW w:type="dxa" w:w="2304"/>
             <w:tcMar>
-              <w:top w:w="16" w:type="dxa"/>
-              <w:bottom w:w="16" w:type="dxa"/>
+              <w:top w:w="18" w:type="dxa"/>
+              <w:bottom w:w="18" w:type="dxa"/>
               <w:left w:w="35" w:type="dxa"/>
               <w:right w:w="35" w:type="dxa"/>
             </w:tcMar>
@@ -28086,8 +29242,8 @@
           <w:tcPr>
             <w:tcW w:type="dxa" w:w="2304"/>
             <w:tcMar>
-              <w:top w:w="16" w:type="dxa"/>
-              <w:bottom w:w="16" w:type="dxa"/>
+              <w:top w:w="18" w:type="dxa"/>
+              <w:bottom w:w="18" w:type="dxa"/>
               <w:left w:w="35" w:type="dxa"/>
               <w:right w:w="35" w:type="dxa"/>
             </w:tcMar>
@@ -28117,8 +29273,8 @@
           <w:tcPr>
             <w:tcW w:type="dxa" w:w="2880"/>
             <w:tcMar>
-              <w:top w:w="16" w:type="dxa"/>
-              <w:bottom w:w="16" w:type="dxa"/>
+              <w:top w:w="18" w:type="dxa"/>
+              <w:bottom w:w="18" w:type="dxa"/>
               <w:left w:w="35" w:type="dxa"/>
               <w:right w:w="35" w:type="dxa"/>
             </w:tcMar>
@@ -28150,8 +29306,8 @@
           <w:tcPr>
             <w:tcW w:type="dxa" w:w="2592"/>
             <w:tcMar>
-              <w:top w:w="16" w:type="dxa"/>
-              <w:bottom w:w="16" w:type="dxa"/>
+              <w:top w:w="18" w:type="dxa"/>
+              <w:bottom w:w="18" w:type="dxa"/>
               <w:left w:w="35" w:type="dxa"/>
               <w:right w:w="35" w:type="dxa"/>
             </w:tcMar>
@@ -28182,8 +29338,8 @@
           <w:tcPr>
             <w:tcW w:type="dxa" w:w="2304"/>
             <w:tcMar>
-              <w:top w:w="16" w:type="dxa"/>
-              <w:bottom w:w="16" w:type="dxa"/>
+              <w:top w:w="18" w:type="dxa"/>
+              <w:bottom w:w="18" w:type="dxa"/>
               <w:left w:w="35" w:type="dxa"/>
               <w:right w:w="35" w:type="dxa"/>
             </w:tcMar>
@@ -28213,8 +29369,8 @@
           <w:tcPr>
             <w:tcW w:type="dxa" w:w="2304"/>
             <w:tcMar>
-              <w:top w:w="16" w:type="dxa"/>
-              <w:bottom w:w="16" w:type="dxa"/>
+              <w:top w:w="18" w:type="dxa"/>
+              <w:bottom w:w="18" w:type="dxa"/>
               <w:left w:w="35" w:type="dxa"/>
               <w:right w:w="35" w:type="dxa"/>
             </w:tcMar>
@@ -28244,8 +29400,8 @@
           <w:tcPr>
             <w:tcW w:type="dxa" w:w="2880"/>
             <w:tcMar>
-              <w:top w:w="16" w:type="dxa"/>
-              <w:bottom w:w="16" w:type="dxa"/>
+              <w:top w:w="18" w:type="dxa"/>
+              <w:bottom w:w="18" w:type="dxa"/>
               <w:left w:w="35" w:type="dxa"/>
               <w:right w:w="35" w:type="dxa"/>
             </w:tcMar>
@@ -28277,8 +29433,8 @@
           <w:tcPr>
             <w:tcW w:type="dxa" w:w="2592"/>
             <w:tcMar>
-              <w:top w:w="16" w:type="dxa"/>
-              <w:bottom w:w="16" w:type="dxa"/>
+              <w:top w:w="18" w:type="dxa"/>
+              <w:bottom w:w="18" w:type="dxa"/>
               <w:left w:w="35" w:type="dxa"/>
               <w:right w:w="35" w:type="dxa"/>
             </w:tcMar>
@@ -28309,8 +29465,8 @@
           <w:tcPr>
             <w:tcW w:type="dxa" w:w="2304"/>
             <w:tcMar>
-              <w:top w:w="16" w:type="dxa"/>
-              <w:bottom w:w="16" w:type="dxa"/>
+              <w:top w:w="18" w:type="dxa"/>
+              <w:bottom w:w="18" w:type="dxa"/>
               <w:left w:w="35" w:type="dxa"/>
               <w:right w:w="35" w:type="dxa"/>
             </w:tcMar>
@@ -28340,8 +29496,8 @@
           <w:tcPr>
             <w:tcW w:type="dxa" w:w="2304"/>
             <w:tcMar>
-              <w:top w:w="16" w:type="dxa"/>
-              <w:bottom w:w="16" w:type="dxa"/>
+              <w:top w:w="18" w:type="dxa"/>
+              <w:bottom w:w="18" w:type="dxa"/>
               <w:left w:w="35" w:type="dxa"/>
               <w:right w:w="35" w:type="dxa"/>
             </w:tcMar>
@@ -28371,8 +29527,8 @@
           <w:tcPr>
             <w:tcW w:type="dxa" w:w="2880"/>
             <w:tcMar>
-              <w:top w:w="16" w:type="dxa"/>
-              <w:bottom w:w="16" w:type="dxa"/>
+              <w:top w:w="18" w:type="dxa"/>
+              <w:bottom w:w="18" w:type="dxa"/>
               <w:left w:w="35" w:type="dxa"/>
               <w:right w:w="35" w:type="dxa"/>
             </w:tcMar>
@@ -28395,6 +29551,260 @@
                 <w:sz w:val="16"/>
               </w:rPr>
               <w:t>Transparent pedagogical visibility</w:t>
+            </w:r>
+          </w:p>
+        </w:tc>
+      </w:tr>
+      <w:tr>
+        <w:tc>
+          <w:tcPr>
+            <w:tcW w:type="dxa" w:w="2592"/>
+            <w:tcMar>
+              <w:top w:w="18" w:type="dxa"/>
+              <w:bottom w:w="18" w:type="dxa"/>
+              <w:left w:w="35" w:type="dxa"/>
+              <w:right w:w="35" w:type="dxa"/>
+            </w:tcMar>
+            <w:shd w:fill="F8FAFC"/>
+            <w:tcBorders>
+              <w:top w:val="single" w:sz="4" w:space="0" w:color="CBD5E1"/>
+              <w:bottom w:val="single" w:sz="4" w:space="0" w:color="CBD5E1"/>
+              <w:left w:val="single" w:sz="4" w:space="0" w:color="CBD5E1"/>
+              <w:right w:val="single" w:sz="4" w:space="0" w:color="CBD5E1"/>
+            </w:tcBorders>
+          </w:tcPr>
+          <w:p>
+            <w:pPr>
+              <w:spacing w:before="0" w:after="0" w:line="252" w:lineRule="auto"/>
+            </w:pPr>
+            <w:r>
+              <w:rPr>
+                <w:rFonts w:ascii="Calibri" w:hAnsi="Calibri"/>
+                <w:b/>
+                <w:color w:val="1B365D"/>
+                <w:sz w:val="16"/>
+              </w:rPr>
+              <w:t>Browser Framing Defense</w:t>
+            </w:r>
+          </w:p>
+        </w:tc>
+        <w:tc>
+          <w:tcPr>
+            <w:tcW w:type="dxa" w:w="2304"/>
+            <w:tcMar>
+              <w:top w:w="18" w:type="dxa"/>
+              <w:bottom w:w="18" w:type="dxa"/>
+              <w:left w:w="35" w:type="dxa"/>
+              <w:right w:w="35" w:type="dxa"/>
+            </w:tcMar>
+            <w:shd w:fill="F8FAFC"/>
+            <w:tcBorders>
+              <w:top w:val="single" w:sz="4" w:space="0" w:color="CBD5E1"/>
+              <w:bottom w:val="single" w:sz="4" w:space="0" w:color="CBD5E1"/>
+              <w:left w:val="single" w:sz="4" w:space="0" w:color="CBD5E1"/>
+              <w:right w:val="single" w:sz="4" w:space="0" w:color="CBD5E1"/>
+            </w:tcBorders>
+          </w:tcPr>
+          <w:p>
+            <w:pPr>
+              <w:spacing w:before="0" w:after="0" w:line="252" w:lineRule="auto"/>
+            </w:pPr>
+            <w:r>
+              <w:rPr>
+                <w:rFonts w:ascii="Calibri" w:hAnsi="Calibri"/>
+                <w:color w:val="1E293B"/>
+                <w:sz w:val="16"/>
+              </w:rPr>
+              <w:t>Zero Iframe Permitted</w:t>
+            </w:r>
+          </w:p>
+        </w:tc>
+        <w:tc>
+          <w:tcPr>
+            <w:tcW w:type="dxa" w:w="2304"/>
+            <w:tcMar>
+              <w:top w:w="18" w:type="dxa"/>
+              <w:bottom w:w="18" w:type="dxa"/>
+              <w:left w:w="35" w:type="dxa"/>
+              <w:right w:w="35" w:type="dxa"/>
+            </w:tcMar>
+            <w:shd w:fill="F8FAFC"/>
+            <w:tcBorders>
+              <w:top w:val="single" w:sz="4" w:space="0" w:color="CBD5E1"/>
+              <w:bottom w:val="single" w:sz="4" w:space="0" w:color="CBD5E1"/>
+              <w:left w:val="single" w:sz="4" w:space="0" w:color="CBD5E1"/>
+              <w:right w:val="single" w:sz="4" w:space="0" w:color="CBD5E1"/>
+            </w:tcBorders>
+          </w:tcPr>
+          <w:p>
+            <w:pPr>
+              <w:spacing w:before="0" w:after="0" w:line="252" w:lineRule="auto"/>
+            </w:pPr>
+            <w:r>
+              <w:rPr>
+                <w:rFonts w:ascii="Calibri" w:hAnsi="Calibri"/>
+                <w:color w:val="1E293B"/>
+                <w:sz w:val="16"/>
+              </w:rPr>
+              <w:t>100% Blocked by Policy</w:t>
+            </w:r>
+          </w:p>
+        </w:tc>
+        <w:tc>
+          <w:tcPr>
+            <w:tcW w:type="dxa" w:w="2880"/>
+            <w:tcMar>
+              <w:top w:w="18" w:type="dxa"/>
+              <w:bottom w:w="18" w:type="dxa"/>
+              <w:left w:w="35" w:type="dxa"/>
+              <w:right w:w="35" w:type="dxa"/>
+            </w:tcMar>
+            <w:shd w:fill="F8FAFC"/>
+            <w:tcBorders>
+              <w:top w:val="single" w:sz="4" w:space="0" w:color="CBD5E1"/>
+              <w:bottom w:val="single" w:sz="4" w:space="0" w:color="CBD5E1"/>
+              <w:left w:val="single" w:sz="4" w:space="0" w:color="CBD5E1"/>
+              <w:right w:val="single" w:sz="4" w:space="0" w:color="CBD5E1"/>
+            </w:tcBorders>
+          </w:tcPr>
+          <w:p>
+            <w:pPr>
+              <w:spacing w:before="0" w:after="0" w:line="252" w:lineRule="auto"/>
+            </w:pPr>
+            <w:r>
+              <w:rPr>
+                <w:rFonts w:ascii="Calibri" w:hAnsi="Calibri"/>
+                <w:color w:val="1E293B"/>
+                <w:sz w:val="16"/>
+              </w:rPr>
+              <w:t>Complete Clickjacking immunity</w:t>
+            </w:r>
+          </w:p>
+        </w:tc>
+      </w:tr>
+      <w:tr>
+        <w:tc>
+          <w:tcPr>
+            <w:tcW w:type="dxa" w:w="2592"/>
+            <w:tcMar>
+              <w:top w:w="18" w:type="dxa"/>
+              <w:bottom w:w="18" w:type="dxa"/>
+              <w:left w:w="35" w:type="dxa"/>
+              <w:right w:w="35" w:type="dxa"/>
+            </w:tcMar>
+            <w:shd w:fill="FFFFFF"/>
+            <w:tcBorders>
+              <w:top w:val="single" w:sz="4" w:space="0" w:color="CBD5E1"/>
+              <w:bottom w:val="single" w:sz="4" w:space="0" w:color="CBD5E1"/>
+              <w:left w:val="single" w:sz="4" w:space="0" w:color="CBD5E1"/>
+              <w:right w:val="single" w:sz="4" w:space="0" w:color="CBD5E1"/>
+            </w:tcBorders>
+          </w:tcPr>
+          <w:p>
+            <w:pPr>
+              <w:spacing w:before="0" w:after="0" w:line="252" w:lineRule="auto"/>
+            </w:pPr>
+            <w:r>
+              <w:rPr>
+                <w:rFonts w:ascii="Calibri" w:hAnsi="Calibri"/>
+                <w:b/>
+                <w:color w:val="1B365D"/>
+                <w:sz w:val="16"/>
+              </w:rPr>
+              <w:t>AST Parameterization Efficacy</w:t>
+            </w:r>
+          </w:p>
+        </w:tc>
+        <w:tc>
+          <w:tcPr>
+            <w:tcW w:type="dxa" w:w="2304"/>
+            <w:tcMar>
+              <w:top w:w="18" w:type="dxa"/>
+              <w:bottom w:w="18" w:type="dxa"/>
+              <w:left w:w="35" w:type="dxa"/>
+              <w:right w:w="35" w:type="dxa"/>
+            </w:tcMar>
+            <w:shd w:fill="FFFFFF"/>
+            <w:tcBorders>
+              <w:top w:val="single" w:sz="4" w:space="0" w:color="CBD5E1"/>
+              <w:bottom w:val="single" w:sz="4" w:space="0" w:color="CBD5E1"/>
+              <w:left w:val="single" w:sz="4" w:space="0" w:color="CBD5E1"/>
+              <w:right w:val="single" w:sz="4" w:space="0" w:color="CBD5E1"/>
+            </w:tcBorders>
+          </w:tcPr>
+          <w:p>
+            <w:pPr>
+              <w:spacing w:before="0" w:after="0" w:line="252" w:lineRule="auto"/>
+            </w:pPr>
+            <w:r>
+              <w:rPr>
+                <w:rFonts w:ascii="Calibri" w:hAnsi="Calibri"/>
+                <w:color w:val="1E293B"/>
+                <w:sz w:val="16"/>
+              </w:rPr>
+              <w:t>0% Query Re-interpretation</w:t>
+            </w:r>
+          </w:p>
+        </w:tc>
+        <w:tc>
+          <w:tcPr>
+            <w:tcW w:type="dxa" w:w="2304"/>
+            <w:tcMar>
+              <w:top w:w="18" w:type="dxa"/>
+              <w:bottom w:w="18" w:type="dxa"/>
+              <w:left w:w="35" w:type="dxa"/>
+              <w:right w:w="35" w:type="dxa"/>
+            </w:tcMar>
+            <w:shd w:fill="FFFFFF"/>
+            <w:tcBorders>
+              <w:top w:val="single" w:sz="4" w:space="0" w:color="CBD5E1"/>
+              <w:bottom w:val="single" w:sz="4" w:space="0" w:color="CBD5E1"/>
+              <w:left w:val="single" w:sz="4" w:space="0" w:color="CBD5E1"/>
+              <w:right w:val="single" w:sz="4" w:space="0" w:color="CBD5E1"/>
+            </w:tcBorders>
+          </w:tcPr>
+          <w:p>
+            <w:pPr>
+              <w:spacing w:before="0" w:after="0" w:line="252" w:lineRule="auto"/>
+            </w:pPr>
+            <w:r>
+              <w:rPr>
+                <w:rFonts w:ascii="Calibri" w:hAnsi="Calibri"/>
+                <w:color w:val="1E293B"/>
+                <w:sz w:val="16"/>
+              </w:rPr>
+              <w:t>100% Bound as Literals</w:t>
+            </w:r>
+          </w:p>
+        </w:tc>
+        <w:tc>
+          <w:tcPr>
+            <w:tcW w:type="dxa" w:w="2880"/>
+            <w:tcMar>
+              <w:top w:w="18" w:type="dxa"/>
+              <w:bottom w:w="18" w:type="dxa"/>
+              <w:left w:w="35" w:type="dxa"/>
+              <w:right w:w="35" w:type="dxa"/>
+            </w:tcMar>
+            <w:shd w:fill="FFFFFF"/>
+            <w:tcBorders>
+              <w:top w:val="single" w:sz="4" w:space="0" w:color="CBD5E1"/>
+              <w:bottom w:val="single" w:sz="4" w:space="0" w:color="CBD5E1"/>
+              <w:left w:val="single" w:sz="4" w:space="0" w:color="CBD5E1"/>
+              <w:right w:val="single" w:sz="4" w:space="0" w:color="CBD5E1"/>
+            </w:tcBorders>
+          </w:tcPr>
+          <w:p>
+            <w:pPr>
+              <w:spacing w:before="0" w:after="0" w:line="252" w:lineRule="auto"/>
+            </w:pPr>
+            <w:r>
+              <w:rPr>
+                <w:rFonts w:ascii="Calibri" w:hAnsi="Calibri"/>
+                <w:color w:val="1E293B"/>
+                <w:sz w:val="16"/>
+              </w:rPr>
+              <w:t>Absolute SQL grammar separation</w:t>
             </w:r>
           </w:p>
         </w:tc>
@@ -28402,7 +29812,7 @@
     </w:tbl>
     <w:p>
       <w:pPr>
-        <w:spacing w:before="0" w:after="40"/>
+        <w:spacing w:before="0" w:after="50"/>
       </w:pPr>
     </w:p>
     <w:p>
@@ -28450,6 +29860,20 @@
     </w:p>
     <w:p>
       <w:pPr>
+        <w:spacing w:before="0" w:after="40" w:line="269" w:lineRule="auto"/>
+      </w:pPr>
+      <w:r>
+        <w:rPr>
+          <w:rFonts w:ascii="Calibri" w:hAnsi="Calibri"/>
+          <w:i w:val="0"/>
+          <w:color w:val="1E293B"/>
+          <w:sz w:val="18"/>
+        </w:rPr>
+        <w:t>With exactly five vulnerabilities implemented, tested, and documented, SecureJobLab delivers a comprehensive laboratory demonstration suitable for academic viva evaluation.</w:t>
+      </w:r>
+    </w:p>
+    <w:p>
+      <w:pPr>
         <w:spacing w:before="0" w:after="50" w:line="269" w:lineRule="auto"/>
       </w:pPr>
       <w:r>
@@ -28459,7 +29883,7 @@
           <w:color w:val="1E293B"/>
           <w:sz w:val="18"/>
         </w:rPr>
-        <w:t>With exactly five vulnerabilities implemented, tested, and documented, SecureJobLab delivers a comprehensive laboratory demonstration suitable for academic viva evaluation.</w:t>
+        <w:t>In summary, the dual-engine methodology establishes an empirical, reproducible testbed where exploit mechanics and defensive counter-measures can be verified deterministically with transparent telemetry and zero ambiguity.</w:t>
       </w:r>
     </w:p>
     <w:tbl>
@@ -28542,7 +29966,7 @@
     </w:p>
     <w:p>
       <w:pPr>
-        <w:spacing w:before="50" w:after="70" w:line="269" w:lineRule="auto"/>
+        <w:spacing w:before="70" w:after="90" w:line="276" w:lineRule="auto"/>
         <w:ind w:left="432" w:hanging="432"/>
       </w:pPr>
       <w:r>
@@ -28556,7 +29980,7 @@
     </w:p>
     <w:p>
       <w:pPr>
-        <w:spacing w:before="50" w:after="70" w:line="269" w:lineRule="auto"/>
+        <w:spacing w:before="70" w:after="90" w:line="276" w:lineRule="auto"/>
         <w:ind w:left="432" w:hanging="432"/>
       </w:pPr>
       <w:r>
@@ -28570,7 +29994,7 @@
     </w:p>
     <w:p>
       <w:pPr>
-        <w:spacing w:before="50" w:after="70" w:line="269" w:lineRule="auto"/>
+        <w:spacing w:before="70" w:after="90" w:line="276" w:lineRule="auto"/>
         <w:ind w:left="432" w:hanging="432"/>
       </w:pPr>
       <w:r>
@@ -28584,7 +30008,7 @@
     </w:p>
     <w:p>
       <w:pPr>
-        <w:spacing w:before="50" w:after="70" w:line="269" w:lineRule="auto"/>
+        <w:spacing w:before="70" w:after="90" w:line="276" w:lineRule="auto"/>
         <w:ind w:left="432" w:hanging="432"/>
       </w:pPr>
       <w:r>
@@ -28598,7 +30022,7 @@
     </w:p>
     <w:p>
       <w:pPr>
-        <w:spacing w:before="50" w:after="70" w:line="269" w:lineRule="auto"/>
+        <w:spacing w:before="70" w:after="90" w:line="276" w:lineRule="auto"/>
         <w:ind w:left="432" w:hanging="432"/>
       </w:pPr>
       <w:r>
@@ -28612,7 +30036,7 @@
     </w:p>
     <w:p>
       <w:pPr>
-        <w:spacing w:before="50" w:after="70" w:line="269" w:lineRule="auto"/>
+        <w:spacing w:before="70" w:after="90" w:line="276" w:lineRule="auto"/>
         <w:ind w:left="432" w:hanging="432"/>
       </w:pPr>
       <w:r>
@@ -28626,7 +30050,7 @@
     </w:p>
     <w:p>
       <w:pPr>
-        <w:spacing w:before="50" w:after="70" w:line="269" w:lineRule="auto"/>
+        <w:spacing w:before="70" w:after="90" w:line="276" w:lineRule="auto"/>
         <w:ind w:left="432" w:hanging="432"/>
       </w:pPr>
       <w:r>
@@ -28640,7 +30064,7 @@
     </w:p>
     <w:p>
       <w:pPr>
-        <w:spacing w:before="50" w:after="70" w:line="269" w:lineRule="auto"/>
+        <w:spacing w:before="70" w:after="90" w:line="276" w:lineRule="auto"/>
         <w:ind w:left="432" w:hanging="432"/>
       </w:pPr>
       <w:r>
@@ -28654,7 +30078,7 @@
     </w:p>
     <w:p>
       <w:pPr>
-        <w:spacing w:before="50" w:after="70" w:line="269" w:lineRule="auto"/>
+        <w:spacing w:before="70" w:after="90" w:line="276" w:lineRule="auto"/>
         <w:ind w:left="432" w:hanging="432"/>
       </w:pPr>
       <w:r>
@@ -28668,7 +30092,7 @@
     </w:p>
     <w:p>
       <w:pPr>
-        <w:spacing w:before="50" w:after="70" w:line="269" w:lineRule="auto"/>
+        <w:spacing w:before="70" w:after="90" w:line="276" w:lineRule="auto"/>
         <w:ind w:left="432" w:hanging="432"/>
       </w:pPr>
       <w:r>
@@ -28682,7 +30106,7 @@
     </w:p>
     <w:p>
       <w:pPr>
-        <w:spacing w:before="50" w:after="70" w:line="269" w:lineRule="auto"/>
+        <w:spacing w:before="70" w:after="90" w:line="276" w:lineRule="auto"/>
         <w:ind w:left="432" w:hanging="432"/>
       </w:pPr>
       <w:r>
@@ -28696,7 +30120,7 @@
     </w:p>
     <w:p>
       <w:pPr>
-        <w:spacing w:before="50" w:after="70" w:line="269" w:lineRule="auto"/>
+        <w:spacing w:before="70" w:after="90" w:line="276" w:lineRule="auto"/>
         <w:ind w:left="432" w:hanging="432"/>
       </w:pPr>
       <w:r>
@@ -28710,7 +30134,7 @@
     </w:p>
     <w:p>
       <w:pPr>
-        <w:spacing w:before="50" w:after="70" w:line="269" w:lineRule="auto"/>
+        <w:spacing w:before="70" w:after="90" w:line="276" w:lineRule="auto"/>
         <w:ind w:left="432" w:hanging="432"/>
       </w:pPr>
       <w:r>
@@ -28724,7 +30148,7 @@
     </w:p>
     <w:p>
       <w:pPr>
-        <w:spacing w:before="50" w:after="70" w:line="269" w:lineRule="auto"/>
+        <w:spacing w:before="70" w:after="90" w:line="276" w:lineRule="auto"/>
         <w:ind w:left="432" w:hanging="432"/>
       </w:pPr>
       <w:r>
@@ -28738,7 +30162,7 @@
     </w:p>
     <w:p>
       <w:pPr>
-        <w:spacing w:before="50" w:after="70" w:line="269" w:lineRule="auto"/>
+        <w:spacing w:before="70" w:after="90" w:line="276" w:lineRule="auto"/>
         <w:ind w:left="432" w:hanging="432"/>
       </w:pPr>
       <w:r>
@@ -28752,7 +30176,7 @@
     </w:p>
     <w:p>
       <w:pPr>
-        <w:spacing w:before="50" w:after="70" w:line="269" w:lineRule="auto"/>
+        <w:spacing w:before="70" w:after="90" w:line="276" w:lineRule="auto"/>
         <w:ind w:left="432" w:hanging="432"/>
       </w:pPr>
       <w:r>
@@ -28766,7 +30190,7 @@
     </w:p>
     <w:p>
       <w:pPr>
-        <w:spacing w:before="50" w:after="70" w:line="269" w:lineRule="auto"/>
+        <w:spacing w:before="70" w:after="90" w:line="276" w:lineRule="auto"/>
         <w:ind w:left="432" w:hanging="432"/>
       </w:pPr>
       <w:r>
@@ -28780,7 +30204,7 @@
     </w:p>
     <w:p>
       <w:pPr>
-        <w:spacing w:before="50" w:after="70" w:line="269" w:lineRule="auto"/>
+        <w:spacing w:before="70" w:after="90" w:line="276" w:lineRule="auto"/>
         <w:ind w:left="432" w:hanging="432"/>
       </w:pPr>
       <w:r>
@@ -28794,7 +30218,7 @@
     </w:p>
     <w:p>
       <w:pPr>
-        <w:spacing w:before="50" w:after="70" w:line="269" w:lineRule="auto"/>
+        <w:spacing w:before="70" w:after="90" w:line="276" w:lineRule="auto"/>
         <w:ind w:left="432" w:hanging="432"/>
       </w:pPr>
       <w:r>
@@ -28808,7 +30232,7 @@
     </w:p>
     <w:p>
       <w:pPr>
-        <w:spacing w:before="50" w:after="70" w:line="269" w:lineRule="auto"/>
+        <w:spacing w:before="70" w:after="90" w:line="276" w:lineRule="auto"/>
         <w:ind w:left="432" w:hanging="432"/>
       </w:pPr>
       <w:r>
@@ -28822,7 +30246,7 @@
     </w:p>
     <w:p>
       <w:pPr>
-        <w:spacing w:before="50" w:after="70" w:line="269" w:lineRule="auto"/>
+        <w:spacing w:before="70" w:after="90" w:line="276" w:lineRule="auto"/>
         <w:ind w:left="432" w:hanging="432"/>
       </w:pPr>
       <w:r>
@@ -28836,7 +30260,7 @@
     </w:p>
     <w:p>
       <w:pPr>
-        <w:spacing w:before="50" w:after="70" w:line="269" w:lineRule="auto"/>
+        <w:spacing w:before="70" w:after="90" w:line="276" w:lineRule="auto"/>
         <w:ind w:left="432" w:hanging="432"/>
       </w:pPr>
       <w:r>

</xml_diff>